<commit_message>
Update STROBE Statement Checklist to accurately reflect finalized manuscript metrics, 12 clusters, 6519 UMIs, R2=0.473 KO validation, and all 4 authors
</commit_message>
<xml_diff>
--- a/supplementary/STROBE_Statement_Checklist.docx
+++ b/supplementary/STROBE_Statement_Checklist.docx
@@ -4,64 +4,121 @@
   <w:body>
     <w:p>
       <w:pPr>
-        <w:spacing w:after="80"/>
+        <w:spacing w:before="120" w:after="80" w:line="276" w:lineRule="auto"/>
         <w:jc w:val="center"/>
       </w:pPr>
       <w:r>
         <w:rPr>
-          <w:rFonts w:ascii="Arial" w:hAnsi="Arial"/>
+          <w:rFonts w:ascii="Times New Roman" w:hAnsi="Times New Roman"/>
           <w:b/>
+          <w:i w:val="0"/>
+          <w:color w:val="000000"/>
           <w:sz w:val="30"/>
         </w:rPr>
-        <w:t>STROBE Statement—Checklist of Items for Observational &amp; Molecular Studies</w:t>
+        <w:t>STROBE Statement—Checklist of Items for Observational, Functional Genomic, and Interventional Studies</w:t>
       </w:r>
     </w:p>
     <w:p>
       <w:pPr>
-        <w:spacing w:after="280"/>
+        <w:spacing w:before="0" w:after="80" w:line="276" w:lineRule="auto"/>
         <w:jc w:val="center"/>
       </w:pPr>
       <w:r>
         <w:rPr>
-          <w:rFonts w:ascii="Arial" w:hAnsi="Arial"/>
+          <w:rFonts w:ascii="Times New Roman" w:hAnsi="Times New Roman"/>
+          <w:b/>
           <w:i/>
-          <w:sz w:val="20"/>
+          <w:color w:val="000000"/>
+          <w:sz w:val="23"/>
         </w:rPr>
-        <w:t>Adapted for: Applying Causal Machine Learning and Multi-Omics Integration to Unravel Gene Regulatory Networks in Triple-Negative Breast Cancer (TNBC)</w:t>
+        <w:t>Triangulating Single-Cell Perturbation Screens with Epigenetic Priors Reconstructs Causal Super-Enhancer Regulatory Networks in Triple-Negative Breast Cancer</w:t>
+      </w:r>
+    </w:p>
+    <w:p>
+      <w:pPr>
+        <w:spacing w:before="0" w:after="40" w:line="276" w:lineRule="auto"/>
+        <w:jc w:val="center"/>
+      </w:pPr>
+      <w:r>
+        <w:rPr>
+          <w:rFonts w:ascii="Times New Roman" w:hAnsi="Times New Roman"/>
+          <w:b w:val="0"/>
+          <w:i w:val="0"/>
+          <w:color w:val="000000"/>
+          <w:sz w:val="21"/>
+        </w:rPr>
+        <w:t>Omar Faroque¹, Mst. Homayra Jannaty¹, Shahriar Ahmed Abir², Suman Biswas¹*</w:t>
+      </w:r>
+    </w:p>
+    <w:p>
+      <w:pPr>
+        <w:spacing w:before="0" w:after="240" w:line="276" w:lineRule="auto"/>
+        <w:jc w:val="center"/>
+      </w:pPr>
+      <w:r>
+        <w:rPr>
+          <w:rFonts w:ascii="Times New Roman" w:hAnsi="Times New Roman"/>
+          <w:b w:val="0"/>
+          <w:i/>
+          <w:color w:val="000000"/>
+          <w:sz w:val="18"/>
+        </w:rPr>
+        <w:t>¹ Department of Statistics, Faculty of Sciences, Islamic University, Kushtia-7003, Bangladesh</w:t>
         <w:br/>
-        <w:t>Authors: Omar Faroque &amp; Suman Biswas, Department of Statistics, Islamic University, Kushtia</w:t>
+        <w:t>² Department of Biotechnology and Genetic Engineering, Faculty of Biological Sciences, Islamic University, Kushtia-7003, Bangladesh</w:t>
+        <w:br/>
+        <w:t>* Corresponding Author: suman@stat.iu.ac.bd</w:t>
       </w:r>
     </w:p>
     <w:tbl>
       <w:tblPr>
         <w:tblW w:type="auto" w:w="0"/>
-        <w:tblLayout w:type="autofit"/>
+        <w:jc w:val="center"/>
         <w:tblLook w:firstColumn="1" w:firstRow="1" w:lastColumn="0" w:lastRow="0" w:noHBand="0" w:noVBand="1" w:val="04A0"/>
+        <w:tblBorders>
+          <w:top w:val="single" w:sz="10" w:space="0" w:color="000000"/>
+          <w:bottom w:val="single" w:sz="10" w:space="0" w:color="000000"/>
+          <w:left w:val="none"/>
+          <w:right w:val="none"/>
+          <w:insideH w:val="single" w:sz="4" w:space="0" w:color="E0E0E0"/>
+          <w:insideV w:val="none"/>
+        </w:tblBorders>
       </w:tblPr>
       <w:tblGrid>
-        <w:gridCol w:w="1872"/>
-        <w:gridCol w:w="1872"/>
-        <w:gridCol w:w="1872"/>
-        <w:gridCol w:w="1872"/>
-        <w:gridCol w:w="1872"/>
+        <w:gridCol w:w="2707"/>
+        <w:gridCol w:w="2707"/>
+        <w:gridCol w:w="2707"/>
+        <w:gridCol w:w="2707"/>
+        <w:gridCol w:w="2707"/>
       </w:tblGrid>
       <w:tr>
+        <w:trPr>
+          <w:tblHeader/>
+          <w:cantSplit/>
+        </w:trPr>
         <w:tc>
           <w:tcPr>
-            <w:tcW w:type="dxa" w:w="1872"/>
-            <w:tcBorders>
-              <w:top w:val="single" w:sz="12" w:space="0" w:color="000000"/>
-              <w:bottom w:val="single" w:sz="8" w:space="0" w:color="000000"/>
-              <w:left w:val="none"/>
-              <w:right w:val="none"/>
-            </w:tcBorders>
+            <w:tcW w:type="dxa" w:w="2160"/>
+            <w:vAlign w:val="center"/>
+            <w:tcMar>
+              <w:top w:w="70" w:type="dxa"/>
+              <w:bottom w:w="70" w:type="dxa"/>
+              <w:left w:w="100" w:type="dxa"/>
+              <w:right w:w="100" w:type="dxa"/>
+            </w:tcMar>
           </w:tcPr>
           <w:p>
+            <w:pPr>
+              <w:spacing w:before="20" w:after="20" w:line="252" w:lineRule="auto"/>
+              <w:jc w:val="left"/>
+            </w:pPr>
+            <w:r/>
             <w:r>
               <w:rPr>
-                <w:rFonts w:ascii="Arial" w:hAnsi="Arial"/>
+                <w:rFonts w:ascii="Times New Roman" w:hAnsi="Times New Roman"/>
                 <w:b/>
-                <w:sz w:val="19"/>
+                <w:color w:val="000000"/>
+                <w:sz w:val="18"/>
               </w:rPr>
               <w:t>Section / Topic</w:t>
             </w:r>
@@ -69,20 +126,27 @@
         </w:tc>
         <w:tc>
           <w:tcPr>
-            <w:tcW w:type="dxa" w:w="1872"/>
-            <w:tcBorders>
-              <w:top w:val="single" w:sz="12" w:space="0" w:color="000000"/>
-              <w:bottom w:val="single" w:sz="8" w:space="0" w:color="000000"/>
-              <w:left w:val="none"/>
-              <w:right w:val="none"/>
-            </w:tcBorders>
+            <w:tcW w:type="dxa" w:w="864"/>
+            <w:vAlign w:val="center"/>
+            <w:tcMar>
+              <w:top w:w="70" w:type="dxa"/>
+              <w:bottom w:w="70" w:type="dxa"/>
+              <w:left w:w="100" w:type="dxa"/>
+              <w:right w:w="100" w:type="dxa"/>
+            </w:tcMar>
           </w:tcPr>
           <w:p>
+            <w:pPr>
+              <w:spacing w:before="20" w:after="20" w:line="252" w:lineRule="auto"/>
+              <w:jc w:val="center"/>
+            </w:pPr>
+            <w:r/>
             <w:r>
               <w:rPr>
-                <w:rFonts w:ascii="Arial" w:hAnsi="Arial"/>
+                <w:rFonts w:ascii="Times New Roman" w:hAnsi="Times New Roman"/>
                 <w:b/>
-                <w:sz w:val="19"/>
+                <w:color w:val="000000"/>
+                <w:sz w:val="18"/>
               </w:rPr>
               <w:t>Item #</w:t>
             </w:r>
@@ -90,20 +154,27 @@
         </w:tc>
         <w:tc>
           <w:tcPr>
-            <w:tcW w:type="dxa" w:w="1872"/>
-            <w:tcBorders>
-              <w:top w:val="single" w:sz="12" w:space="0" w:color="000000"/>
-              <w:bottom w:val="single" w:sz="8" w:space="0" w:color="000000"/>
-              <w:left w:val="none"/>
-              <w:right w:val="none"/>
-            </w:tcBorders>
+            <w:tcW w:type="dxa" w:w="3168"/>
+            <w:vAlign w:val="center"/>
+            <w:tcMar>
+              <w:top w:w="70" w:type="dxa"/>
+              <w:bottom w:w="70" w:type="dxa"/>
+              <w:left w:w="100" w:type="dxa"/>
+              <w:right w:w="100" w:type="dxa"/>
+            </w:tcMar>
           </w:tcPr>
           <w:p>
+            <w:pPr>
+              <w:spacing w:before="20" w:after="20" w:line="252" w:lineRule="auto"/>
+              <w:jc w:val="left"/>
+            </w:pPr>
+            <w:r/>
             <w:r>
               <w:rPr>
-                <w:rFonts w:ascii="Arial" w:hAnsi="Arial"/>
+                <w:rFonts w:ascii="Times New Roman" w:hAnsi="Times New Roman"/>
                 <w:b/>
-                <w:sz w:val="19"/>
+                <w:color w:val="000000"/>
+                <w:sz w:val="18"/>
               </w:rPr>
               <w:t>STROBE Checklist Recommendation</w:t>
             </w:r>
@@ -111,43 +182,57 @@
         </w:tc>
         <w:tc>
           <w:tcPr>
-            <w:tcW w:type="dxa" w:w="1872"/>
-            <w:tcBorders>
-              <w:top w:val="single" w:sz="12" w:space="0" w:color="000000"/>
-              <w:bottom w:val="single" w:sz="8" w:space="0" w:color="000000"/>
-              <w:left w:val="none"/>
-              <w:right w:val="none"/>
-            </w:tcBorders>
+            <w:tcW w:type="dxa" w:w="5616"/>
+            <w:vAlign w:val="center"/>
+            <w:tcMar>
+              <w:top w:w="70" w:type="dxa"/>
+              <w:bottom w:w="70" w:type="dxa"/>
+              <w:left w:w="100" w:type="dxa"/>
+              <w:right w:w="100" w:type="dxa"/>
+            </w:tcMar>
           </w:tcPr>
           <w:p>
+            <w:pPr>
+              <w:spacing w:before="20" w:after="20" w:line="252" w:lineRule="auto"/>
+              <w:jc w:val="left"/>
+            </w:pPr>
+            <w:r/>
             <w:r>
               <w:rPr>
-                <w:rFonts w:ascii="Arial" w:hAnsi="Arial"/>
+                <w:rFonts w:ascii="Times New Roman" w:hAnsi="Times New Roman"/>
                 <w:b/>
-                <w:sz w:val="19"/>
+                <w:color w:val="000000"/>
+                <w:sz w:val="18"/>
               </w:rPr>
-              <w:t>Addressed in TNBC Causal ML Manuscript</w:t>
+              <w:t>Detailed Implementation in TNBC Causal ML Manuscript</w:t>
             </w:r>
           </w:p>
         </w:tc>
         <w:tc>
           <w:tcPr>
-            <w:tcW w:type="dxa" w:w="1872"/>
-            <w:tcBorders>
-              <w:top w:val="single" w:sz="12" w:space="0" w:color="000000"/>
-              <w:bottom w:val="single" w:sz="8" w:space="0" w:color="000000"/>
-              <w:left w:val="none"/>
-              <w:right w:val="none"/>
-            </w:tcBorders>
+            <w:tcW w:type="dxa" w:w="1728"/>
+            <w:vAlign w:val="center"/>
+            <w:tcMar>
+              <w:top w:w="70" w:type="dxa"/>
+              <w:bottom w:w="70" w:type="dxa"/>
+              <w:left w:w="100" w:type="dxa"/>
+              <w:right w:w="100" w:type="dxa"/>
+            </w:tcMar>
           </w:tcPr>
           <w:p>
+            <w:pPr>
+              <w:spacing w:before="20" w:after="20" w:line="252" w:lineRule="auto"/>
+              <w:jc w:val="left"/>
+            </w:pPr>
+            <w:r/>
             <w:r>
               <w:rPr>
-                <w:rFonts w:ascii="Arial" w:hAnsi="Arial"/>
+                <w:rFonts w:ascii="Times New Roman" w:hAnsi="Times New Roman"/>
                 <w:b/>
-                <w:sz w:val="19"/>
+                <w:color w:val="000000"/>
+                <w:sz w:val="18"/>
               </w:rPr>
-              <w:t>Location</w:t>
+              <w:t>Manuscript Location</w:t>
             </w:r>
           </w:p>
         </w:tc>
@@ -155,19 +240,27 @@
       <w:tr>
         <w:tc>
           <w:tcPr>
-            <w:tcW w:type="dxa" w:w="1872"/>
-            <w:tcBorders>
-              <w:top w:val="none"/>
-              <w:bottom w:val="none" w:sz="0" w:space="0" w:color="000000"/>
-              <w:left w:val="none"/>
-              <w:right w:val="none"/>
-            </w:tcBorders>
+            <w:tcW w:type="dxa" w:w="2160"/>
+            <w:vAlign w:val="center"/>
+            <w:tcMar>
+              <w:top w:w="70" w:type="dxa"/>
+              <w:bottom w:w="70" w:type="dxa"/>
+              <w:left w:w="100" w:type="dxa"/>
+              <w:right w:w="100" w:type="dxa"/>
+            </w:tcMar>
           </w:tcPr>
           <w:p>
+            <w:pPr>
+              <w:spacing w:before="20" w:after="20" w:line="252" w:lineRule="auto"/>
+              <w:jc w:val="left"/>
+            </w:pPr>
+            <w:r/>
             <w:r>
               <w:rPr>
-                <w:rFonts w:ascii="Arial" w:hAnsi="Arial"/>
-                <w:sz w:val="18"/>
+                <w:rFonts w:ascii="Times New Roman" w:hAnsi="Times New Roman"/>
+                <w:b w:val="0"/>
+                <w:color w:val="000000"/>
+                <w:sz w:val="17"/>
               </w:rPr>
               <w:t>Title and Abstract</w:t>
             </w:r>
@@ -175,19 +268,27 @@
         </w:tc>
         <w:tc>
           <w:tcPr>
-            <w:tcW w:type="dxa" w:w="1872"/>
-            <w:tcBorders>
-              <w:top w:val="none"/>
-              <w:bottom w:val="none" w:sz="0" w:space="0" w:color="000000"/>
-              <w:left w:val="none"/>
-              <w:right w:val="none"/>
-            </w:tcBorders>
+            <w:tcW w:type="dxa" w:w="864"/>
+            <w:vAlign w:val="center"/>
+            <w:tcMar>
+              <w:top w:w="70" w:type="dxa"/>
+              <w:bottom w:w="70" w:type="dxa"/>
+              <w:left w:w="100" w:type="dxa"/>
+              <w:right w:w="100" w:type="dxa"/>
+            </w:tcMar>
           </w:tcPr>
           <w:p>
+            <w:pPr>
+              <w:spacing w:before="20" w:after="20" w:line="252" w:lineRule="auto"/>
+              <w:jc w:val="center"/>
+            </w:pPr>
+            <w:r/>
             <w:r>
               <w:rPr>
-                <w:rFonts w:ascii="Arial" w:hAnsi="Arial"/>
-                <w:sz w:val="18"/>
+                <w:rFonts w:ascii="Times New Roman" w:hAnsi="Times New Roman"/>
+                <w:b w:val="0"/>
+                <w:color w:val="000000"/>
+                <w:sz w:val="17"/>
               </w:rPr>
               <w:t>1a</w:t>
             </w:r>
@@ -195,19 +296,27 @@
         </w:tc>
         <w:tc>
           <w:tcPr>
-            <w:tcW w:type="dxa" w:w="1872"/>
-            <w:tcBorders>
-              <w:top w:val="none"/>
-              <w:bottom w:val="none" w:sz="0" w:space="0" w:color="000000"/>
-              <w:left w:val="none"/>
-              <w:right w:val="none"/>
-            </w:tcBorders>
+            <w:tcW w:type="dxa" w:w="3168"/>
+            <w:vAlign w:val="center"/>
+            <w:tcMar>
+              <w:top w:w="70" w:type="dxa"/>
+              <w:bottom w:w="70" w:type="dxa"/>
+              <w:left w:w="100" w:type="dxa"/>
+              <w:right w:w="100" w:type="dxa"/>
+            </w:tcMar>
           </w:tcPr>
           <w:p>
+            <w:pPr>
+              <w:spacing w:before="20" w:after="20" w:line="252" w:lineRule="auto"/>
+              <w:jc w:val="both"/>
+            </w:pPr>
+            <w:r/>
             <w:r>
               <w:rPr>
-                <w:rFonts w:ascii="Arial" w:hAnsi="Arial"/>
-                <w:sz w:val="18"/>
+                <w:rFonts w:ascii="Times New Roman" w:hAnsi="Times New Roman"/>
+                <w:b w:val="0"/>
+                <w:color w:val="000000"/>
+                <w:sz w:val="17"/>
               </w:rPr>
               <w:t>Indicate study's design with a commonly used term in title/abstract</w:t>
             </w:r>
@@ -215,41 +324,57 @@
         </w:tc>
         <w:tc>
           <w:tcPr>
-            <w:tcW w:type="dxa" w:w="1872"/>
-            <w:tcBorders>
-              <w:top w:val="none"/>
-              <w:bottom w:val="none" w:sz="0" w:space="0" w:color="000000"/>
-              <w:left w:val="none"/>
-              <w:right w:val="none"/>
-            </w:tcBorders>
+            <w:tcW w:type="dxa" w:w="5616"/>
+            <w:vAlign w:val="center"/>
+            <w:tcMar>
+              <w:top w:w="70" w:type="dxa"/>
+              <w:bottom w:w="70" w:type="dxa"/>
+              <w:left w:w="100" w:type="dxa"/>
+              <w:right w:w="100" w:type="dxa"/>
+            </w:tcMar>
           </w:tcPr>
           <w:p>
+            <w:pPr>
+              <w:spacing w:before="20" w:after="20" w:line="252" w:lineRule="auto"/>
+              <w:jc w:val="both"/>
+            </w:pPr>
+            <w:r/>
             <w:r>
               <w:rPr>
-                <w:rFonts w:ascii="Arial" w:hAnsi="Arial"/>
-                <w:sz w:val="18"/>
+                <w:rFonts w:ascii="Times New Roman" w:hAnsi="Times New Roman"/>
+                <w:b w:val="0"/>
+                <w:color w:val="000000"/>
+                <w:sz w:val="17"/>
               </w:rPr>
-              <w:t>Title and Abstract: Interventional causal machine learning, single-cell CRISPR-perturb-seq, and multi-omics observational cohort study (TCGA/METABRIC).</w:t>
+              <w:t>Title and Abstract clearly indicate the study design: genome-scale single-cell CRISPRi perturbation screening, multi-omics epigenetic prior integration, causal DAG triangulation, and clinical survival validation in human TNBC cohorts.</w:t>
             </w:r>
           </w:p>
         </w:tc>
         <w:tc>
           <w:tcPr>
-            <w:tcW w:type="dxa" w:w="1872"/>
-            <w:tcBorders>
-              <w:top w:val="none"/>
-              <w:bottom w:val="none" w:sz="0" w:space="0" w:color="000000"/>
-              <w:left w:val="none"/>
-              <w:right w:val="none"/>
-            </w:tcBorders>
+            <w:tcW w:type="dxa" w:w="1728"/>
+            <w:vAlign w:val="center"/>
+            <w:tcMar>
+              <w:top w:w="70" w:type="dxa"/>
+              <w:bottom w:w="70" w:type="dxa"/>
+              <w:left w:w="100" w:type="dxa"/>
+              <w:right w:w="100" w:type="dxa"/>
+            </w:tcMar>
           </w:tcPr>
           <w:p>
+            <w:pPr>
+              <w:spacing w:before="20" w:after="20" w:line="252" w:lineRule="auto"/>
+              <w:jc w:val="left"/>
+            </w:pPr>
+            <w:r/>
             <w:r>
               <w:rPr>
-                <w:rFonts w:ascii="Arial" w:hAnsi="Arial"/>
-                <w:sz w:val="18"/>
+                <w:rFonts w:ascii="Times New Roman" w:hAnsi="Times New Roman"/>
+                <w:b w:val="0"/>
+                <w:color w:val="000000"/>
+                <w:sz w:val="17"/>
               </w:rPr>
-              <w:t>Page 1</w:t>
+              <w:t>Title; Abstract; Page 1</w:t>
             </w:r>
           </w:p>
         </w:tc>
@@ -257,19 +382,27 @@
       <w:tr>
         <w:tc>
           <w:tcPr>
-            <w:tcW w:type="dxa" w:w="1872"/>
-            <w:tcBorders>
-              <w:top w:val="none"/>
-              <w:bottom w:val="none" w:sz="0" w:space="0" w:color="000000"/>
-              <w:left w:val="none"/>
-              <w:right w:val="none"/>
-            </w:tcBorders>
+            <w:tcW w:type="dxa" w:w="2160"/>
+            <w:vAlign w:val="center"/>
+            <w:tcMar>
+              <w:top w:w="70" w:type="dxa"/>
+              <w:bottom w:w="70" w:type="dxa"/>
+              <w:left w:w="100" w:type="dxa"/>
+              <w:right w:w="100" w:type="dxa"/>
+            </w:tcMar>
           </w:tcPr>
           <w:p>
+            <w:pPr>
+              <w:spacing w:before="20" w:after="20" w:line="252" w:lineRule="auto"/>
+              <w:jc w:val="left"/>
+            </w:pPr>
+            <w:r/>
             <w:r>
               <w:rPr>
-                <w:rFonts w:ascii="Arial" w:hAnsi="Arial"/>
-                <w:sz w:val="18"/>
+                <w:rFonts w:ascii="Times New Roman" w:hAnsi="Times New Roman"/>
+                <w:b w:val="0"/>
+                <w:color w:val="000000"/>
+                <w:sz w:val="17"/>
               </w:rPr>
               <w:t>Title and Abstract</w:t>
             </w:r>
@@ -277,19 +410,27 @@
         </w:tc>
         <w:tc>
           <w:tcPr>
-            <w:tcW w:type="dxa" w:w="1872"/>
-            <w:tcBorders>
-              <w:top w:val="none"/>
-              <w:bottom w:val="none" w:sz="0" w:space="0" w:color="000000"/>
-              <w:left w:val="none"/>
-              <w:right w:val="none"/>
-            </w:tcBorders>
+            <w:tcW w:type="dxa" w:w="864"/>
+            <w:vAlign w:val="center"/>
+            <w:tcMar>
+              <w:top w:w="70" w:type="dxa"/>
+              <w:bottom w:w="70" w:type="dxa"/>
+              <w:left w:w="100" w:type="dxa"/>
+              <w:right w:w="100" w:type="dxa"/>
+            </w:tcMar>
           </w:tcPr>
           <w:p>
+            <w:pPr>
+              <w:spacing w:before="20" w:after="20" w:line="252" w:lineRule="auto"/>
+              <w:jc w:val="center"/>
+            </w:pPr>
+            <w:r/>
             <w:r>
               <w:rPr>
-                <w:rFonts w:ascii="Arial" w:hAnsi="Arial"/>
-                <w:sz w:val="18"/>
+                <w:rFonts w:ascii="Times New Roman" w:hAnsi="Times New Roman"/>
+                <w:b w:val="0"/>
+                <w:color w:val="000000"/>
+                <w:sz w:val="17"/>
               </w:rPr>
               <w:t>1b</w:t>
             </w:r>
@@ -297,19 +438,27 @@
         </w:tc>
         <w:tc>
           <w:tcPr>
-            <w:tcW w:type="dxa" w:w="1872"/>
-            <w:tcBorders>
-              <w:top w:val="none"/>
-              <w:bottom w:val="none" w:sz="0" w:space="0" w:color="000000"/>
-              <w:left w:val="none"/>
-              <w:right w:val="none"/>
-            </w:tcBorders>
+            <w:tcW w:type="dxa" w:w="3168"/>
+            <w:vAlign w:val="center"/>
+            <w:tcMar>
+              <w:top w:w="70" w:type="dxa"/>
+              <w:bottom w:w="70" w:type="dxa"/>
+              <w:left w:w="100" w:type="dxa"/>
+              <w:right w:w="100" w:type="dxa"/>
+            </w:tcMar>
           </w:tcPr>
           <w:p>
+            <w:pPr>
+              <w:spacing w:before="20" w:after="20" w:line="252" w:lineRule="auto"/>
+              <w:jc w:val="both"/>
+            </w:pPr>
+            <w:r/>
             <w:r>
               <w:rPr>
-                <w:rFonts w:ascii="Arial" w:hAnsi="Arial"/>
-                <w:sz w:val="18"/>
+                <w:rFonts w:ascii="Times New Roman" w:hAnsi="Times New Roman"/>
+                <w:b w:val="0"/>
+                <w:color w:val="000000"/>
+                <w:sz w:val="17"/>
               </w:rPr>
               <w:t>Provide an informative and balanced summary of what was done and found</w:t>
             </w:r>
@@ -317,41 +466,57 @@
         </w:tc>
         <w:tc>
           <w:tcPr>
-            <w:tcW w:type="dxa" w:w="1872"/>
-            <w:tcBorders>
-              <w:top w:val="none"/>
-              <w:bottom w:val="none" w:sz="0" w:space="0" w:color="000000"/>
-              <w:left w:val="none"/>
-              <w:right w:val="none"/>
-            </w:tcBorders>
+            <w:tcW w:type="dxa" w:w="5616"/>
+            <w:vAlign w:val="center"/>
+            <w:tcMar>
+              <w:top w:w="70" w:type="dxa"/>
+              <w:bottom w:w="70" w:type="dxa"/>
+              <w:left w:w="100" w:type="dxa"/>
+              <w:right w:w="100" w:type="dxa"/>
+            </w:tcMar>
           </w:tcPr>
           <w:p>
+            <w:pPr>
+              <w:spacing w:before="20" w:after="20" w:line="252" w:lineRule="auto"/>
+              <w:jc w:val="both"/>
+            </w:pPr>
+            <w:r/>
             <w:r>
               <w:rPr>
-                <w:rFonts w:ascii="Arial" w:hAnsi="Arial"/>
-                <w:sz w:val="18"/>
+                <w:rFonts w:ascii="Times New Roman" w:hAnsi="Times New Roman"/>
+                <w:b w:val="0"/>
+                <w:color w:val="000000"/>
+                <w:sz w:val="17"/>
               </w:rPr>
-              <w:t>Abstract: Detailed structured summary describing objective, data (GSE224986, 95k cells), causal triangulation, key driver prioritization (MYC, EP300, JUND), benchmarking, and clinical relevance.</w:t>
+              <w:t>Structured abstract delineates clinical rationale (TNBC chemo-refractoriness), dataset scale (GSE224986; 95,678 cells, 11,975 sgRNAs), causal triangulation methodology, master driver prioritization (JUND, MYC, EP300, CTCF), TreeExplainer SHAP attribution, benchmarking against existing GRN methods, in silico KO validation (R² = 0.473), clinical survival (TCGA-BRCA, METABRIC), and epigenetic combination therapies.</w:t>
             </w:r>
           </w:p>
         </w:tc>
         <w:tc>
           <w:tcPr>
-            <w:tcW w:type="dxa" w:w="1872"/>
-            <w:tcBorders>
-              <w:top w:val="none"/>
-              <w:bottom w:val="none" w:sz="0" w:space="0" w:color="000000"/>
-              <w:left w:val="none"/>
-              <w:right w:val="none"/>
-            </w:tcBorders>
+            <w:tcW w:type="dxa" w:w="1728"/>
+            <w:vAlign w:val="center"/>
+            <w:tcMar>
+              <w:top w:w="70" w:type="dxa"/>
+              <w:bottom w:w="70" w:type="dxa"/>
+              <w:left w:w="100" w:type="dxa"/>
+              <w:right w:w="100" w:type="dxa"/>
+            </w:tcMar>
           </w:tcPr>
           <w:p>
+            <w:pPr>
+              <w:spacing w:before="20" w:after="20" w:line="252" w:lineRule="auto"/>
+              <w:jc w:val="left"/>
+            </w:pPr>
+            <w:r/>
             <w:r>
               <w:rPr>
-                <w:rFonts w:ascii="Arial" w:hAnsi="Arial"/>
-                <w:sz w:val="18"/>
+                <w:rFonts w:ascii="Times New Roman" w:hAnsi="Times New Roman"/>
+                <w:b w:val="0"/>
+                <w:color w:val="000000"/>
+                <w:sz w:val="17"/>
               </w:rPr>
-              <w:t>Page 1</w:t>
+              <w:t>Abstract; Page 1</w:t>
             </w:r>
           </w:p>
         </w:tc>
@@ -359,39 +524,55 @@
       <w:tr>
         <w:tc>
           <w:tcPr>
-            <w:tcW w:type="dxa" w:w="1872"/>
-            <w:tcBorders>
-              <w:top w:val="none"/>
-              <w:bottom w:val="none" w:sz="0" w:space="0" w:color="000000"/>
-              <w:left w:val="none"/>
-              <w:right w:val="none"/>
-            </w:tcBorders>
+            <w:tcW w:type="dxa" w:w="2160"/>
+            <w:vAlign w:val="center"/>
+            <w:tcMar>
+              <w:top w:w="70" w:type="dxa"/>
+              <w:bottom w:w="70" w:type="dxa"/>
+              <w:left w:w="100" w:type="dxa"/>
+              <w:right w:w="100" w:type="dxa"/>
+            </w:tcMar>
           </w:tcPr>
           <w:p>
+            <w:pPr>
+              <w:spacing w:before="20" w:after="20" w:line="252" w:lineRule="auto"/>
+              <w:jc w:val="left"/>
+            </w:pPr>
+            <w:r/>
             <w:r>
               <w:rPr>
-                <w:rFonts w:ascii="Arial" w:hAnsi="Arial"/>
-                <w:sz w:val="18"/>
+                <w:rFonts w:ascii="Times New Roman" w:hAnsi="Times New Roman"/>
+                <w:b w:val="0"/>
+                <w:color w:val="000000"/>
+                <w:sz w:val="17"/>
               </w:rPr>
-              <w:t>Introduction</w:t>
+              <w:t>Introduction - Background</w:t>
             </w:r>
           </w:p>
         </w:tc>
         <w:tc>
           <w:tcPr>
-            <w:tcW w:type="dxa" w:w="1872"/>
-            <w:tcBorders>
-              <w:top w:val="none"/>
-              <w:bottom w:val="none" w:sz="0" w:space="0" w:color="000000"/>
-              <w:left w:val="none"/>
-              <w:right w:val="none"/>
-            </w:tcBorders>
+            <w:tcW w:type="dxa" w:w="864"/>
+            <w:vAlign w:val="center"/>
+            <w:tcMar>
+              <w:top w:w="70" w:type="dxa"/>
+              <w:bottom w:w="70" w:type="dxa"/>
+              <w:left w:w="100" w:type="dxa"/>
+              <w:right w:w="100" w:type="dxa"/>
+            </w:tcMar>
           </w:tcPr>
           <w:p>
+            <w:pPr>
+              <w:spacing w:before="20" w:after="20" w:line="252" w:lineRule="auto"/>
+              <w:jc w:val="center"/>
+            </w:pPr>
+            <w:r/>
             <w:r>
               <w:rPr>
-                <w:rFonts w:ascii="Arial" w:hAnsi="Arial"/>
-                <w:sz w:val="18"/>
+                <w:rFonts w:ascii="Times New Roman" w:hAnsi="Times New Roman"/>
+                <w:b w:val="0"/>
+                <w:color w:val="000000"/>
+                <w:sz w:val="17"/>
               </w:rPr>
               <w:t>2</w:t>
             </w:r>
@@ -399,19 +580,27 @@
         </w:tc>
         <w:tc>
           <w:tcPr>
-            <w:tcW w:type="dxa" w:w="1872"/>
-            <w:tcBorders>
-              <w:top w:val="none"/>
-              <w:bottom w:val="none" w:sz="0" w:space="0" w:color="000000"/>
-              <w:left w:val="none"/>
-              <w:right w:val="none"/>
-            </w:tcBorders>
+            <w:tcW w:type="dxa" w:w="3168"/>
+            <w:vAlign w:val="center"/>
+            <w:tcMar>
+              <w:top w:w="70" w:type="dxa"/>
+              <w:bottom w:w="70" w:type="dxa"/>
+              <w:left w:w="100" w:type="dxa"/>
+              <w:right w:w="100" w:type="dxa"/>
+            </w:tcMar>
           </w:tcPr>
           <w:p>
+            <w:pPr>
+              <w:spacing w:before="20" w:after="20" w:line="252" w:lineRule="auto"/>
+              <w:jc w:val="both"/>
+            </w:pPr>
+            <w:r/>
             <w:r>
               <w:rPr>
-                <w:rFonts w:ascii="Arial" w:hAnsi="Arial"/>
-                <w:sz w:val="18"/>
+                <w:rFonts w:ascii="Times New Roman" w:hAnsi="Times New Roman"/>
+                <w:b w:val="0"/>
+                <w:color w:val="000000"/>
+                <w:sz w:val="17"/>
               </w:rPr>
               <w:t>Explain scientific background and rationale for investigation</w:t>
             </w:r>
@@ -419,41 +608,57 @@
         </w:tc>
         <w:tc>
           <w:tcPr>
-            <w:tcW w:type="dxa" w:w="1872"/>
-            <w:tcBorders>
-              <w:top w:val="none"/>
-              <w:bottom w:val="none" w:sz="0" w:space="0" w:color="000000"/>
-              <w:left w:val="none"/>
-              <w:right w:val="none"/>
-            </w:tcBorders>
+            <w:tcW w:type="dxa" w:w="5616"/>
+            <w:vAlign w:val="center"/>
+            <w:tcMar>
+              <w:top w:w="70" w:type="dxa"/>
+              <w:bottom w:w="70" w:type="dxa"/>
+              <w:left w:w="100" w:type="dxa"/>
+              <w:right w:w="100" w:type="dxa"/>
+            </w:tcMar>
           </w:tcPr>
           <w:p>
+            <w:pPr>
+              <w:spacing w:before="20" w:after="20" w:line="252" w:lineRule="auto"/>
+              <w:jc w:val="both"/>
+            </w:pPr>
+            <w:r/>
             <w:r>
               <w:rPr>
-                <w:rFonts w:ascii="Arial" w:hAnsi="Arial"/>
-                <w:sz w:val="18"/>
+                <w:rFonts w:ascii="Times New Roman" w:hAnsi="Times New Roman"/>
+                <w:b w:val="0"/>
+                <w:color w:val="000000"/>
+                <w:sz w:val="17"/>
               </w:rPr>
-              <w:t>Section 1: Clinical aggressiveness of TNBC, lack of targeted receptors, reliance on super-enhancers, and failure of observational GRN inference due to single-cell dropouts and confounding.</w:t>
+              <w:t>Section 1.1–1.3: Aggressive clinical trajectory and lack of targeted receptor therapies in TNBC; high reliance on distal super-enhancers; mathematical and biological failure of observational transcriptomic GRNs (GENIE3, SCENIC) driven by dropout zero-inflation (&gt;45% FDR); necessity of interventional do-calculus and functional single-cell CRISPRi.</w:t>
             </w:r>
           </w:p>
         </w:tc>
         <w:tc>
           <w:tcPr>
-            <w:tcW w:type="dxa" w:w="1872"/>
-            <w:tcBorders>
-              <w:top w:val="none"/>
-              <w:bottom w:val="none" w:sz="0" w:space="0" w:color="000000"/>
-              <w:left w:val="none"/>
-              <w:right w:val="none"/>
-            </w:tcBorders>
+            <w:tcW w:type="dxa" w:w="1728"/>
+            <w:vAlign w:val="center"/>
+            <w:tcMar>
+              <w:top w:w="70" w:type="dxa"/>
+              <w:bottom w:w="70" w:type="dxa"/>
+              <w:left w:w="100" w:type="dxa"/>
+              <w:right w:w="100" w:type="dxa"/>
+            </w:tcMar>
           </w:tcPr>
           <w:p>
+            <w:pPr>
+              <w:spacing w:before="20" w:after="20" w:line="252" w:lineRule="auto"/>
+              <w:jc w:val="left"/>
+            </w:pPr>
+            <w:r/>
             <w:r>
               <w:rPr>
-                <w:rFonts w:ascii="Arial" w:hAnsi="Arial"/>
-                <w:sz w:val="18"/>
+                <w:rFonts w:ascii="Times New Roman" w:hAnsi="Times New Roman"/>
+                <w:b w:val="0"/>
+                <w:color w:val="000000"/>
+                <w:sz w:val="17"/>
               </w:rPr>
-              <w:t>Pages 1-2</w:t>
+              <w:t>Sections 1.1–1.3; Pages 1–2</w:t>
             </w:r>
           </w:p>
         </w:tc>
@@ -461,39 +666,55 @@
       <w:tr>
         <w:tc>
           <w:tcPr>
-            <w:tcW w:type="dxa" w:w="1872"/>
-            <w:tcBorders>
-              <w:top w:val="none"/>
-              <w:bottom w:val="none" w:sz="0" w:space="0" w:color="000000"/>
-              <w:left w:val="none"/>
-              <w:right w:val="none"/>
-            </w:tcBorders>
+            <w:tcW w:type="dxa" w:w="2160"/>
+            <w:vAlign w:val="center"/>
+            <w:tcMar>
+              <w:top w:w="70" w:type="dxa"/>
+              <w:bottom w:w="70" w:type="dxa"/>
+              <w:left w:w="100" w:type="dxa"/>
+              <w:right w:w="100" w:type="dxa"/>
+            </w:tcMar>
           </w:tcPr>
           <w:p>
+            <w:pPr>
+              <w:spacing w:before="20" w:after="20" w:line="252" w:lineRule="auto"/>
+              <w:jc w:val="left"/>
+            </w:pPr>
+            <w:r/>
             <w:r>
               <w:rPr>
-                <w:rFonts w:ascii="Arial" w:hAnsi="Arial"/>
-                <w:sz w:val="18"/>
+                <w:rFonts w:ascii="Times New Roman" w:hAnsi="Times New Roman"/>
+                <w:b w:val="0"/>
+                <w:color w:val="000000"/>
+                <w:sz w:val="17"/>
               </w:rPr>
-              <w:t>Introduction</w:t>
+              <w:t>Introduction - Objectives</w:t>
             </w:r>
           </w:p>
         </w:tc>
         <w:tc>
           <w:tcPr>
-            <w:tcW w:type="dxa" w:w="1872"/>
-            <w:tcBorders>
-              <w:top w:val="none"/>
-              <w:bottom w:val="none" w:sz="0" w:space="0" w:color="000000"/>
-              <w:left w:val="none"/>
-              <w:right w:val="none"/>
-            </w:tcBorders>
+            <w:tcW w:type="dxa" w:w="864"/>
+            <w:vAlign w:val="center"/>
+            <w:tcMar>
+              <w:top w:w="70" w:type="dxa"/>
+              <w:bottom w:w="70" w:type="dxa"/>
+              <w:left w:w="100" w:type="dxa"/>
+              <w:right w:w="100" w:type="dxa"/>
+            </w:tcMar>
           </w:tcPr>
           <w:p>
+            <w:pPr>
+              <w:spacing w:before="20" w:after="20" w:line="252" w:lineRule="auto"/>
+              <w:jc w:val="center"/>
+            </w:pPr>
+            <w:r/>
             <w:r>
               <w:rPr>
-                <w:rFonts w:ascii="Arial" w:hAnsi="Arial"/>
-                <w:sz w:val="18"/>
+                <w:rFonts w:ascii="Times New Roman" w:hAnsi="Times New Roman"/>
+                <w:b w:val="0"/>
+                <w:color w:val="000000"/>
+                <w:sz w:val="17"/>
               </w:rPr>
               <w:t>3</w:t>
             </w:r>
@@ -501,19 +722,27 @@
         </w:tc>
         <w:tc>
           <w:tcPr>
-            <w:tcW w:type="dxa" w:w="1872"/>
-            <w:tcBorders>
-              <w:top w:val="none"/>
-              <w:bottom w:val="none" w:sz="0" w:space="0" w:color="000000"/>
-              <w:left w:val="none"/>
-              <w:right w:val="none"/>
-            </w:tcBorders>
+            <w:tcW w:type="dxa" w:w="3168"/>
+            <w:vAlign w:val="center"/>
+            <w:tcMar>
+              <w:top w:w="70" w:type="dxa"/>
+              <w:bottom w:w="70" w:type="dxa"/>
+              <w:left w:w="100" w:type="dxa"/>
+              <w:right w:w="100" w:type="dxa"/>
+            </w:tcMar>
           </w:tcPr>
           <w:p>
+            <w:pPr>
+              <w:spacing w:before="20" w:after="20" w:line="252" w:lineRule="auto"/>
+              <w:jc w:val="both"/>
+            </w:pPr>
+            <w:r/>
             <w:r>
               <w:rPr>
-                <w:rFonts w:ascii="Arial" w:hAnsi="Arial"/>
-                <w:sz w:val="18"/>
+                <w:rFonts w:ascii="Times New Roman" w:hAnsi="Times New Roman"/>
+                <w:b w:val="0"/>
+                <w:color w:val="000000"/>
+                <w:sz w:val="17"/>
               </w:rPr>
               <w:t>State specific objectives, including any prespecified hypotheses</w:t>
             </w:r>
@@ -521,41 +750,57 @@
         </w:tc>
         <w:tc>
           <w:tcPr>
-            <w:tcW w:type="dxa" w:w="1872"/>
-            <w:tcBorders>
-              <w:top w:val="none"/>
-              <w:bottom w:val="none" w:sz="0" w:space="0" w:color="000000"/>
-              <w:left w:val="none"/>
-              <w:right w:val="none"/>
-            </w:tcBorders>
+            <w:tcW w:type="dxa" w:w="5616"/>
+            <w:vAlign w:val="center"/>
+            <w:tcMar>
+              <w:top w:w="70" w:type="dxa"/>
+              <w:bottom w:w="70" w:type="dxa"/>
+              <w:left w:w="100" w:type="dxa"/>
+              <w:right w:w="100" w:type="dxa"/>
+            </w:tcMar>
           </w:tcPr>
           <w:p>
+            <w:pPr>
+              <w:spacing w:before="20" w:after="20" w:line="252" w:lineRule="auto"/>
+              <w:jc w:val="both"/>
+            </w:pPr>
+            <w:r/>
             <w:r>
               <w:rPr>
-                <w:rFonts w:ascii="Arial" w:hAnsi="Arial"/>
-                <w:sz w:val="18"/>
+                <w:rFonts w:ascii="Times New Roman" w:hAnsi="Times New Roman"/>
+                <w:b w:val="0"/>
+                <w:color w:val="000000"/>
+                <w:sz w:val="17"/>
               </w:rPr>
-              <w:t>Section 1: Construct a tripartite causal GRN (TF -&gt; Enhancer -&gt; Gene), prioritize master drivers, apply Explainable AI (SHAP), benchmark against GENIE3/co-expression, and map drug targets.</w:t>
+              <w:t>Section 1.4: Explicitly defines 6 primary investigative objectives: (i) construct tripartite causal GRN (TF → Enhancer → Gene); (ii) prioritize master drivers via PageRank and MRS; (iii) decode non-linear cooperativity via Explainable AI (SHAP); (iv) benchmark against state-of-the-art GRN algorithms; (v) validate clinical prognosis in independent patient cohorts; and (vi) map synergistic epigenetic combination therapies.</w:t>
             </w:r>
           </w:p>
         </w:tc>
         <w:tc>
           <w:tcPr>
-            <w:tcW w:type="dxa" w:w="1872"/>
-            <w:tcBorders>
-              <w:top w:val="none"/>
-              <w:bottom w:val="none" w:sz="0" w:space="0" w:color="000000"/>
-              <w:left w:val="none"/>
-              <w:right w:val="none"/>
-            </w:tcBorders>
+            <w:tcW w:type="dxa" w:w="1728"/>
+            <w:vAlign w:val="center"/>
+            <w:tcMar>
+              <w:top w:w="70" w:type="dxa"/>
+              <w:bottom w:w="70" w:type="dxa"/>
+              <w:left w:w="100" w:type="dxa"/>
+              <w:right w:w="100" w:type="dxa"/>
+            </w:tcMar>
           </w:tcPr>
           <w:p>
+            <w:pPr>
+              <w:spacing w:before="20" w:after="20" w:line="252" w:lineRule="auto"/>
+              <w:jc w:val="left"/>
+            </w:pPr>
+            <w:r/>
             <w:r>
               <w:rPr>
-                <w:rFonts w:ascii="Arial" w:hAnsi="Arial"/>
-                <w:sz w:val="18"/>
+                <w:rFonts w:ascii="Times New Roman" w:hAnsi="Times New Roman"/>
+                <w:b w:val="0"/>
+                <w:color w:val="000000"/>
+                <w:sz w:val="17"/>
               </w:rPr>
-              <w:t>Page 2</w:t>
+              <w:t>Section 1.4; Page 2</w:t>
             </w:r>
           </w:p>
         </w:tc>
@@ -563,39 +808,55 @@
       <w:tr>
         <w:tc>
           <w:tcPr>
-            <w:tcW w:type="dxa" w:w="1872"/>
-            <w:tcBorders>
-              <w:top w:val="none"/>
-              <w:bottom w:val="none" w:sz="0" w:space="0" w:color="000000"/>
-              <w:left w:val="none"/>
-              <w:right w:val="none"/>
-            </w:tcBorders>
+            <w:tcW w:type="dxa" w:w="2160"/>
+            <w:vAlign w:val="center"/>
+            <w:tcMar>
+              <w:top w:w="70" w:type="dxa"/>
+              <w:bottom w:w="70" w:type="dxa"/>
+              <w:left w:w="100" w:type="dxa"/>
+              <w:right w:w="100" w:type="dxa"/>
+            </w:tcMar>
           </w:tcPr>
           <w:p>
+            <w:pPr>
+              <w:spacing w:before="20" w:after="20" w:line="252" w:lineRule="auto"/>
+              <w:jc w:val="left"/>
+            </w:pPr>
+            <w:r/>
             <w:r>
               <w:rPr>
-                <w:rFonts w:ascii="Arial" w:hAnsi="Arial"/>
-                <w:sz w:val="18"/>
+                <w:rFonts w:ascii="Times New Roman" w:hAnsi="Times New Roman"/>
+                <w:b w:val="0"/>
+                <w:color w:val="000000"/>
+                <w:sz w:val="17"/>
               </w:rPr>
-              <w:t>Methods - Design</w:t>
+              <w:t>Methods - Study Design</w:t>
             </w:r>
           </w:p>
         </w:tc>
         <w:tc>
           <w:tcPr>
-            <w:tcW w:type="dxa" w:w="1872"/>
-            <w:tcBorders>
-              <w:top w:val="none"/>
-              <w:bottom w:val="none" w:sz="0" w:space="0" w:color="000000"/>
-              <w:left w:val="none"/>
-              <w:right w:val="none"/>
-            </w:tcBorders>
+            <w:tcW w:type="dxa" w:w="864"/>
+            <w:vAlign w:val="center"/>
+            <w:tcMar>
+              <w:top w:w="70" w:type="dxa"/>
+              <w:bottom w:w="70" w:type="dxa"/>
+              <w:left w:w="100" w:type="dxa"/>
+              <w:right w:w="100" w:type="dxa"/>
+            </w:tcMar>
           </w:tcPr>
           <w:p>
+            <w:pPr>
+              <w:spacing w:before="20" w:after="20" w:line="252" w:lineRule="auto"/>
+              <w:jc w:val="center"/>
+            </w:pPr>
+            <w:r/>
             <w:r>
               <w:rPr>
-                <w:rFonts w:ascii="Arial" w:hAnsi="Arial"/>
-                <w:sz w:val="18"/>
+                <w:rFonts w:ascii="Times New Roman" w:hAnsi="Times New Roman"/>
+                <w:b w:val="0"/>
+                <w:color w:val="000000"/>
+                <w:sz w:val="17"/>
               </w:rPr>
               <w:t>4</w:t>
             </w:r>
@@ -603,19 +864,27 @@
         </w:tc>
         <w:tc>
           <w:tcPr>
-            <w:tcW w:type="dxa" w:w="1872"/>
-            <w:tcBorders>
-              <w:top w:val="none"/>
-              <w:bottom w:val="none" w:sz="0" w:space="0" w:color="000000"/>
-              <w:left w:val="none"/>
-              <w:right w:val="none"/>
-            </w:tcBorders>
+            <w:tcW w:type="dxa" w:w="3168"/>
+            <w:vAlign w:val="center"/>
+            <w:tcMar>
+              <w:top w:w="70" w:type="dxa"/>
+              <w:bottom w:w="70" w:type="dxa"/>
+              <w:left w:w="100" w:type="dxa"/>
+              <w:right w:w="100" w:type="dxa"/>
+            </w:tcMar>
           </w:tcPr>
           <w:p>
+            <w:pPr>
+              <w:spacing w:before="20" w:after="20" w:line="252" w:lineRule="auto"/>
+              <w:jc w:val="both"/>
+            </w:pPr>
+            <w:r/>
             <w:r>
               <w:rPr>
-                <w:rFonts w:ascii="Arial" w:hAnsi="Arial"/>
-                <w:sz w:val="18"/>
+                <w:rFonts w:ascii="Times New Roman" w:hAnsi="Times New Roman"/>
+                <w:b w:val="0"/>
+                <w:color w:val="000000"/>
+                <w:sz w:val="17"/>
               </w:rPr>
               <w:t>Present key elements of study design early in the paper</w:t>
             </w:r>
@@ -623,41 +892,57 @@
         </w:tc>
         <w:tc>
           <w:tcPr>
-            <w:tcW w:type="dxa" w:w="1872"/>
-            <w:tcBorders>
-              <w:top w:val="none"/>
-              <w:bottom w:val="none" w:sz="0" w:space="0" w:color="000000"/>
-              <w:left w:val="none"/>
-              <w:right w:val="none"/>
-            </w:tcBorders>
+            <w:tcW w:type="dxa" w:w="5616"/>
+            <w:vAlign w:val="center"/>
+            <w:tcMar>
+              <w:top w:w="70" w:type="dxa"/>
+              <w:bottom w:w="70" w:type="dxa"/>
+              <w:left w:w="100" w:type="dxa"/>
+              <w:right w:w="100" w:type="dxa"/>
+            </w:tcMar>
           </w:tcPr>
           <w:p>
+            <w:pPr>
+              <w:spacing w:before="20" w:after="20" w:line="252" w:lineRule="auto"/>
+              <w:jc w:val="both"/>
+            </w:pPr>
+            <w:r/>
             <w:r>
               <w:rPr>
-                <w:rFonts w:ascii="Arial" w:hAnsi="Arial"/>
-                <w:sz w:val="18"/>
+                <w:rFonts w:ascii="Times New Roman" w:hAnsi="Times New Roman"/>
+                <w:b w:val="0"/>
+                <w:color w:val="000000"/>
+                <w:sz w:val="17"/>
               </w:rPr>
-              <w:t>Section 2.1-2.4: Six-phase interventional causal inference framework integrating single-cell CRISPRi screen with ENCODE ChIP-seq physical binding priors.</w:t>
+              <w:t>Section 2.1–2.4: Comprehensive end-to-end causal machine learning workflow uniting physical chromatin occupancy (ENCODE Factorbook ChIP-seq) with randomized interventional perturbation response (single-cell CRISPRi / dCas9-KRAB).</w:t>
             </w:r>
           </w:p>
         </w:tc>
         <w:tc>
           <w:tcPr>
-            <w:tcW w:type="dxa" w:w="1872"/>
-            <w:tcBorders>
-              <w:top w:val="none"/>
-              <w:bottom w:val="none" w:sz="0" w:space="0" w:color="000000"/>
-              <w:left w:val="none"/>
-              <w:right w:val="none"/>
-            </w:tcBorders>
+            <w:tcW w:type="dxa" w:w="1728"/>
+            <w:vAlign w:val="center"/>
+            <w:tcMar>
+              <w:top w:w="70" w:type="dxa"/>
+              <w:bottom w:w="70" w:type="dxa"/>
+              <w:left w:w="100" w:type="dxa"/>
+              <w:right w:w="100" w:type="dxa"/>
+            </w:tcMar>
           </w:tcPr>
           <w:p>
+            <w:pPr>
+              <w:spacing w:before="20" w:after="20" w:line="252" w:lineRule="auto"/>
+              <w:jc w:val="left"/>
+            </w:pPr>
+            <w:r/>
             <w:r>
               <w:rPr>
-                <w:rFonts w:ascii="Arial" w:hAnsi="Arial"/>
-                <w:sz w:val="18"/>
+                <w:rFonts w:ascii="Times New Roman" w:hAnsi="Times New Roman"/>
+                <w:b w:val="0"/>
+                <w:color w:val="000000"/>
+                <w:sz w:val="17"/>
               </w:rPr>
-              <w:t>Pages 2-3</w:t>
+              <w:t>Sections 2.1–2.4; Pages 2–3</w:t>
             </w:r>
           </w:p>
         </w:tc>
@@ -665,19 +950,27 @@
       <w:tr>
         <w:tc>
           <w:tcPr>
-            <w:tcW w:type="dxa" w:w="1872"/>
-            <w:tcBorders>
-              <w:top w:val="none"/>
-              <w:bottom w:val="none" w:sz="0" w:space="0" w:color="000000"/>
-              <w:left w:val="none"/>
-              <w:right w:val="none"/>
-            </w:tcBorders>
+            <w:tcW w:type="dxa" w:w="2160"/>
+            <w:vAlign w:val="center"/>
+            <w:tcMar>
+              <w:top w:w="70" w:type="dxa"/>
+              <w:bottom w:w="70" w:type="dxa"/>
+              <w:left w:w="100" w:type="dxa"/>
+              <w:right w:w="100" w:type="dxa"/>
+            </w:tcMar>
           </w:tcPr>
           <w:p>
+            <w:pPr>
+              <w:spacing w:before="20" w:after="20" w:line="252" w:lineRule="auto"/>
+              <w:jc w:val="left"/>
+            </w:pPr>
+            <w:r/>
             <w:r>
               <w:rPr>
-                <w:rFonts w:ascii="Arial" w:hAnsi="Arial"/>
-                <w:sz w:val="18"/>
+                <w:rFonts w:ascii="Times New Roman" w:hAnsi="Times New Roman"/>
+                <w:b w:val="0"/>
+                <w:color w:val="000000"/>
+                <w:sz w:val="17"/>
               </w:rPr>
               <w:t>Methods - Setting</w:t>
             </w:r>
@@ -685,19 +978,27 @@
         </w:tc>
         <w:tc>
           <w:tcPr>
-            <w:tcW w:type="dxa" w:w="1872"/>
-            <w:tcBorders>
-              <w:top w:val="none"/>
-              <w:bottom w:val="none" w:sz="0" w:space="0" w:color="000000"/>
-              <w:left w:val="none"/>
-              <w:right w:val="none"/>
-            </w:tcBorders>
+            <w:tcW w:type="dxa" w:w="864"/>
+            <w:vAlign w:val="center"/>
+            <w:tcMar>
+              <w:top w:w="70" w:type="dxa"/>
+              <w:bottom w:w="70" w:type="dxa"/>
+              <w:left w:w="100" w:type="dxa"/>
+              <w:right w:w="100" w:type="dxa"/>
+            </w:tcMar>
           </w:tcPr>
           <w:p>
+            <w:pPr>
+              <w:spacing w:before="20" w:after="20" w:line="252" w:lineRule="auto"/>
+              <w:jc w:val="center"/>
+            </w:pPr>
+            <w:r/>
             <w:r>
               <w:rPr>
-                <w:rFonts w:ascii="Arial" w:hAnsi="Arial"/>
-                <w:sz w:val="18"/>
+                <w:rFonts w:ascii="Times New Roman" w:hAnsi="Times New Roman"/>
+                <w:b w:val="0"/>
+                <w:color w:val="000000"/>
+                <w:sz w:val="17"/>
               </w:rPr>
               <w:t>5</w:t>
             </w:r>
@@ -705,19 +1006,27 @@
         </w:tc>
         <w:tc>
           <w:tcPr>
-            <w:tcW w:type="dxa" w:w="1872"/>
-            <w:tcBorders>
-              <w:top w:val="none"/>
-              <w:bottom w:val="none" w:sz="0" w:space="0" w:color="000000"/>
-              <w:left w:val="none"/>
-              <w:right w:val="none"/>
-            </w:tcBorders>
+            <w:tcW w:type="dxa" w:w="3168"/>
+            <w:vAlign w:val="center"/>
+            <w:tcMar>
+              <w:top w:w="70" w:type="dxa"/>
+              <w:bottom w:w="70" w:type="dxa"/>
+              <w:left w:w="100" w:type="dxa"/>
+              <w:right w:w="100" w:type="dxa"/>
+            </w:tcMar>
           </w:tcPr>
           <w:p>
+            <w:pPr>
+              <w:spacing w:before="20" w:after="20" w:line="252" w:lineRule="auto"/>
+              <w:jc w:val="both"/>
+            </w:pPr>
+            <w:r/>
             <w:r>
               <w:rPr>
-                <w:rFonts w:ascii="Arial" w:hAnsi="Arial"/>
-                <w:sz w:val="18"/>
+                <w:rFonts w:ascii="Times New Roman" w:hAnsi="Times New Roman"/>
+                <w:b w:val="0"/>
+                <w:color w:val="000000"/>
+                <w:sz w:val="17"/>
               </w:rPr>
               <w:t>Describe setting, locations, relevant dates, exposure periods</w:t>
             </w:r>
@@ -725,41 +1034,57 @@
         </w:tc>
         <w:tc>
           <w:tcPr>
-            <w:tcW w:type="dxa" w:w="1872"/>
-            <w:tcBorders>
-              <w:top w:val="none"/>
-              <w:bottom w:val="none" w:sz="0" w:space="0" w:color="000000"/>
-              <w:left w:val="none"/>
-              <w:right w:val="none"/>
-            </w:tcBorders>
+            <w:tcW w:type="dxa" w:w="5616"/>
+            <w:vAlign w:val="center"/>
+            <w:tcMar>
+              <w:top w:w="70" w:type="dxa"/>
+              <w:bottom w:w="70" w:type="dxa"/>
+              <w:left w:w="100" w:type="dxa"/>
+              <w:right w:w="100" w:type="dxa"/>
+            </w:tcMar>
           </w:tcPr>
           <w:p>
+            <w:pPr>
+              <w:spacing w:before="20" w:after="20" w:line="252" w:lineRule="auto"/>
+              <w:jc w:val="both"/>
+            </w:pPr>
+            <w:r/>
             <w:r>
               <w:rPr>
-                <w:rFonts w:ascii="Arial" w:hAnsi="Arial"/>
-                <w:sz w:val="18"/>
+                <w:rFonts w:ascii="Times New Roman" w:hAnsi="Times New Roman"/>
+                <w:b w:val="0"/>
+                <w:color w:val="000000"/>
+                <w:sz w:val="17"/>
               </w:rPr>
-              <w:t>Section 2.1: In vitro MDA-MB-231 human triple-negative breast cancer cells subjected to genome-scale dCas9-KRAB single-cell perturbation (GSE224986).</w:t>
+              <w:t>Section 2.1: In vitro model system MDA-MB-231 (archetypal mesenchymal/basal-like TNBC); genome-scale single-cell CRISPRi Perturb-seq screen across 8 independent 10x Genomics Chromium 3' sequencing lanes (GEO accession GSE224986).</w:t>
             </w:r>
           </w:p>
         </w:tc>
         <w:tc>
           <w:tcPr>
-            <w:tcW w:type="dxa" w:w="1872"/>
-            <w:tcBorders>
-              <w:top w:val="none"/>
-              <w:bottom w:val="none" w:sz="0" w:space="0" w:color="000000"/>
-              <w:left w:val="none"/>
-              <w:right w:val="none"/>
-            </w:tcBorders>
+            <w:tcW w:type="dxa" w:w="1728"/>
+            <w:vAlign w:val="center"/>
+            <w:tcMar>
+              <w:top w:w="70" w:type="dxa"/>
+              <w:bottom w:w="70" w:type="dxa"/>
+              <w:left w:w="100" w:type="dxa"/>
+              <w:right w:w="100" w:type="dxa"/>
+            </w:tcMar>
           </w:tcPr>
           <w:p>
+            <w:pPr>
+              <w:spacing w:before="20" w:after="20" w:line="252" w:lineRule="auto"/>
+              <w:jc w:val="left"/>
+            </w:pPr>
+            <w:r/>
             <w:r>
               <w:rPr>
-                <w:rFonts w:ascii="Arial" w:hAnsi="Arial"/>
-                <w:sz w:val="18"/>
+                <w:rFonts w:ascii="Times New Roman" w:hAnsi="Times New Roman"/>
+                <w:b w:val="0"/>
+                <w:color w:val="000000"/>
+                <w:sz w:val="17"/>
               </w:rPr>
-              <w:t>Page 2</w:t>
+              <w:t>Section 2.1; Page 2</w:t>
             </w:r>
           </w:p>
         </w:tc>
@@ -767,39 +1092,55 @@
       <w:tr>
         <w:tc>
           <w:tcPr>
-            <w:tcW w:type="dxa" w:w="1872"/>
-            <w:tcBorders>
-              <w:top w:val="none"/>
-              <w:bottom w:val="none" w:sz="0" w:space="0" w:color="000000"/>
-              <w:left w:val="none"/>
-              <w:right w:val="none"/>
-            </w:tcBorders>
+            <w:tcW w:type="dxa" w:w="2160"/>
+            <w:vAlign w:val="center"/>
+            <w:tcMar>
+              <w:top w:w="70" w:type="dxa"/>
+              <w:bottom w:w="70" w:type="dxa"/>
+              <w:left w:w="100" w:type="dxa"/>
+              <w:right w:w="100" w:type="dxa"/>
+            </w:tcMar>
           </w:tcPr>
           <w:p>
+            <w:pPr>
+              <w:spacing w:before="20" w:after="20" w:line="252" w:lineRule="auto"/>
+              <w:jc w:val="left"/>
+            </w:pPr>
+            <w:r/>
             <w:r>
               <w:rPr>
-                <w:rFonts w:ascii="Arial" w:hAnsi="Arial"/>
-                <w:sz w:val="18"/>
+                <w:rFonts w:ascii="Times New Roman" w:hAnsi="Times New Roman"/>
+                <w:b w:val="0"/>
+                <w:color w:val="000000"/>
+                <w:sz w:val="17"/>
               </w:rPr>
-              <w:t>Methods - Participants</w:t>
+              <w:t>Methods - Participants / Cells</w:t>
             </w:r>
           </w:p>
         </w:tc>
         <w:tc>
           <w:tcPr>
-            <w:tcW w:type="dxa" w:w="1872"/>
-            <w:tcBorders>
-              <w:top w:val="none"/>
-              <w:bottom w:val="none" w:sz="0" w:space="0" w:color="000000"/>
-              <w:left w:val="none"/>
-              <w:right w:val="none"/>
-            </w:tcBorders>
+            <w:tcW w:type="dxa" w:w="864"/>
+            <w:vAlign w:val="center"/>
+            <w:tcMar>
+              <w:top w:w="70" w:type="dxa"/>
+              <w:bottom w:w="70" w:type="dxa"/>
+              <w:left w:w="100" w:type="dxa"/>
+              <w:right w:w="100" w:type="dxa"/>
+            </w:tcMar>
           </w:tcPr>
           <w:p>
+            <w:pPr>
+              <w:spacing w:before="20" w:after="20" w:line="252" w:lineRule="auto"/>
+              <w:jc w:val="center"/>
+            </w:pPr>
+            <w:r/>
             <w:r>
               <w:rPr>
-                <w:rFonts w:ascii="Arial" w:hAnsi="Arial"/>
-                <w:sz w:val="18"/>
+                <w:rFonts w:ascii="Times New Roman" w:hAnsi="Times New Roman"/>
+                <w:b w:val="0"/>
+                <w:color w:val="000000"/>
+                <w:sz w:val="17"/>
               </w:rPr>
               <w:t>6a</w:t>
             </w:r>
@@ -807,19 +1148,27 @@
         </w:tc>
         <w:tc>
           <w:tcPr>
-            <w:tcW w:type="dxa" w:w="1872"/>
-            <w:tcBorders>
-              <w:top w:val="none"/>
-              <w:bottom w:val="none" w:sz="0" w:space="0" w:color="000000"/>
-              <w:left w:val="none"/>
-              <w:right w:val="none"/>
-            </w:tcBorders>
+            <w:tcW w:type="dxa" w:w="3168"/>
+            <w:vAlign w:val="center"/>
+            <w:tcMar>
+              <w:top w:w="70" w:type="dxa"/>
+              <w:bottom w:w="70" w:type="dxa"/>
+              <w:left w:w="100" w:type="dxa"/>
+              <w:right w:w="100" w:type="dxa"/>
+            </w:tcMar>
           </w:tcPr>
           <w:p>
+            <w:pPr>
+              <w:spacing w:before="20" w:after="20" w:line="252" w:lineRule="auto"/>
+              <w:jc w:val="both"/>
+            </w:pPr>
+            <w:r/>
             <w:r>
               <w:rPr>
-                <w:rFonts w:ascii="Arial" w:hAnsi="Arial"/>
-                <w:sz w:val="18"/>
+                <w:rFonts w:ascii="Times New Roman" w:hAnsi="Times New Roman"/>
+                <w:b w:val="0"/>
+                <w:color w:val="000000"/>
+                <w:sz w:val="17"/>
               </w:rPr>
               <w:t>Give eligibility criteria, sources, and selection methods</w:t>
             </w:r>
@@ -827,41 +1176,57 @@
         </w:tc>
         <w:tc>
           <w:tcPr>
-            <w:tcW w:type="dxa" w:w="1872"/>
-            <w:tcBorders>
-              <w:top w:val="none"/>
-              <w:bottom w:val="none" w:sz="0" w:space="0" w:color="000000"/>
-              <w:left w:val="none"/>
-              <w:right w:val="none"/>
-            </w:tcBorders>
+            <w:tcW w:type="dxa" w:w="5616"/>
+            <w:vAlign w:val="center"/>
+            <w:tcMar>
+              <w:top w:w="70" w:type="dxa"/>
+              <w:bottom w:w="70" w:type="dxa"/>
+              <w:left w:w="100" w:type="dxa"/>
+              <w:right w:w="100" w:type="dxa"/>
+            </w:tcMar>
           </w:tcPr>
           <w:p>
+            <w:pPr>
+              <w:spacing w:before="20" w:after="20" w:line="252" w:lineRule="auto"/>
+              <w:jc w:val="both"/>
+            </w:pPr>
+            <w:r/>
             <w:r>
               <w:rPr>
-                <w:rFonts w:ascii="Arial" w:hAnsi="Arial"/>
-                <w:sz w:val="18"/>
+                <w:rFonts w:ascii="Times New Roman" w:hAnsi="Times New Roman"/>
+                <w:b w:val="0"/>
+                <w:color w:val="000000"/>
+                <w:sz w:val="17"/>
               </w:rPr>
-              <w:t>Section 2.1: Single-cell selection based on standard QC (detected genes &gt;= 200, genes in &gt;= 3 cells, non-zero UMI counts; 95,678 high-quality single cells analyzed).</w:t>
+              <w:t>Section 2.1: Stringent single-cell quality control thresholds: cells retaining &gt;= 200 detected genes and &lt;= 15% mitochondrial reads; genes expressed in &gt;= 3 cells; resulting in 95,678 high-quality single cells and 32,799 gene features.</w:t>
             </w:r>
           </w:p>
         </w:tc>
         <w:tc>
           <w:tcPr>
-            <w:tcW w:type="dxa" w:w="1872"/>
-            <w:tcBorders>
-              <w:top w:val="none"/>
-              <w:bottom w:val="none" w:sz="0" w:space="0" w:color="000000"/>
-              <w:left w:val="none"/>
-              <w:right w:val="none"/>
-            </w:tcBorders>
+            <w:tcW w:type="dxa" w:w="1728"/>
+            <w:vAlign w:val="center"/>
+            <w:tcMar>
+              <w:top w:w="70" w:type="dxa"/>
+              <w:bottom w:w="70" w:type="dxa"/>
+              <w:left w:w="100" w:type="dxa"/>
+              <w:right w:w="100" w:type="dxa"/>
+            </w:tcMar>
           </w:tcPr>
           <w:p>
+            <w:pPr>
+              <w:spacing w:before="20" w:after="20" w:line="252" w:lineRule="auto"/>
+              <w:jc w:val="left"/>
+            </w:pPr>
+            <w:r/>
             <w:r>
               <w:rPr>
-                <w:rFonts w:ascii="Arial" w:hAnsi="Arial"/>
-                <w:sz w:val="18"/>
+                <w:rFonts w:ascii="Times New Roman" w:hAnsi="Times New Roman"/>
+                <w:b w:val="0"/>
+                <w:color w:val="000000"/>
+                <w:sz w:val="17"/>
               </w:rPr>
-              <w:t>Page 2</w:t>
+              <w:t>Section 2.1; Table 1; Figure 1</w:t>
             </w:r>
           </w:p>
         </w:tc>
@@ -869,19 +1234,27 @@
       <w:tr>
         <w:tc>
           <w:tcPr>
-            <w:tcW w:type="dxa" w:w="1872"/>
-            <w:tcBorders>
-              <w:top w:val="none"/>
-              <w:bottom w:val="none" w:sz="0" w:space="0" w:color="000000"/>
-              <w:left w:val="none"/>
-              <w:right w:val="none"/>
-            </w:tcBorders>
+            <w:tcW w:type="dxa" w:w="2160"/>
+            <w:vAlign w:val="center"/>
+            <w:tcMar>
+              <w:top w:w="70" w:type="dxa"/>
+              <w:bottom w:w="70" w:type="dxa"/>
+              <w:left w:w="100" w:type="dxa"/>
+              <w:right w:w="100" w:type="dxa"/>
+            </w:tcMar>
           </w:tcPr>
           <w:p>
+            <w:pPr>
+              <w:spacing w:before="20" w:after="20" w:line="252" w:lineRule="auto"/>
+              <w:jc w:val="left"/>
+            </w:pPr>
+            <w:r/>
             <w:r>
               <w:rPr>
-                <w:rFonts w:ascii="Arial" w:hAnsi="Arial"/>
-                <w:sz w:val="18"/>
+                <w:rFonts w:ascii="Times New Roman" w:hAnsi="Times New Roman"/>
+                <w:b w:val="0"/>
+                <w:color w:val="000000"/>
+                <w:sz w:val="17"/>
               </w:rPr>
               <w:t>Methods - Variables</w:t>
             </w:r>
@@ -889,19 +1262,27 @@
         </w:tc>
         <w:tc>
           <w:tcPr>
-            <w:tcW w:type="dxa" w:w="1872"/>
-            <w:tcBorders>
-              <w:top w:val="none"/>
-              <w:bottom w:val="none" w:sz="0" w:space="0" w:color="000000"/>
-              <w:left w:val="none"/>
-              <w:right w:val="none"/>
-            </w:tcBorders>
+            <w:tcW w:type="dxa" w:w="864"/>
+            <w:vAlign w:val="center"/>
+            <w:tcMar>
+              <w:top w:w="70" w:type="dxa"/>
+              <w:bottom w:w="70" w:type="dxa"/>
+              <w:left w:w="100" w:type="dxa"/>
+              <w:right w:w="100" w:type="dxa"/>
+            </w:tcMar>
           </w:tcPr>
           <w:p>
+            <w:pPr>
+              <w:spacing w:before="20" w:after="20" w:line="252" w:lineRule="auto"/>
+              <w:jc w:val="center"/>
+            </w:pPr>
+            <w:r/>
             <w:r>
               <w:rPr>
-                <w:rFonts w:ascii="Arial" w:hAnsi="Arial"/>
-                <w:sz w:val="18"/>
+                <w:rFonts w:ascii="Times New Roman" w:hAnsi="Times New Roman"/>
+                <w:b w:val="0"/>
+                <w:color w:val="000000"/>
+                <w:sz w:val="17"/>
               </w:rPr>
               <w:t>7</w:t>
             </w:r>
@@ -909,19 +1290,27 @@
         </w:tc>
         <w:tc>
           <w:tcPr>
-            <w:tcW w:type="dxa" w:w="1872"/>
-            <w:tcBorders>
-              <w:top w:val="none"/>
-              <w:bottom w:val="none" w:sz="0" w:space="0" w:color="000000"/>
-              <w:left w:val="none"/>
-              <w:right w:val="none"/>
-            </w:tcBorders>
+            <w:tcW w:type="dxa" w:w="3168"/>
+            <w:vAlign w:val="center"/>
+            <w:tcMar>
+              <w:top w:w="70" w:type="dxa"/>
+              <w:bottom w:w="70" w:type="dxa"/>
+              <w:left w:w="100" w:type="dxa"/>
+              <w:right w:w="100" w:type="dxa"/>
+            </w:tcMar>
           </w:tcPr>
           <w:p>
+            <w:pPr>
+              <w:spacing w:before="20" w:after="20" w:line="252" w:lineRule="auto"/>
+              <w:jc w:val="both"/>
+            </w:pPr>
+            <w:r/>
             <w:r>
               <w:rPr>
-                <w:rFonts w:ascii="Arial" w:hAnsi="Arial"/>
-                <w:sz w:val="18"/>
+                <w:rFonts w:ascii="Times New Roman" w:hAnsi="Times New Roman"/>
+                <w:b w:val="0"/>
+                <w:color w:val="000000"/>
+                <w:sz w:val="17"/>
               </w:rPr>
               <w:t>Clearly define all outcomes, exposures, predictors, confounders</w:t>
             </w:r>
@@ -929,41 +1318,57 @@
         </w:tc>
         <w:tc>
           <w:tcPr>
-            <w:tcW w:type="dxa" w:w="1872"/>
-            <w:tcBorders>
-              <w:top w:val="none"/>
-              <w:bottom w:val="none" w:sz="0" w:space="0" w:color="000000"/>
-              <w:left w:val="none"/>
-              <w:right w:val="none"/>
-            </w:tcBorders>
+            <w:tcW w:type="dxa" w:w="5616"/>
+            <w:vAlign w:val="center"/>
+            <w:tcMar>
+              <w:top w:w="70" w:type="dxa"/>
+              <w:bottom w:w="70" w:type="dxa"/>
+              <w:left w:w="100" w:type="dxa"/>
+              <w:right w:w="100" w:type="dxa"/>
+            </w:tcMar>
           </w:tcPr>
           <w:p>
+            <w:pPr>
+              <w:spacing w:before="20" w:after="20" w:line="252" w:lineRule="auto"/>
+              <w:jc w:val="both"/>
+            </w:pPr>
+            <w:r/>
             <w:r>
               <w:rPr>
-                <w:rFonts w:ascii="Arial" w:hAnsi="Arial"/>
-                <w:sz w:val="18"/>
+                <w:rFonts w:ascii="Times New Roman" w:hAnsi="Times New Roman"/>
+                <w:b w:val="0"/>
+                <w:color w:val="000000"/>
+                <w:sz w:val="17"/>
               </w:rPr>
-              <w:t>Section 2.3-2.4: Exposure = single-guide enhancer CRISPRi perturbation; Outcome = target gene log2 FC; Predictors = ChIP confidence, causal weights; Confounders = 10x lane batches.</w:t>
+              <w:t>Sections 2.1–2.4: Exposure = targeted dCas9-KRAB single-guide enhancer silencing (819 somatic mutation loci); Outcome = log2 fold change and Welch t-statistic of target genes; Predictors = ChIP peak confidence score C_ChIP(i, e) in [0, 1000] and causal weight W_causal; Potential Confounders = technical dropout zeros, 10x sequencing lane batches, and multi-guide epistatic crosstalk.</w:t>
             </w:r>
           </w:p>
         </w:tc>
         <w:tc>
           <w:tcPr>
-            <w:tcW w:type="dxa" w:w="1872"/>
-            <w:tcBorders>
-              <w:top w:val="none"/>
-              <w:bottom w:val="none" w:sz="0" w:space="0" w:color="000000"/>
-              <w:left w:val="none"/>
-              <w:right w:val="none"/>
-            </w:tcBorders>
+            <w:tcW w:type="dxa" w:w="1728"/>
+            <w:vAlign w:val="center"/>
+            <w:tcMar>
+              <w:top w:w="70" w:type="dxa"/>
+              <w:bottom w:w="70" w:type="dxa"/>
+              <w:left w:w="100" w:type="dxa"/>
+              <w:right w:w="100" w:type="dxa"/>
+            </w:tcMar>
           </w:tcPr>
           <w:p>
+            <w:pPr>
+              <w:spacing w:before="20" w:after="20" w:line="252" w:lineRule="auto"/>
+              <w:jc w:val="left"/>
+            </w:pPr>
+            <w:r/>
             <w:r>
               <w:rPr>
-                <w:rFonts w:ascii="Arial" w:hAnsi="Arial"/>
-                <w:sz w:val="18"/>
+                <w:rFonts w:ascii="Times New Roman" w:hAnsi="Times New Roman"/>
+                <w:b w:val="0"/>
+                <w:color w:val="000000"/>
+                <w:sz w:val="17"/>
               </w:rPr>
-              <w:t>Pages 2-3</w:t>
+              <w:t>Sections 2.1, 2.3, 2.4; Table 1</w:t>
             </w:r>
           </w:p>
         </w:tc>
@@ -971,19 +1376,27 @@
       <w:tr>
         <w:tc>
           <w:tcPr>
-            <w:tcW w:type="dxa" w:w="1872"/>
-            <w:tcBorders>
-              <w:top w:val="none"/>
-              <w:bottom w:val="none" w:sz="0" w:space="0" w:color="000000"/>
-              <w:left w:val="none"/>
-              <w:right w:val="none"/>
-            </w:tcBorders>
+            <w:tcW w:type="dxa" w:w="2160"/>
+            <w:vAlign w:val="center"/>
+            <w:tcMar>
+              <w:top w:w="70" w:type="dxa"/>
+              <w:bottom w:w="70" w:type="dxa"/>
+              <w:left w:w="100" w:type="dxa"/>
+              <w:right w:w="100" w:type="dxa"/>
+            </w:tcMar>
           </w:tcPr>
           <w:p>
+            <w:pPr>
+              <w:spacing w:before="20" w:after="20" w:line="252" w:lineRule="auto"/>
+              <w:jc w:val="left"/>
+            </w:pPr>
+            <w:r/>
             <w:r>
               <w:rPr>
-                <w:rFonts w:ascii="Arial" w:hAnsi="Arial"/>
-                <w:sz w:val="18"/>
+                <w:rFonts w:ascii="Times New Roman" w:hAnsi="Times New Roman"/>
+                <w:b w:val="0"/>
+                <w:color w:val="000000"/>
+                <w:sz w:val="17"/>
               </w:rPr>
               <w:t>Methods - Data Sources</w:t>
             </w:r>
@@ -991,19 +1404,27 @@
         </w:tc>
         <w:tc>
           <w:tcPr>
-            <w:tcW w:type="dxa" w:w="1872"/>
-            <w:tcBorders>
-              <w:top w:val="none"/>
-              <w:bottom w:val="none" w:sz="0" w:space="0" w:color="000000"/>
-              <w:left w:val="none"/>
-              <w:right w:val="none"/>
-            </w:tcBorders>
+            <w:tcW w:type="dxa" w:w="864"/>
+            <w:vAlign w:val="center"/>
+            <w:tcMar>
+              <w:top w:w="70" w:type="dxa"/>
+              <w:bottom w:w="70" w:type="dxa"/>
+              <w:left w:w="100" w:type="dxa"/>
+              <w:right w:w="100" w:type="dxa"/>
+            </w:tcMar>
           </w:tcPr>
           <w:p>
+            <w:pPr>
+              <w:spacing w:before="20" w:after="20" w:line="252" w:lineRule="auto"/>
+              <w:jc w:val="center"/>
+            </w:pPr>
+            <w:r/>
             <w:r>
               <w:rPr>
-                <w:rFonts w:ascii="Arial" w:hAnsi="Arial"/>
-                <w:sz w:val="18"/>
+                <w:rFonts w:ascii="Times New Roman" w:hAnsi="Times New Roman"/>
+                <w:b w:val="0"/>
+                <w:color w:val="000000"/>
+                <w:sz w:val="17"/>
               </w:rPr>
               <w:t>8</w:t>
             </w:r>
@@ -1011,19 +1432,27 @@
         </w:tc>
         <w:tc>
           <w:tcPr>
-            <w:tcW w:type="dxa" w:w="1872"/>
-            <w:tcBorders>
-              <w:top w:val="none"/>
-              <w:bottom w:val="none" w:sz="0" w:space="0" w:color="000000"/>
-              <w:left w:val="none"/>
-              <w:right w:val="none"/>
-            </w:tcBorders>
+            <w:tcW w:type="dxa" w:w="3168"/>
+            <w:vAlign w:val="center"/>
+            <w:tcMar>
+              <w:top w:w="70" w:type="dxa"/>
+              <w:bottom w:w="70" w:type="dxa"/>
+              <w:left w:w="100" w:type="dxa"/>
+              <w:right w:w="100" w:type="dxa"/>
+            </w:tcMar>
           </w:tcPr>
           <w:p>
+            <w:pPr>
+              <w:spacing w:before="20" w:after="20" w:line="252" w:lineRule="auto"/>
+              <w:jc w:val="both"/>
+            </w:pPr>
+            <w:r/>
             <w:r>
               <w:rPr>
-                <w:rFonts w:ascii="Arial" w:hAnsi="Arial"/>
-                <w:sz w:val="18"/>
+                <w:rFonts w:ascii="Times New Roman" w:hAnsi="Times New Roman"/>
+                <w:b w:val="0"/>
+                <w:color w:val="000000"/>
+                <w:sz w:val="17"/>
               </w:rPr>
               <w:t>Give sources of data and details of measurement methods</w:t>
             </w:r>
@@ -1031,41 +1460,57 @@
         </w:tc>
         <w:tc>
           <w:tcPr>
-            <w:tcW w:type="dxa" w:w="1872"/>
-            <w:tcBorders>
-              <w:top w:val="none"/>
-              <w:bottom w:val="none" w:sz="0" w:space="0" w:color="000000"/>
-              <w:left w:val="none"/>
-              <w:right w:val="none"/>
-            </w:tcBorders>
+            <w:tcW w:type="dxa" w:w="5616"/>
+            <w:vAlign w:val="center"/>
+            <w:tcMar>
+              <w:top w:w="70" w:type="dxa"/>
+              <w:bottom w:w="70" w:type="dxa"/>
+              <w:left w:w="100" w:type="dxa"/>
+              <w:right w:w="100" w:type="dxa"/>
+            </w:tcMar>
           </w:tcPr>
           <w:p>
+            <w:pPr>
+              <w:spacing w:before="20" w:after="20" w:line="252" w:lineRule="auto"/>
+              <w:jc w:val="both"/>
+            </w:pPr>
+            <w:r/>
             <w:r>
               <w:rPr>
-                <w:rFonts w:ascii="Arial" w:hAnsi="Arial"/>
-                <w:sz w:val="18"/>
+                <w:rFonts w:ascii="Times New Roman" w:hAnsi="Times New Roman"/>
+                <w:b w:val="0"/>
+                <w:color w:val="000000"/>
+                <w:sz w:val="17"/>
               </w:rPr>
-              <w:t>Section 2.1-2.2: GEO GSE224986 (Perturb-seq), GSE223812 (enhancer BED), ENCODE UCSC encRegTfbsClustered (ChIP-seq), TCGA-BRCA / METABRIC (clinical survival).</w:t>
+              <w:t>Sections 2.1, 2.2, 2.7: GEO GSE224986 (single-cell CRISPRi), GSE223812 (enhancer coordinates), UCSC / ENCODE encRegTfbsClustered (ChIP-seq priors across 340 TFs), TCGA-BRCA (n = 160 TNBC) and METABRIC (n = 320 TNBC) clinical cohorts.</w:t>
             </w:r>
           </w:p>
         </w:tc>
         <w:tc>
           <w:tcPr>
-            <w:tcW w:type="dxa" w:w="1872"/>
-            <w:tcBorders>
-              <w:top w:val="none"/>
-              <w:bottom w:val="none" w:sz="0" w:space="0" w:color="000000"/>
-              <w:left w:val="none"/>
-              <w:right w:val="none"/>
-            </w:tcBorders>
+            <w:tcW w:type="dxa" w:w="1728"/>
+            <w:vAlign w:val="center"/>
+            <w:tcMar>
+              <w:top w:w="70" w:type="dxa"/>
+              <w:bottom w:w="70" w:type="dxa"/>
+              <w:left w:w="100" w:type="dxa"/>
+              <w:right w:w="100" w:type="dxa"/>
+            </w:tcMar>
           </w:tcPr>
           <w:p>
+            <w:pPr>
+              <w:spacing w:before="20" w:after="20" w:line="252" w:lineRule="auto"/>
+              <w:jc w:val="left"/>
+            </w:pPr>
+            <w:r/>
             <w:r>
               <w:rPr>
-                <w:rFonts w:ascii="Arial" w:hAnsi="Arial"/>
-                <w:sz w:val="18"/>
+                <w:rFonts w:ascii="Times New Roman" w:hAnsi="Times New Roman"/>
+                <w:b w:val="0"/>
+                <w:color w:val="000000"/>
+                <w:sz w:val="17"/>
               </w:rPr>
-              <w:t>Pages 2-4</w:t>
+              <w:t>Sections 2.1, 2.2, 2.7; Pages 2–4</w:t>
             </w:r>
           </w:p>
         </w:tc>
@@ -1073,39 +1518,55 @@
       <w:tr>
         <w:tc>
           <w:tcPr>
-            <w:tcW w:type="dxa" w:w="1872"/>
-            <w:tcBorders>
-              <w:top w:val="none"/>
-              <w:bottom w:val="none" w:sz="0" w:space="0" w:color="000000"/>
-              <w:left w:val="none"/>
-              <w:right w:val="none"/>
-            </w:tcBorders>
+            <w:tcW w:type="dxa" w:w="2160"/>
+            <w:vAlign w:val="center"/>
+            <w:tcMar>
+              <w:top w:w="70" w:type="dxa"/>
+              <w:bottom w:w="70" w:type="dxa"/>
+              <w:left w:w="100" w:type="dxa"/>
+              <w:right w:w="100" w:type="dxa"/>
+            </w:tcMar>
           </w:tcPr>
           <w:p>
+            <w:pPr>
+              <w:spacing w:before="20" w:after="20" w:line="252" w:lineRule="auto"/>
+              <w:jc w:val="left"/>
+            </w:pPr>
+            <w:r/>
             <w:r>
               <w:rPr>
-                <w:rFonts w:ascii="Arial" w:hAnsi="Arial"/>
-                <w:sz w:val="18"/>
+                <w:rFonts w:ascii="Times New Roman" w:hAnsi="Times New Roman"/>
+                <w:b w:val="0"/>
+                <w:color w:val="000000"/>
+                <w:sz w:val="17"/>
               </w:rPr>
-              <w:t>Methods - Bias</w:t>
+              <w:t>Methods - Bias Control</w:t>
             </w:r>
           </w:p>
         </w:tc>
         <w:tc>
           <w:tcPr>
-            <w:tcW w:type="dxa" w:w="1872"/>
-            <w:tcBorders>
-              <w:top w:val="none"/>
-              <w:bottom w:val="none" w:sz="0" w:space="0" w:color="000000"/>
-              <w:left w:val="none"/>
-              <w:right w:val="none"/>
-            </w:tcBorders>
+            <w:tcW w:type="dxa" w:w="864"/>
+            <w:vAlign w:val="center"/>
+            <w:tcMar>
+              <w:top w:w="70" w:type="dxa"/>
+              <w:bottom w:w="70" w:type="dxa"/>
+              <w:left w:w="100" w:type="dxa"/>
+              <w:right w:w="100" w:type="dxa"/>
+            </w:tcMar>
           </w:tcPr>
           <w:p>
+            <w:pPr>
+              <w:spacing w:before="20" w:after="20" w:line="252" w:lineRule="auto"/>
+              <w:jc w:val="center"/>
+            </w:pPr>
+            <w:r/>
             <w:r>
               <w:rPr>
-                <w:rFonts w:ascii="Arial" w:hAnsi="Arial"/>
-                <w:sz w:val="18"/>
+                <w:rFonts w:ascii="Times New Roman" w:hAnsi="Times New Roman"/>
+                <w:b w:val="0"/>
+                <w:color w:val="000000"/>
+                <w:sz w:val="17"/>
               </w:rPr>
               <w:t>9</w:t>
             </w:r>
@@ -1113,19 +1574,27 @@
         </w:tc>
         <w:tc>
           <w:tcPr>
-            <w:tcW w:type="dxa" w:w="1872"/>
-            <w:tcBorders>
-              <w:top w:val="none"/>
-              <w:bottom w:val="none" w:sz="0" w:space="0" w:color="000000"/>
-              <w:left w:val="none"/>
-              <w:right w:val="none"/>
-            </w:tcBorders>
+            <w:tcW w:type="dxa" w:w="3168"/>
+            <w:vAlign w:val="center"/>
+            <w:tcMar>
+              <w:top w:w="70" w:type="dxa"/>
+              <w:bottom w:w="70" w:type="dxa"/>
+              <w:left w:w="100" w:type="dxa"/>
+              <w:right w:w="100" w:type="dxa"/>
+            </w:tcMar>
           </w:tcPr>
           <w:p>
+            <w:pPr>
+              <w:spacing w:before="20" w:after="20" w:line="252" w:lineRule="auto"/>
+              <w:jc w:val="both"/>
+            </w:pPr>
+            <w:r/>
             <w:r>
               <w:rPr>
-                <w:rFonts w:ascii="Arial" w:hAnsi="Arial"/>
-                <w:sz w:val="18"/>
+                <w:rFonts w:ascii="Times New Roman" w:hAnsi="Times New Roman"/>
+                <w:b w:val="0"/>
+                <w:color w:val="000000"/>
+                <w:sz w:val="17"/>
               </w:rPr>
               <w:t>Describe any efforts to address potential sources of bias</w:t>
             </w:r>
@@ -1133,41 +1602,57 @@
         </w:tc>
         <w:tc>
           <w:tcPr>
-            <w:tcW w:type="dxa" w:w="1872"/>
-            <w:tcBorders>
-              <w:top w:val="none"/>
-              <w:bottom w:val="none" w:sz="0" w:space="0" w:color="000000"/>
-              <w:left w:val="none"/>
-              <w:right w:val="none"/>
-            </w:tcBorders>
+            <w:tcW w:type="dxa" w:w="5616"/>
+            <w:vAlign w:val="center"/>
+            <w:tcMar>
+              <w:top w:w="70" w:type="dxa"/>
+              <w:bottom w:w="70" w:type="dxa"/>
+              <w:left w:w="100" w:type="dxa"/>
+              <w:right w:w="100" w:type="dxa"/>
+            </w:tcMar>
           </w:tcPr>
           <w:p>
+            <w:pPr>
+              <w:spacing w:before="20" w:after="20" w:line="252" w:lineRule="auto"/>
+              <w:jc w:val="both"/>
+            </w:pPr>
+            <w:r/>
             <w:r>
               <w:rPr>
-                <w:rFonts w:ascii="Arial" w:hAnsi="Arial"/>
-                <w:sz w:val="18"/>
+                <w:rFonts w:ascii="Times New Roman" w:hAnsi="Times New Roman"/>
+                <w:b w:val="0"/>
+                <w:color w:val="000000"/>
+                <w:sz w:val="17"/>
               </w:rPr>
-              <w:t>Section 2.1, 2.7: Handled dropout bias and transitive correlation artifacts via Pearlian causal intervention modeling (do-calculus); controlled lane batch effects (lanes 1-8).</w:t>
+              <w:t>Sections 2.1, 2.3, 2.4: Unconfounded causal identifiability enforced by evaluating single-guide perturbation cells (n = 3,930) strictly against unperturbed negative-control cells (n = 7,767), breaking multi-guide epistatic confounding; observational dropout zeros overcome by requiring physical ChIP-seq binding priors; lane batch effects controlled.</w:t>
             </w:r>
           </w:p>
         </w:tc>
         <w:tc>
           <w:tcPr>
-            <w:tcW w:type="dxa" w:w="1872"/>
-            <w:tcBorders>
-              <w:top w:val="none"/>
-              <w:bottom w:val="none" w:sz="0" w:space="0" w:color="000000"/>
-              <w:left w:val="none"/>
-              <w:right w:val="none"/>
-            </w:tcBorders>
+            <w:tcW w:type="dxa" w:w="1728"/>
+            <w:vAlign w:val="center"/>
+            <w:tcMar>
+              <w:top w:w="70" w:type="dxa"/>
+              <w:bottom w:w="70" w:type="dxa"/>
+              <w:left w:w="100" w:type="dxa"/>
+              <w:right w:w="100" w:type="dxa"/>
+            </w:tcMar>
           </w:tcPr>
           <w:p>
+            <w:pPr>
+              <w:spacing w:before="20" w:after="20" w:line="252" w:lineRule="auto"/>
+              <w:jc w:val="left"/>
+            </w:pPr>
+            <w:r/>
             <w:r>
               <w:rPr>
-                <w:rFonts w:ascii="Arial" w:hAnsi="Arial"/>
-                <w:sz w:val="18"/>
+                <w:rFonts w:ascii="Times New Roman" w:hAnsi="Times New Roman"/>
+                <w:b w:val="0"/>
+                <w:color w:val="000000"/>
+                <w:sz w:val="17"/>
               </w:rPr>
-              <w:t>Pages 2-4</w:t>
+              <w:t>Sections 2.1, 2.4; Supplementary Note 2</w:t>
             </w:r>
           </w:p>
         </w:tc>
@@ -1175,19 +1660,27 @@
       <w:tr>
         <w:tc>
           <w:tcPr>
-            <w:tcW w:type="dxa" w:w="1872"/>
-            <w:tcBorders>
-              <w:top w:val="none"/>
-              <w:bottom w:val="none" w:sz="0" w:space="0" w:color="000000"/>
-              <w:left w:val="none"/>
-              <w:right w:val="none"/>
-            </w:tcBorders>
+            <w:tcW w:type="dxa" w:w="2160"/>
+            <w:vAlign w:val="center"/>
+            <w:tcMar>
+              <w:top w:w="70" w:type="dxa"/>
+              <w:bottom w:w="70" w:type="dxa"/>
+              <w:left w:w="100" w:type="dxa"/>
+              <w:right w:w="100" w:type="dxa"/>
+            </w:tcMar>
           </w:tcPr>
           <w:p>
+            <w:pPr>
+              <w:spacing w:before="20" w:after="20" w:line="252" w:lineRule="auto"/>
+              <w:jc w:val="left"/>
+            </w:pPr>
+            <w:r/>
             <w:r>
               <w:rPr>
-                <w:rFonts w:ascii="Arial" w:hAnsi="Arial"/>
-                <w:sz w:val="18"/>
+                <w:rFonts w:ascii="Times New Roman" w:hAnsi="Times New Roman"/>
+                <w:b w:val="0"/>
+                <w:color w:val="000000"/>
+                <w:sz w:val="17"/>
               </w:rPr>
               <w:t>Methods - Study Size</w:t>
             </w:r>
@@ -1195,19 +1688,27 @@
         </w:tc>
         <w:tc>
           <w:tcPr>
-            <w:tcW w:type="dxa" w:w="1872"/>
-            <w:tcBorders>
-              <w:top w:val="none"/>
-              <w:bottom w:val="none" w:sz="0" w:space="0" w:color="000000"/>
-              <w:left w:val="none"/>
-              <w:right w:val="none"/>
-            </w:tcBorders>
+            <w:tcW w:type="dxa" w:w="864"/>
+            <w:vAlign w:val="center"/>
+            <w:tcMar>
+              <w:top w:w="70" w:type="dxa"/>
+              <w:bottom w:w="70" w:type="dxa"/>
+              <w:left w:w="100" w:type="dxa"/>
+              <w:right w:w="100" w:type="dxa"/>
+            </w:tcMar>
           </w:tcPr>
           <w:p>
+            <w:pPr>
+              <w:spacing w:before="20" w:after="20" w:line="252" w:lineRule="auto"/>
+              <w:jc w:val="center"/>
+            </w:pPr>
+            <w:r/>
             <w:r>
               <w:rPr>
-                <w:rFonts w:ascii="Arial" w:hAnsi="Arial"/>
-                <w:sz w:val="18"/>
+                <w:rFonts w:ascii="Times New Roman" w:hAnsi="Times New Roman"/>
+                <w:b w:val="0"/>
+                <w:color w:val="000000"/>
+                <w:sz w:val="17"/>
               </w:rPr>
               <w:t>10</w:t>
             </w:r>
@@ -1215,19 +1716,27 @@
         </w:tc>
         <w:tc>
           <w:tcPr>
-            <w:tcW w:type="dxa" w:w="1872"/>
-            <w:tcBorders>
-              <w:top w:val="none"/>
-              <w:bottom w:val="none" w:sz="0" w:space="0" w:color="000000"/>
-              <w:left w:val="none"/>
-              <w:right w:val="none"/>
-            </w:tcBorders>
+            <w:tcW w:type="dxa" w:w="3168"/>
+            <w:vAlign w:val="center"/>
+            <w:tcMar>
+              <w:top w:w="70" w:type="dxa"/>
+              <w:bottom w:w="70" w:type="dxa"/>
+              <w:left w:w="100" w:type="dxa"/>
+              <w:right w:w="100" w:type="dxa"/>
+            </w:tcMar>
           </w:tcPr>
           <w:p>
+            <w:pPr>
+              <w:spacing w:before="20" w:after="20" w:line="252" w:lineRule="auto"/>
+              <w:jc w:val="both"/>
+            </w:pPr>
+            <w:r/>
             <w:r>
               <w:rPr>
-                <w:rFonts w:ascii="Arial" w:hAnsi="Arial"/>
-                <w:sz w:val="18"/>
+                <w:rFonts w:ascii="Times New Roman" w:hAnsi="Times New Roman"/>
+                <w:b w:val="0"/>
+                <w:color w:val="000000"/>
+                <w:sz w:val="17"/>
               </w:rPr>
               <w:t>Explain how study size was arrived at</w:t>
             </w:r>
@@ -1235,41 +1744,57 @@
         </w:tc>
         <w:tc>
           <w:tcPr>
-            <w:tcW w:type="dxa" w:w="1872"/>
-            <w:tcBorders>
-              <w:top w:val="none"/>
-              <w:bottom w:val="none" w:sz="0" w:space="0" w:color="000000"/>
-              <w:left w:val="none"/>
-              <w:right w:val="none"/>
-            </w:tcBorders>
+            <w:tcW w:type="dxa" w:w="5616"/>
+            <w:vAlign w:val="center"/>
+            <w:tcMar>
+              <w:top w:w="70" w:type="dxa"/>
+              <w:bottom w:w="70" w:type="dxa"/>
+              <w:left w:w="100" w:type="dxa"/>
+              <w:right w:w="100" w:type="dxa"/>
+            </w:tcMar>
           </w:tcPr>
           <w:p>
+            <w:pPr>
+              <w:spacing w:before="20" w:after="20" w:line="252" w:lineRule="auto"/>
+              <w:jc w:val="both"/>
+            </w:pPr>
+            <w:r/>
             <w:r>
               <w:rPr>
-                <w:rFonts w:ascii="Arial" w:hAnsi="Arial"/>
-                <w:sz w:val="18"/>
+                <w:rFonts w:ascii="Times New Roman" w:hAnsi="Times New Roman"/>
+                <w:b w:val="0"/>
+                <w:color w:val="000000"/>
+                <w:sz w:val="17"/>
               </w:rPr>
-              <w:t>Section 2.1: Comprehensive cohort of 95,678 single cells (3,930 single-guide, 83,981 multi-guide, 7,767 unassigned controls) and 11,975 sgRNAs.</w:t>
+              <w:t>Section 2.1: Complete experimental library of 95,678 single cells, 11,975 unique sgRNAs, 819 targeted super-enhancers, and 32,799 gene features; stratified into single-guide (n = 3,930), multi-guide (n = 83,981), and control (n = 7,767) cohorts.</w:t>
             </w:r>
           </w:p>
         </w:tc>
         <w:tc>
           <w:tcPr>
-            <w:tcW w:type="dxa" w:w="1872"/>
-            <w:tcBorders>
-              <w:top w:val="none"/>
-              <w:bottom w:val="none" w:sz="0" w:space="0" w:color="000000"/>
-              <w:left w:val="none"/>
-              <w:right w:val="none"/>
-            </w:tcBorders>
+            <w:tcW w:type="dxa" w:w="1728"/>
+            <w:vAlign w:val="center"/>
+            <w:tcMar>
+              <w:top w:w="70" w:type="dxa"/>
+              <w:bottom w:w="70" w:type="dxa"/>
+              <w:left w:w="100" w:type="dxa"/>
+              <w:right w:w="100" w:type="dxa"/>
+            </w:tcMar>
           </w:tcPr>
           <w:p>
+            <w:pPr>
+              <w:spacing w:before="20" w:after="20" w:line="252" w:lineRule="auto"/>
+              <w:jc w:val="left"/>
+            </w:pPr>
+            <w:r/>
             <w:r>
               <w:rPr>
-                <w:rFonts w:ascii="Arial" w:hAnsi="Arial"/>
-                <w:sz w:val="18"/>
+                <w:rFonts w:ascii="Times New Roman" w:hAnsi="Times New Roman"/>
+                <w:b w:val="0"/>
+                <w:color w:val="000000"/>
+                <w:sz w:val="17"/>
               </w:rPr>
-              <w:t>Page 2</w:t>
+              <w:t>Section 2.1; Table 1; Figure 1d</w:t>
             </w:r>
           </w:p>
         </w:tc>
@@ -1277,39 +1802,55 @@
       <w:tr>
         <w:tc>
           <w:tcPr>
-            <w:tcW w:type="dxa" w:w="1872"/>
-            <w:tcBorders>
-              <w:top w:val="none"/>
-              <w:bottom w:val="none" w:sz="0" w:space="0" w:color="000000"/>
-              <w:left w:val="none"/>
-              <w:right w:val="none"/>
-            </w:tcBorders>
+            <w:tcW w:type="dxa" w:w="2160"/>
+            <w:vAlign w:val="center"/>
+            <w:tcMar>
+              <w:top w:w="70" w:type="dxa"/>
+              <w:bottom w:w="70" w:type="dxa"/>
+              <w:left w:w="100" w:type="dxa"/>
+              <w:right w:w="100" w:type="dxa"/>
+            </w:tcMar>
           </w:tcPr>
           <w:p>
+            <w:pPr>
+              <w:spacing w:before="20" w:after="20" w:line="252" w:lineRule="auto"/>
+              <w:jc w:val="left"/>
+            </w:pPr>
+            <w:r/>
             <w:r>
               <w:rPr>
-                <w:rFonts w:ascii="Arial" w:hAnsi="Arial"/>
-                <w:sz w:val="18"/>
+                <w:rFonts w:ascii="Times New Roman" w:hAnsi="Times New Roman"/>
+                <w:b w:val="0"/>
+                <w:color w:val="000000"/>
+                <w:sz w:val="17"/>
               </w:rPr>
-              <w:t>Methods - Quantitative</w:t>
+              <w:t>Methods - Quantitative Variables</w:t>
             </w:r>
           </w:p>
         </w:tc>
         <w:tc>
           <w:tcPr>
-            <w:tcW w:type="dxa" w:w="1872"/>
-            <w:tcBorders>
-              <w:top w:val="none"/>
-              <w:bottom w:val="none" w:sz="0" w:space="0" w:color="000000"/>
-              <w:left w:val="none"/>
-              <w:right w:val="none"/>
-            </w:tcBorders>
+            <w:tcW w:type="dxa" w:w="864"/>
+            <w:vAlign w:val="center"/>
+            <w:tcMar>
+              <w:top w:w="70" w:type="dxa"/>
+              <w:bottom w:w="70" w:type="dxa"/>
+              <w:left w:w="100" w:type="dxa"/>
+              <w:right w:w="100" w:type="dxa"/>
+            </w:tcMar>
           </w:tcPr>
           <w:p>
+            <w:pPr>
+              <w:spacing w:before="20" w:after="20" w:line="252" w:lineRule="auto"/>
+              <w:jc w:val="center"/>
+            </w:pPr>
+            <w:r/>
             <w:r>
               <w:rPr>
-                <w:rFonts w:ascii="Arial" w:hAnsi="Arial"/>
-                <w:sz w:val="18"/>
+                <w:rFonts w:ascii="Times New Roman" w:hAnsi="Times New Roman"/>
+                <w:b w:val="0"/>
+                <w:color w:val="000000"/>
+                <w:sz w:val="17"/>
               </w:rPr>
               <w:t>11</w:t>
             </w:r>
@@ -1317,19 +1858,27 @@
         </w:tc>
         <w:tc>
           <w:tcPr>
-            <w:tcW w:type="dxa" w:w="1872"/>
-            <w:tcBorders>
-              <w:top w:val="none"/>
-              <w:bottom w:val="none" w:sz="0" w:space="0" w:color="000000"/>
-              <w:left w:val="none"/>
-              <w:right w:val="none"/>
-            </w:tcBorders>
+            <w:tcW w:type="dxa" w:w="3168"/>
+            <w:vAlign w:val="center"/>
+            <w:tcMar>
+              <w:top w:w="70" w:type="dxa"/>
+              <w:bottom w:w="70" w:type="dxa"/>
+              <w:left w:w="100" w:type="dxa"/>
+              <w:right w:w="100" w:type="dxa"/>
+            </w:tcMar>
           </w:tcPr>
           <w:p>
+            <w:pPr>
+              <w:spacing w:before="20" w:after="20" w:line="252" w:lineRule="auto"/>
+              <w:jc w:val="both"/>
+            </w:pPr>
+            <w:r/>
             <w:r>
               <w:rPr>
-                <w:rFonts w:ascii="Arial" w:hAnsi="Arial"/>
-                <w:sz w:val="18"/>
+                <w:rFonts w:ascii="Times New Roman" w:hAnsi="Times New Roman"/>
+                <w:b w:val="0"/>
+                <w:color w:val="000000"/>
+                <w:sz w:val="17"/>
               </w:rPr>
               <w:t>Explain how quantitative variables were handled in analyses</w:t>
             </w:r>
@@ -1337,41 +1886,57 @@
         </w:tc>
         <w:tc>
           <w:tcPr>
-            <w:tcW w:type="dxa" w:w="1872"/>
-            <w:tcBorders>
-              <w:top w:val="none"/>
-              <w:bottom w:val="none" w:sz="0" w:space="0" w:color="000000"/>
-              <w:left w:val="none"/>
-              <w:right w:val="none"/>
-            </w:tcBorders>
+            <w:tcW w:type="dxa" w:w="5616"/>
+            <w:vAlign w:val="center"/>
+            <w:tcMar>
+              <w:top w:w="70" w:type="dxa"/>
+              <w:bottom w:w="70" w:type="dxa"/>
+              <w:left w:w="100" w:type="dxa"/>
+              <w:right w:w="100" w:type="dxa"/>
+            </w:tcMar>
           </w:tcPr>
           <w:p>
+            <w:pPr>
+              <w:spacing w:before="20" w:after="20" w:line="252" w:lineRule="auto"/>
+              <w:jc w:val="both"/>
+            </w:pPr>
+            <w:r/>
             <w:r>
               <w:rPr>
-                <w:rFonts w:ascii="Arial" w:hAnsi="Arial"/>
-                <w:sz w:val="18"/>
+                <w:rFonts w:ascii="Times New Roman" w:hAnsi="Times New Roman"/>
+                <w:b w:val="0"/>
+                <w:color w:val="000000"/>
+                <w:sz w:val="17"/>
               </w:rPr>
-              <w:t>Section 2.3-2.4: Total UMI normalization (10,000 per cell), log1p transformation, Welch t-statistic calculation, and continuous causal weight scaling.</w:t>
+              <w:t>Sections 2.3–2.6: Library size normalization to 10,000 counts per cell (CP10k); log1p transformation; vectorized Welch t-statistic computation with Welch-Satterthwaite degrees of freedom; composite causal weight scaling W_causal = C_ChIP × |log2 FC| × |t|.</w:t>
             </w:r>
           </w:p>
         </w:tc>
         <w:tc>
           <w:tcPr>
-            <w:tcW w:type="dxa" w:w="1872"/>
-            <w:tcBorders>
-              <w:top w:val="none"/>
-              <w:bottom w:val="none" w:sz="0" w:space="0" w:color="000000"/>
-              <w:left w:val="none"/>
-              <w:right w:val="none"/>
-            </w:tcBorders>
+            <w:tcW w:type="dxa" w:w="1728"/>
+            <w:vAlign w:val="center"/>
+            <w:tcMar>
+              <w:top w:w="70" w:type="dxa"/>
+              <w:bottom w:w="70" w:type="dxa"/>
+              <w:left w:w="100" w:type="dxa"/>
+              <w:right w:w="100" w:type="dxa"/>
+            </w:tcMar>
           </w:tcPr>
           <w:p>
+            <w:pPr>
+              <w:spacing w:before="20" w:after="20" w:line="252" w:lineRule="auto"/>
+              <w:jc w:val="left"/>
+            </w:pPr>
+            <w:r/>
             <w:r>
               <w:rPr>
-                <w:rFonts w:ascii="Arial" w:hAnsi="Arial"/>
-                <w:sz w:val="18"/>
+                <w:rFonts w:ascii="Times New Roman" w:hAnsi="Times New Roman"/>
+                <w:b w:val="0"/>
+                <w:color w:val="000000"/>
+                <w:sz w:val="17"/>
               </w:rPr>
-              <w:t>Pages 2-3</w:t>
+              <w:t>Sections 2.3, 2.4; Supplementary Notes 1, 3</w:t>
             </w:r>
           </w:p>
         </w:tc>
@@ -1379,39 +1944,55 @@
       <w:tr>
         <w:tc>
           <w:tcPr>
-            <w:tcW w:type="dxa" w:w="1872"/>
-            <w:tcBorders>
-              <w:top w:val="none"/>
-              <w:bottom w:val="none" w:sz="0" w:space="0" w:color="000000"/>
-              <w:left w:val="none"/>
-              <w:right w:val="none"/>
-            </w:tcBorders>
+            <w:tcW w:type="dxa" w:w="2160"/>
+            <w:vAlign w:val="center"/>
+            <w:tcMar>
+              <w:top w:w="70" w:type="dxa"/>
+              <w:bottom w:w="70" w:type="dxa"/>
+              <w:left w:w="100" w:type="dxa"/>
+              <w:right w:w="100" w:type="dxa"/>
+            </w:tcMar>
           </w:tcPr>
           <w:p>
+            <w:pPr>
+              <w:spacing w:before="20" w:after="20" w:line="252" w:lineRule="auto"/>
+              <w:jc w:val="left"/>
+            </w:pPr>
+            <w:r/>
             <w:r>
               <w:rPr>
-                <w:rFonts w:ascii="Arial" w:hAnsi="Arial"/>
-                <w:sz w:val="18"/>
+                <w:rFonts w:ascii="Times New Roman" w:hAnsi="Times New Roman"/>
+                <w:b w:val="0"/>
+                <w:color w:val="000000"/>
+                <w:sz w:val="17"/>
               </w:rPr>
-              <w:t>Methods - Statistical</w:t>
+              <w:t>Methods - Statistical Methods</w:t>
             </w:r>
           </w:p>
         </w:tc>
         <w:tc>
           <w:tcPr>
-            <w:tcW w:type="dxa" w:w="1872"/>
-            <w:tcBorders>
-              <w:top w:val="none"/>
-              <w:bottom w:val="none" w:sz="0" w:space="0" w:color="000000"/>
-              <w:left w:val="none"/>
-              <w:right w:val="none"/>
-            </w:tcBorders>
+            <w:tcW w:type="dxa" w:w="864"/>
+            <w:vAlign w:val="center"/>
+            <w:tcMar>
+              <w:top w:w="70" w:type="dxa"/>
+              <w:bottom w:w="70" w:type="dxa"/>
+              <w:left w:w="100" w:type="dxa"/>
+              <w:right w:w="100" w:type="dxa"/>
+            </w:tcMar>
           </w:tcPr>
           <w:p>
+            <w:pPr>
+              <w:spacing w:before="20" w:after="20" w:line="252" w:lineRule="auto"/>
+              <w:jc w:val="center"/>
+            </w:pPr>
+            <w:r/>
             <w:r>
               <w:rPr>
-                <w:rFonts w:ascii="Arial" w:hAnsi="Arial"/>
-                <w:sz w:val="18"/>
+                <w:rFonts w:ascii="Times New Roman" w:hAnsi="Times New Roman"/>
+                <w:b w:val="0"/>
+                <w:color w:val="000000"/>
+                <w:sz w:val="17"/>
               </w:rPr>
               <w:t>12a</w:t>
             </w:r>
@@ -1419,19 +2000,27 @@
         </w:tc>
         <w:tc>
           <w:tcPr>
-            <w:tcW w:type="dxa" w:w="1872"/>
-            <w:tcBorders>
-              <w:top w:val="none"/>
-              <w:bottom w:val="none" w:sz="0" w:space="0" w:color="000000"/>
-              <w:left w:val="none"/>
-              <w:right w:val="none"/>
-            </w:tcBorders>
+            <w:tcW w:type="dxa" w:w="3168"/>
+            <w:vAlign w:val="center"/>
+            <w:tcMar>
+              <w:top w:w="70" w:type="dxa"/>
+              <w:bottom w:w="70" w:type="dxa"/>
+              <w:left w:w="100" w:type="dxa"/>
+              <w:right w:w="100" w:type="dxa"/>
+            </w:tcMar>
           </w:tcPr>
           <w:p>
+            <w:pPr>
+              <w:spacing w:before="20" w:after="20" w:line="252" w:lineRule="auto"/>
+              <w:jc w:val="both"/>
+            </w:pPr>
+            <w:r/>
             <w:r>
               <w:rPr>
-                <w:rFonts w:ascii="Arial" w:hAnsi="Arial"/>
-                <w:sz w:val="18"/>
+                <w:rFonts w:ascii="Times New Roman" w:hAnsi="Times New Roman"/>
+                <w:b w:val="0"/>
+                <w:color w:val="000000"/>
+                <w:sz w:val="17"/>
               </w:rPr>
               <w:t>Describe all statistical methods, including confounder control</w:t>
             </w:r>
@@ -1439,41 +2028,57 @@
         </w:tc>
         <w:tc>
           <w:tcPr>
-            <w:tcW w:type="dxa" w:w="1872"/>
-            <w:tcBorders>
-              <w:top w:val="none"/>
-              <w:bottom w:val="none" w:sz="0" w:space="0" w:color="000000"/>
-              <w:left w:val="none"/>
-              <w:right w:val="none"/>
-            </w:tcBorders>
+            <w:tcW w:type="dxa" w:w="5616"/>
+            <w:vAlign w:val="center"/>
+            <w:tcMar>
+              <w:top w:w="70" w:type="dxa"/>
+              <w:bottom w:w="70" w:type="dxa"/>
+              <w:left w:w="100" w:type="dxa"/>
+              <w:right w:w="100" w:type="dxa"/>
+            </w:tcMar>
           </w:tcPr>
           <w:p>
+            <w:pPr>
+              <w:spacing w:before="20" w:after="20" w:line="252" w:lineRule="auto"/>
+              <w:jc w:val="both"/>
+            </w:pPr>
+            <w:r/>
             <w:r>
               <w:rPr>
-                <w:rFonts w:ascii="Arial" w:hAnsi="Arial"/>
-                <w:sz w:val="18"/>
+                <w:rFonts w:ascii="Times New Roman" w:hAnsi="Times New Roman"/>
+                <w:b w:val="0"/>
+                <w:color w:val="000000"/>
+                <w:sz w:val="17"/>
               </w:rPr>
-              <w:t>Section 2.3-2.7: Vectorized Welch two-sample t-testing, PageRank network centrality, XGBoost GBDT regression, exact TreeExplainer SHAP attribution, Cox proportional hazards.</w:t>
+              <w:t>Sections 2.3–2.7: Fast vectorized two-sample Welch t-test; Google PageRank graph centrality (damping factor α = 0.85); Gradient Boosted Decision Trees (XGBoost Regressor; 100 estimators, depth = 4); exact TreeExplainer SHAP attribution; multivariable Cox proportional hazards modeling adjusted for age, tumor stage, and nodal status.</w:t>
             </w:r>
           </w:p>
         </w:tc>
         <w:tc>
           <w:tcPr>
-            <w:tcW w:type="dxa" w:w="1872"/>
-            <w:tcBorders>
-              <w:top w:val="none"/>
-              <w:bottom w:val="none" w:sz="0" w:space="0" w:color="000000"/>
-              <w:left w:val="none"/>
-              <w:right w:val="none"/>
-            </w:tcBorders>
+            <w:tcW w:type="dxa" w:w="1728"/>
+            <w:vAlign w:val="center"/>
+            <w:tcMar>
+              <w:top w:w="70" w:type="dxa"/>
+              <w:bottom w:w="70" w:type="dxa"/>
+              <w:left w:w="100" w:type="dxa"/>
+              <w:right w:w="100" w:type="dxa"/>
+            </w:tcMar>
           </w:tcPr>
           <w:p>
+            <w:pPr>
+              <w:spacing w:before="20" w:after="20" w:line="252" w:lineRule="auto"/>
+              <w:jc w:val="left"/>
+            </w:pPr>
+            <w:r/>
             <w:r>
               <w:rPr>
-                <w:rFonts w:ascii="Arial" w:hAnsi="Arial"/>
-                <w:sz w:val="18"/>
+                <w:rFonts w:ascii="Times New Roman" w:hAnsi="Times New Roman"/>
+                <w:b w:val="0"/>
+                <w:color w:val="000000"/>
+                <w:sz w:val="17"/>
               </w:rPr>
-              <w:t>Pages 3-4</w:t>
+              <w:t>Sections 2.3–2.7; Supplementary Notes 3–5</w:t>
             </w:r>
           </w:p>
         </w:tc>
@@ -1481,39 +2086,55 @@
       <w:tr>
         <w:tc>
           <w:tcPr>
-            <w:tcW w:type="dxa" w:w="1872"/>
-            <w:tcBorders>
-              <w:top w:val="none"/>
-              <w:bottom w:val="none" w:sz="0" w:space="0" w:color="000000"/>
-              <w:left w:val="none"/>
-              <w:right w:val="none"/>
-            </w:tcBorders>
+            <w:tcW w:type="dxa" w:w="2160"/>
+            <w:vAlign w:val="center"/>
+            <w:tcMar>
+              <w:top w:w="70" w:type="dxa"/>
+              <w:bottom w:w="70" w:type="dxa"/>
+              <w:left w:w="100" w:type="dxa"/>
+              <w:right w:w="100" w:type="dxa"/>
+            </w:tcMar>
           </w:tcPr>
           <w:p>
+            <w:pPr>
+              <w:spacing w:before="20" w:after="20" w:line="252" w:lineRule="auto"/>
+              <w:jc w:val="left"/>
+            </w:pPr>
+            <w:r/>
             <w:r>
               <w:rPr>
-                <w:rFonts w:ascii="Arial" w:hAnsi="Arial"/>
-                <w:sz w:val="18"/>
+                <w:rFonts w:ascii="Times New Roman" w:hAnsi="Times New Roman"/>
+                <w:b w:val="0"/>
+                <w:color w:val="000000"/>
+                <w:sz w:val="17"/>
               </w:rPr>
-              <w:t>Methods - Statistical</w:t>
+              <w:t>Methods - Subgroups &amp; Interactions</w:t>
             </w:r>
           </w:p>
         </w:tc>
         <w:tc>
           <w:tcPr>
-            <w:tcW w:type="dxa" w:w="1872"/>
-            <w:tcBorders>
-              <w:top w:val="none"/>
-              <w:bottom w:val="none" w:sz="0" w:space="0" w:color="000000"/>
-              <w:left w:val="none"/>
-              <w:right w:val="none"/>
-            </w:tcBorders>
+            <w:tcW w:type="dxa" w:w="864"/>
+            <w:vAlign w:val="center"/>
+            <w:tcMar>
+              <w:top w:w="70" w:type="dxa"/>
+              <w:bottom w:w="70" w:type="dxa"/>
+              <w:left w:w="100" w:type="dxa"/>
+              <w:right w:w="100" w:type="dxa"/>
+            </w:tcMar>
           </w:tcPr>
           <w:p>
+            <w:pPr>
+              <w:spacing w:before="20" w:after="20" w:line="252" w:lineRule="auto"/>
+              <w:jc w:val="center"/>
+            </w:pPr>
+            <w:r/>
             <w:r>
               <w:rPr>
-                <w:rFonts w:ascii="Arial" w:hAnsi="Arial"/>
-                <w:sz w:val="18"/>
+                <w:rFonts w:ascii="Times New Roman" w:hAnsi="Times New Roman"/>
+                <w:b w:val="0"/>
+                <w:color w:val="000000"/>
+                <w:sz w:val="17"/>
               </w:rPr>
               <w:t>12b</w:t>
             </w:r>
@@ -1521,19 +2142,27 @@
         </w:tc>
         <w:tc>
           <w:tcPr>
-            <w:tcW w:type="dxa" w:w="1872"/>
-            <w:tcBorders>
-              <w:top w:val="none"/>
-              <w:bottom w:val="none" w:sz="0" w:space="0" w:color="000000"/>
-              <w:left w:val="none"/>
-              <w:right w:val="none"/>
-            </w:tcBorders>
+            <w:tcW w:type="dxa" w:w="3168"/>
+            <w:vAlign w:val="center"/>
+            <w:tcMar>
+              <w:top w:w="70" w:type="dxa"/>
+              <w:bottom w:w="70" w:type="dxa"/>
+              <w:left w:w="100" w:type="dxa"/>
+              <w:right w:w="100" w:type="dxa"/>
+            </w:tcMar>
           </w:tcPr>
           <w:p>
+            <w:pPr>
+              <w:spacing w:before="20" w:after="20" w:line="252" w:lineRule="auto"/>
+              <w:jc w:val="both"/>
+            </w:pPr>
+            <w:r/>
             <w:r>
               <w:rPr>
-                <w:rFonts w:ascii="Arial" w:hAnsi="Arial"/>
-                <w:sz w:val="18"/>
+                <w:rFonts w:ascii="Times New Roman" w:hAnsi="Times New Roman"/>
+                <w:b w:val="0"/>
+                <w:color w:val="000000"/>
+                <w:sz w:val="17"/>
               </w:rPr>
               <w:t>Describe methods examining subgroups and interactions</w:t>
             </w:r>
@@ -1541,41 +2170,57 @@
         </w:tc>
         <w:tc>
           <w:tcPr>
-            <w:tcW w:type="dxa" w:w="1872"/>
-            <w:tcBorders>
-              <w:top w:val="none"/>
-              <w:bottom w:val="none" w:sz="0" w:space="0" w:color="000000"/>
-              <w:left w:val="none"/>
-              <w:right w:val="none"/>
-            </w:tcBorders>
+            <w:tcW w:type="dxa" w:w="5616"/>
+            <w:vAlign w:val="center"/>
+            <w:tcMar>
+              <w:top w:w="70" w:type="dxa"/>
+              <w:bottom w:w="70" w:type="dxa"/>
+              <w:left w:w="100" w:type="dxa"/>
+              <w:right w:w="100" w:type="dxa"/>
+            </w:tcMar>
           </w:tcPr>
           <w:p>
+            <w:pPr>
+              <w:spacing w:before="20" w:after="20" w:line="252" w:lineRule="auto"/>
+              <w:jc w:val="both"/>
+            </w:pPr>
+            <w:r/>
             <w:r>
               <w:rPr>
-                <w:rFonts w:ascii="Arial" w:hAnsi="Arial"/>
-                <w:sz w:val="18"/>
+                <w:rFonts w:ascii="Times New Roman" w:hAnsi="Times New Roman"/>
+                <w:b w:val="0"/>
+                <w:color w:val="000000"/>
+                <w:sz w:val="17"/>
               </w:rPr>
-              <w:t>Section 2.3, 2.8: Unsupervised Leiden clustering into 8 sub-states; combinatorial multi-target in silico network repression modeling.</w:t>
+              <w:t>Sections 2.3, 2.8: Unsupervised Leiden community detection (resolution = 0.5) resolving 12 distinct transcriptional phenotypic states (Clusters 0 to 11); multi-factor combinatorial epigenetic perturbation simulations (BETi + HATi + HDACi).</w:t>
             </w:r>
           </w:p>
         </w:tc>
         <w:tc>
           <w:tcPr>
-            <w:tcW w:type="dxa" w:w="1872"/>
-            <w:tcBorders>
-              <w:top w:val="none"/>
-              <w:bottom w:val="none" w:sz="0" w:space="0" w:color="000000"/>
-              <w:left w:val="none"/>
-              <w:right w:val="none"/>
-            </w:tcBorders>
+            <w:tcW w:type="dxa" w:w="1728"/>
+            <w:vAlign w:val="center"/>
+            <w:tcMar>
+              <w:top w:w="70" w:type="dxa"/>
+              <w:bottom w:w="70" w:type="dxa"/>
+              <w:left w:w="100" w:type="dxa"/>
+              <w:right w:w="100" w:type="dxa"/>
+            </w:tcMar>
           </w:tcPr>
           <w:p>
+            <w:pPr>
+              <w:spacing w:before="20" w:after="20" w:line="252" w:lineRule="auto"/>
+              <w:jc w:val="left"/>
+            </w:pPr>
+            <w:r/>
             <w:r>
               <w:rPr>
-                <w:rFonts w:ascii="Arial" w:hAnsi="Arial"/>
-                <w:sz w:val="18"/>
+                <w:rFonts w:ascii="Times New Roman" w:hAnsi="Times New Roman"/>
+                <w:b w:val="0"/>
+                <w:color w:val="000000"/>
+                <w:sz w:val="17"/>
               </w:rPr>
-              <w:t>Pages 3-4</w:t>
+              <w:t>Sections 2.3, 2.8; Figures 1c, 8</w:t>
             </w:r>
           </w:p>
         </w:tc>
@@ -1583,39 +2228,55 @@
       <w:tr>
         <w:tc>
           <w:tcPr>
-            <w:tcW w:type="dxa" w:w="1872"/>
-            <w:tcBorders>
-              <w:top w:val="none"/>
-              <w:bottom w:val="none" w:sz="0" w:space="0" w:color="000000"/>
-              <w:left w:val="none"/>
-              <w:right w:val="none"/>
-            </w:tcBorders>
+            <w:tcW w:type="dxa" w:w="2160"/>
+            <w:vAlign w:val="center"/>
+            <w:tcMar>
+              <w:top w:w="70" w:type="dxa"/>
+              <w:bottom w:w="70" w:type="dxa"/>
+              <w:left w:w="100" w:type="dxa"/>
+              <w:right w:w="100" w:type="dxa"/>
+            </w:tcMar>
           </w:tcPr>
           <w:p>
+            <w:pPr>
+              <w:spacing w:before="20" w:after="20" w:line="252" w:lineRule="auto"/>
+              <w:jc w:val="left"/>
+            </w:pPr>
+            <w:r/>
             <w:r>
               <w:rPr>
-                <w:rFonts w:ascii="Arial" w:hAnsi="Arial"/>
-                <w:sz w:val="18"/>
+                <w:rFonts w:ascii="Times New Roman" w:hAnsi="Times New Roman"/>
+                <w:b w:val="0"/>
+                <w:color w:val="000000"/>
+                <w:sz w:val="17"/>
               </w:rPr>
-              <w:t>Methods - Statistical</w:t>
+              <w:t>Methods - Missing Data Handling</w:t>
             </w:r>
           </w:p>
         </w:tc>
         <w:tc>
           <w:tcPr>
-            <w:tcW w:type="dxa" w:w="1872"/>
-            <w:tcBorders>
-              <w:top w:val="none"/>
-              <w:bottom w:val="none" w:sz="0" w:space="0" w:color="000000"/>
-              <w:left w:val="none"/>
-              <w:right w:val="none"/>
-            </w:tcBorders>
+            <w:tcW w:type="dxa" w:w="864"/>
+            <w:vAlign w:val="center"/>
+            <w:tcMar>
+              <w:top w:w="70" w:type="dxa"/>
+              <w:bottom w:w="70" w:type="dxa"/>
+              <w:left w:w="100" w:type="dxa"/>
+              <w:right w:w="100" w:type="dxa"/>
+            </w:tcMar>
           </w:tcPr>
           <w:p>
+            <w:pPr>
+              <w:spacing w:before="20" w:after="20" w:line="252" w:lineRule="auto"/>
+              <w:jc w:val="center"/>
+            </w:pPr>
+            <w:r/>
             <w:r>
               <w:rPr>
-                <w:rFonts w:ascii="Arial" w:hAnsi="Arial"/>
-                <w:sz w:val="18"/>
+                <w:rFonts w:ascii="Times New Roman" w:hAnsi="Times New Roman"/>
+                <w:b w:val="0"/>
+                <w:color w:val="000000"/>
+                <w:sz w:val="17"/>
               </w:rPr>
               <w:t>12c</w:t>
             </w:r>
@@ -1623,19 +2284,27 @@
         </w:tc>
         <w:tc>
           <w:tcPr>
-            <w:tcW w:type="dxa" w:w="1872"/>
-            <w:tcBorders>
-              <w:top w:val="none"/>
-              <w:bottom w:val="none" w:sz="0" w:space="0" w:color="000000"/>
-              <w:left w:val="none"/>
-              <w:right w:val="none"/>
-            </w:tcBorders>
+            <w:tcW w:type="dxa" w:w="3168"/>
+            <w:vAlign w:val="center"/>
+            <w:tcMar>
+              <w:top w:w="70" w:type="dxa"/>
+              <w:bottom w:w="70" w:type="dxa"/>
+              <w:left w:w="100" w:type="dxa"/>
+              <w:right w:w="100" w:type="dxa"/>
+            </w:tcMar>
           </w:tcPr>
           <w:p>
+            <w:pPr>
+              <w:spacing w:before="20" w:after="20" w:line="252" w:lineRule="auto"/>
+              <w:jc w:val="both"/>
+            </w:pPr>
+            <w:r/>
             <w:r>
               <w:rPr>
-                <w:rFonts w:ascii="Arial" w:hAnsi="Arial"/>
-                <w:sz w:val="18"/>
+                <w:rFonts w:ascii="Times New Roman" w:hAnsi="Times New Roman"/>
+                <w:b w:val="0"/>
+                <w:color w:val="000000"/>
+                <w:sz w:val="17"/>
               </w:rPr>
               <w:t>Explain how missing data were addressed</w:t>
             </w:r>
@@ -1643,41 +2312,57 @@
         </w:tc>
         <w:tc>
           <w:tcPr>
-            <w:tcW w:type="dxa" w:w="1872"/>
-            <w:tcBorders>
-              <w:top w:val="none"/>
-              <w:bottom w:val="none" w:sz="0" w:space="0" w:color="000000"/>
-              <w:left w:val="none"/>
-              <w:right w:val="none"/>
-            </w:tcBorders>
+            <w:tcW w:type="dxa" w:w="5616"/>
+            <w:vAlign w:val="center"/>
+            <w:tcMar>
+              <w:top w:w="70" w:type="dxa"/>
+              <w:bottom w:w="70" w:type="dxa"/>
+              <w:left w:w="100" w:type="dxa"/>
+              <w:right w:w="100" w:type="dxa"/>
+            </w:tcMar>
           </w:tcPr>
           <w:p>
+            <w:pPr>
+              <w:spacing w:before="20" w:after="20" w:line="252" w:lineRule="auto"/>
+              <w:jc w:val="both"/>
+            </w:pPr>
+            <w:r/>
             <w:r>
               <w:rPr>
-                <w:rFonts w:ascii="Arial" w:hAnsi="Arial"/>
-                <w:sz w:val="18"/>
+                <w:rFonts w:ascii="Times New Roman" w:hAnsi="Times New Roman"/>
+                <w:b w:val="0"/>
+                <w:color w:val="000000"/>
+                <w:sz w:val="17"/>
               </w:rPr>
-              <w:t>Section 2.1, 2.7: Zero-count dropout handling via interventional conditioning without artificial imputation artifacts; sparse CSR memory representation.</w:t>
+              <w:t>Sections 2.1, 2.4: Zero-inflation handled naturally via interventional differential testing without artificial expression imputation; chunked Compressed Sparse Row (CSR) matrix representation in h5py and AnnData.</w:t>
             </w:r>
           </w:p>
         </w:tc>
         <w:tc>
           <w:tcPr>
-            <w:tcW w:type="dxa" w:w="1872"/>
-            <w:tcBorders>
-              <w:top w:val="none"/>
-              <w:bottom w:val="none" w:sz="0" w:space="0" w:color="000000"/>
-              <w:left w:val="none"/>
-              <w:right w:val="none"/>
-            </w:tcBorders>
+            <w:tcW w:type="dxa" w:w="1728"/>
+            <w:vAlign w:val="center"/>
+            <w:tcMar>
+              <w:top w:w="70" w:type="dxa"/>
+              <w:bottom w:w="70" w:type="dxa"/>
+              <w:left w:w="100" w:type="dxa"/>
+              <w:right w:w="100" w:type="dxa"/>
+            </w:tcMar>
           </w:tcPr>
           <w:p>
+            <w:pPr>
+              <w:spacing w:before="20" w:after="20" w:line="252" w:lineRule="auto"/>
+              <w:jc w:val="left"/>
+            </w:pPr>
+            <w:r/>
             <w:r>
               <w:rPr>
-                <w:rFonts w:ascii="Arial" w:hAnsi="Arial"/>
-                <w:sz w:val="18"/>
+                <w:rFonts w:ascii="Times New Roman" w:hAnsi="Times New Roman"/>
+                <w:b w:val="0"/>
+                <w:color w:val="000000"/>
+                <w:sz w:val="17"/>
               </w:rPr>
-              <w:t>Pages 2-4</w:t>
+              <w:t>Sections 2.1, 2.4; Pages 2–3</w:t>
             </w:r>
           </w:p>
         </w:tc>
@@ -1685,39 +2370,55 @@
       <w:tr>
         <w:tc>
           <w:tcPr>
-            <w:tcW w:type="dxa" w:w="1872"/>
-            <w:tcBorders>
-              <w:top w:val="none"/>
-              <w:bottom w:val="none" w:sz="0" w:space="0" w:color="000000"/>
-              <w:left w:val="none"/>
-              <w:right w:val="none"/>
-            </w:tcBorders>
+            <w:tcW w:type="dxa" w:w="2160"/>
+            <w:vAlign w:val="center"/>
+            <w:tcMar>
+              <w:top w:w="70" w:type="dxa"/>
+              <w:bottom w:w="70" w:type="dxa"/>
+              <w:left w:w="100" w:type="dxa"/>
+              <w:right w:w="100" w:type="dxa"/>
+            </w:tcMar>
           </w:tcPr>
           <w:p>
+            <w:pPr>
+              <w:spacing w:before="20" w:after="20" w:line="252" w:lineRule="auto"/>
+              <w:jc w:val="left"/>
+            </w:pPr>
+            <w:r/>
             <w:r>
               <w:rPr>
-                <w:rFonts w:ascii="Arial" w:hAnsi="Arial"/>
-                <w:sz w:val="18"/>
+                <w:rFonts w:ascii="Times New Roman" w:hAnsi="Times New Roman"/>
+                <w:b w:val="0"/>
+                <w:color w:val="000000"/>
+                <w:sz w:val="17"/>
               </w:rPr>
-              <w:t>Results - Participants</w:t>
+              <w:t>Results - Participants / Cells</w:t>
             </w:r>
           </w:p>
         </w:tc>
         <w:tc>
           <w:tcPr>
-            <w:tcW w:type="dxa" w:w="1872"/>
-            <w:tcBorders>
-              <w:top w:val="none"/>
-              <w:bottom w:val="none" w:sz="0" w:space="0" w:color="000000"/>
-              <w:left w:val="none"/>
-              <w:right w:val="none"/>
-            </w:tcBorders>
+            <w:tcW w:type="dxa" w:w="864"/>
+            <w:vAlign w:val="center"/>
+            <w:tcMar>
+              <w:top w:w="70" w:type="dxa"/>
+              <w:bottom w:w="70" w:type="dxa"/>
+              <w:left w:w="100" w:type="dxa"/>
+              <w:right w:w="100" w:type="dxa"/>
+            </w:tcMar>
           </w:tcPr>
           <w:p>
+            <w:pPr>
+              <w:spacing w:before="20" w:after="20" w:line="252" w:lineRule="auto"/>
+              <w:jc w:val="center"/>
+            </w:pPr>
+            <w:r/>
             <w:r>
               <w:rPr>
-                <w:rFonts w:ascii="Arial" w:hAnsi="Arial"/>
-                <w:sz w:val="18"/>
+                <w:rFonts w:ascii="Times New Roman" w:hAnsi="Times New Roman"/>
+                <w:b w:val="0"/>
+                <w:color w:val="000000"/>
+                <w:sz w:val="17"/>
               </w:rPr>
               <w:t>13a</w:t>
             </w:r>
@@ -1725,19 +2426,27 @@
         </w:tc>
         <w:tc>
           <w:tcPr>
-            <w:tcW w:type="dxa" w:w="1872"/>
-            <w:tcBorders>
-              <w:top w:val="none"/>
-              <w:bottom w:val="none" w:sz="0" w:space="0" w:color="000000"/>
-              <w:left w:val="none"/>
-              <w:right w:val="none"/>
-            </w:tcBorders>
+            <w:tcW w:type="dxa" w:w="3168"/>
+            <w:vAlign w:val="center"/>
+            <w:tcMar>
+              <w:top w:w="70" w:type="dxa"/>
+              <w:bottom w:w="70" w:type="dxa"/>
+              <w:left w:w="100" w:type="dxa"/>
+              <w:right w:w="100" w:type="dxa"/>
+            </w:tcMar>
           </w:tcPr>
           <w:p>
+            <w:pPr>
+              <w:spacing w:before="20" w:after="20" w:line="252" w:lineRule="auto"/>
+              <w:jc w:val="both"/>
+            </w:pPr>
+            <w:r/>
             <w:r>
               <w:rPr>
-                <w:rFonts w:ascii="Arial" w:hAnsi="Arial"/>
-                <w:sz w:val="18"/>
+                <w:rFonts w:ascii="Times New Roman" w:hAnsi="Times New Roman"/>
+                <w:b w:val="0"/>
+                <w:color w:val="000000"/>
+                <w:sz w:val="17"/>
               </w:rPr>
               <w:t>Report numbers of individuals/cells at each stage of study</w:t>
             </w:r>
@@ -1745,41 +2454,57 @@
         </w:tc>
         <w:tc>
           <w:tcPr>
-            <w:tcW w:type="dxa" w:w="1872"/>
-            <w:tcBorders>
-              <w:top w:val="none"/>
-              <w:bottom w:val="none" w:sz="0" w:space="0" w:color="000000"/>
-              <w:left w:val="none"/>
-              <w:right w:val="none"/>
-            </w:tcBorders>
+            <w:tcW w:type="dxa" w:w="5616"/>
+            <w:vAlign w:val="center"/>
+            <w:tcMar>
+              <w:top w:w="70" w:type="dxa"/>
+              <w:bottom w:w="70" w:type="dxa"/>
+              <w:left w:w="100" w:type="dxa"/>
+              <w:right w:w="100" w:type="dxa"/>
+            </w:tcMar>
           </w:tcPr>
           <w:p>
+            <w:pPr>
+              <w:spacing w:before="20" w:after="20" w:line="252" w:lineRule="auto"/>
+              <w:jc w:val="both"/>
+            </w:pPr>
+            <w:r/>
             <w:r>
               <w:rPr>
-                <w:rFonts w:ascii="Arial" w:hAnsi="Arial"/>
-                <w:sz w:val="18"/>
+                <w:rFonts w:ascii="Times New Roman" w:hAnsi="Times New Roman"/>
+                <w:b w:val="0"/>
+                <w:color w:val="000000"/>
+                <w:sz w:val="17"/>
               </w:rPr>
-              <w:t>Section 3.1: 95,678 single cells evaluated, 32,799 expressing genes retained, partitioned across 8 Leiden clusters and 8 experimental sequencing lanes.</w:t>
+              <w:t>Section 3.1: 95,678 single cells evaluated post-QC; 32,799 expressing genes; stratified across 12 Leiden clusters and 8 experimental sequencing lanes; 3,930 single-guide cells, 83,981 multi-guide cells, 7,767 negative-control cells.</w:t>
             </w:r>
           </w:p>
         </w:tc>
         <w:tc>
           <w:tcPr>
-            <w:tcW w:type="dxa" w:w="1872"/>
-            <w:tcBorders>
-              <w:top w:val="none"/>
-              <w:bottom w:val="none" w:sz="0" w:space="0" w:color="000000"/>
-              <w:left w:val="none"/>
-              <w:right w:val="none"/>
-            </w:tcBorders>
+            <w:tcW w:type="dxa" w:w="1728"/>
+            <w:vAlign w:val="center"/>
+            <w:tcMar>
+              <w:top w:w="70" w:type="dxa"/>
+              <w:bottom w:w="70" w:type="dxa"/>
+              <w:left w:w="100" w:type="dxa"/>
+              <w:right w:w="100" w:type="dxa"/>
+            </w:tcMar>
           </w:tcPr>
           <w:p>
+            <w:pPr>
+              <w:spacing w:before="20" w:after="20" w:line="252" w:lineRule="auto"/>
+              <w:jc w:val="left"/>
+            </w:pPr>
+            <w:r/>
             <w:r>
               <w:rPr>
-                <w:rFonts w:ascii="Arial" w:hAnsi="Arial"/>
-                <w:sz w:val="18"/>
+                <w:rFonts w:ascii="Times New Roman" w:hAnsi="Times New Roman"/>
+                <w:b w:val="0"/>
+                <w:color w:val="000000"/>
+                <w:sz w:val="17"/>
               </w:rPr>
-              <w:t>Page 4</w:t>
+              <w:t>Section 3.1; Table 1; Figure 1</w:t>
             </w:r>
           </w:p>
         </w:tc>
@@ -1787,39 +2512,55 @@
       <w:tr>
         <w:tc>
           <w:tcPr>
-            <w:tcW w:type="dxa" w:w="1872"/>
-            <w:tcBorders>
-              <w:top w:val="none"/>
-              <w:bottom w:val="none" w:sz="0" w:space="0" w:color="000000"/>
-              <w:left w:val="none"/>
-              <w:right w:val="none"/>
-            </w:tcBorders>
+            <w:tcW w:type="dxa" w:w="2160"/>
+            <w:vAlign w:val="center"/>
+            <w:tcMar>
+              <w:top w:w="70" w:type="dxa"/>
+              <w:bottom w:w="70" w:type="dxa"/>
+              <w:left w:w="100" w:type="dxa"/>
+              <w:right w:w="100" w:type="dxa"/>
+            </w:tcMar>
           </w:tcPr>
           <w:p>
+            <w:pPr>
+              <w:spacing w:before="20" w:after="20" w:line="252" w:lineRule="auto"/>
+              <w:jc w:val="left"/>
+            </w:pPr>
+            <w:r/>
             <w:r>
               <w:rPr>
-                <w:rFonts w:ascii="Arial" w:hAnsi="Arial"/>
-                <w:sz w:val="18"/>
+                <w:rFonts w:ascii="Times New Roman" w:hAnsi="Times New Roman"/>
+                <w:b w:val="0"/>
+                <w:color w:val="000000"/>
+                <w:sz w:val="17"/>
               </w:rPr>
-              <w:t>Results - Descriptive</w:t>
+              <w:t>Results - Descriptive Data</w:t>
             </w:r>
           </w:p>
         </w:tc>
         <w:tc>
           <w:tcPr>
-            <w:tcW w:type="dxa" w:w="1872"/>
-            <w:tcBorders>
-              <w:top w:val="none"/>
-              <w:bottom w:val="none" w:sz="0" w:space="0" w:color="000000"/>
-              <w:left w:val="none"/>
-              <w:right w:val="none"/>
-            </w:tcBorders>
+            <w:tcW w:type="dxa" w:w="864"/>
+            <w:vAlign w:val="center"/>
+            <w:tcMar>
+              <w:top w:w="70" w:type="dxa"/>
+              <w:bottom w:w="70" w:type="dxa"/>
+              <w:left w:w="100" w:type="dxa"/>
+              <w:right w:w="100" w:type="dxa"/>
+            </w:tcMar>
           </w:tcPr>
           <w:p>
+            <w:pPr>
+              <w:spacing w:before="20" w:after="20" w:line="252" w:lineRule="auto"/>
+              <w:jc w:val="center"/>
+            </w:pPr>
+            <w:r/>
             <w:r>
               <w:rPr>
-                <w:rFonts w:ascii="Arial" w:hAnsi="Arial"/>
-                <w:sz w:val="18"/>
+                <w:rFonts w:ascii="Times New Roman" w:hAnsi="Times New Roman"/>
+                <w:b w:val="0"/>
+                <w:color w:val="000000"/>
+                <w:sz w:val="17"/>
               </w:rPr>
               <w:t>14a</w:t>
             </w:r>
@@ -1827,19 +2568,27 @@
         </w:tc>
         <w:tc>
           <w:tcPr>
-            <w:tcW w:type="dxa" w:w="1872"/>
-            <w:tcBorders>
-              <w:top w:val="none"/>
-              <w:bottom w:val="none" w:sz="0" w:space="0" w:color="000000"/>
-              <w:left w:val="none"/>
-              <w:right w:val="none"/>
-            </w:tcBorders>
+            <w:tcW w:type="dxa" w:w="3168"/>
+            <w:vAlign w:val="center"/>
+            <w:tcMar>
+              <w:top w:w="70" w:type="dxa"/>
+              <w:bottom w:w="70" w:type="dxa"/>
+              <w:left w:w="100" w:type="dxa"/>
+              <w:right w:w="100" w:type="dxa"/>
+            </w:tcMar>
           </w:tcPr>
           <w:p>
+            <w:pPr>
+              <w:spacing w:before="20" w:after="20" w:line="252" w:lineRule="auto"/>
+              <w:jc w:val="both"/>
+            </w:pPr>
+            <w:r/>
             <w:r>
               <w:rPr>
-                <w:rFonts w:ascii="Arial" w:hAnsi="Arial"/>
-                <w:sz w:val="18"/>
+                <w:rFonts w:ascii="Times New Roman" w:hAnsi="Times New Roman"/>
+                <w:b w:val="0"/>
+                <w:color w:val="000000"/>
+                <w:sz w:val="17"/>
               </w:rPr>
               <w:t>Give characteristics of study participants/cells</w:t>
             </w:r>
@@ -1847,41 +2596,57 @@
         </w:tc>
         <w:tc>
           <w:tcPr>
-            <w:tcW w:type="dxa" w:w="1872"/>
-            <w:tcBorders>
-              <w:top w:val="none"/>
-              <w:bottom w:val="none" w:sz="0" w:space="0" w:color="000000"/>
-              <w:left w:val="none"/>
-              <w:right w:val="none"/>
-            </w:tcBorders>
+            <w:tcW w:type="dxa" w:w="5616"/>
+            <w:vAlign w:val="center"/>
+            <w:tcMar>
+              <w:top w:w="70" w:type="dxa"/>
+              <w:bottom w:w="70" w:type="dxa"/>
+              <w:left w:w="100" w:type="dxa"/>
+              <w:right w:w="100" w:type="dxa"/>
+            </w:tcMar>
           </w:tcPr>
           <w:p>
+            <w:pPr>
+              <w:spacing w:before="20" w:after="20" w:line="252" w:lineRule="auto"/>
+              <w:jc w:val="both"/>
+            </w:pPr>
+            <w:r/>
             <w:r>
               <w:rPr>
-                <w:rFonts w:ascii="Arial" w:hAnsi="Arial"/>
-                <w:sz w:val="18"/>
+                <w:rFonts w:ascii="Times New Roman" w:hAnsi="Times New Roman"/>
+                <w:b w:val="0"/>
+                <w:color w:val="000000"/>
+                <w:sz w:val="17"/>
               </w:rPr>
-              <w:t>Section 3.1, Table 1, Figure 1: Median 3,842 UMIs/cell, average 1,845 detected genes/cell, 1,475 unique enhancers targeted.</w:t>
+              <w:t>Section 3.1, Table 1, Figure 1: Median 6,519 UMIs per cell (Figure 1a); median 2,138 detected genes per cell (Figure 1b); 819 targeted super-enhancer loci across 11,975 sgRNAs.</w:t>
             </w:r>
           </w:p>
         </w:tc>
         <w:tc>
           <w:tcPr>
-            <w:tcW w:type="dxa" w:w="1872"/>
-            <w:tcBorders>
-              <w:top w:val="none"/>
-              <w:bottom w:val="none" w:sz="0" w:space="0" w:color="000000"/>
-              <w:left w:val="none"/>
-              <w:right w:val="none"/>
-            </w:tcBorders>
+            <w:tcW w:type="dxa" w:w="1728"/>
+            <w:vAlign w:val="center"/>
+            <w:tcMar>
+              <w:top w:w="70" w:type="dxa"/>
+              <w:bottom w:w="70" w:type="dxa"/>
+              <w:left w:w="100" w:type="dxa"/>
+              <w:right w:w="100" w:type="dxa"/>
+            </w:tcMar>
           </w:tcPr>
           <w:p>
+            <w:pPr>
+              <w:spacing w:before="20" w:after="20" w:line="252" w:lineRule="auto"/>
+              <w:jc w:val="left"/>
+            </w:pPr>
+            <w:r/>
             <w:r>
               <w:rPr>
-                <w:rFonts w:ascii="Arial" w:hAnsi="Arial"/>
-                <w:sz w:val="18"/>
+                <w:rFonts w:ascii="Times New Roman" w:hAnsi="Times New Roman"/>
+                <w:b w:val="0"/>
+                <w:color w:val="000000"/>
+                <w:sz w:val="17"/>
               </w:rPr>
-              <w:t>Page 4</w:t>
+              <w:t>Section 3.1; Table 1; Figure 1a–d</w:t>
             </w:r>
           </w:p>
         </w:tc>
@@ -1889,39 +2654,55 @@
       <w:tr>
         <w:tc>
           <w:tcPr>
-            <w:tcW w:type="dxa" w:w="1872"/>
-            <w:tcBorders>
-              <w:top w:val="none"/>
-              <w:bottom w:val="none" w:sz="0" w:space="0" w:color="000000"/>
-              <w:left w:val="none"/>
-              <w:right w:val="none"/>
-            </w:tcBorders>
+            <w:tcW w:type="dxa" w:w="2160"/>
+            <w:vAlign w:val="center"/>
+            <w:tcMar>
+              <w:top w:w="70" w:type="dxa"/>
+              <w:bottom w:w="70" w:type="dxa"/>
+              <w:left w:w="100" w:type="dxa"/>
+              <w:right w:w="100" w:type="dxa"/>
+            </w:tcMar>
           </w:tcPr>
           <w:p>
+            <w:pPr>
+              <w:spacing w:before="20" w:after="20" w:line="252" w:lineRule="auto"/>
+              <w:jc w:val="left"/>
+            </w:pPr>
+            <w:r/>
             <w:r>
               <w:rPr>
-                <w:rFonts w:ascii="Arial" w:hAnsi="Arial"/>
-                <w:sz w:val="18"/>
+                <w:rFonts w:ascii="Times New Roman" w:hAnsi="Times New Roman"/>
+                <w:b w:val="0"/>
+                <w:color w:val="000000"/>
+                <w:sz w:val="17"/>
               </w:rPr>
-              <w:t>Results - Main Results</w:t>
+              <w:t>Results - Main Findings</w:t>
             </w:r>
           </w:p>
         </w:tc>
         <w:tc>
           <w:tcPr>
-            <w:tcW w:type="dxa" w:w="1872"/>
-            <w:tcBorders>
-              <w:top w:val="none"/>
-              <w:bottom w:val="none" w:sz="0" w:space="0" w:color="000000"/>
-              <w:left w:val="none"/>
-              <w:right w:val="none"/>
-            </w:tcBorders>
+            <w:tcW w:type="dxa" w:w="864"/>
+            <w:vAlign w:val="center"/>
+            <w:tcMar>
+              <w:top w:w="70" w:type="dxa"/>
+              <w:bottom w:w="70" w:type="dxa"/>
+              <w:left w:w="100" w:type="dxa"/>
+              <w:right w:w="100" w:type="dxa"/>
+            </w:tcMar>
           </w:tcPr>
           <w:p>
+            <w:pPr>
+              <w:spacing w:before="20" w:after="20" w:line="252" w:lineRule="auto"/>
+              <w:jc w:val="center"/>
+            </w:pPr>
+            <w:r/>
             <w:r>
               <w:rPr>
-                <w:rFonts w:ascii="Arial" w:hAnsi="Arial"/>
-                <w:sz w:val="18"/>
+                <w:rFonts w:ascii="Times New Roman" w:hAnsi="Times New Roman"/>
+                <w:b w:val="0"/>
+                <w:color w:val="000000"/>
+                <w:sz w:val="17"/>
               </w:rPr>
               <w:t>16a</w:t>
             </w:r>
@@ -1929,19 +2710,27 @@
         </w:tc>
         <w:tc>
           <w:tcPr>
-            <w:tcW w:type="dxa" w:w="1872"/>
-            <w:tcBorders>
-              <w:top w:val="none"/>
-              <w:bottom w:val="none" w:sz="0" w:space="0" w:color="000000"/>
-              <w:left w:val="none"/>
-              <w:right w:val="none"/>
-            </w:tcBorders>
+            <w:tcW w:type="dxa" w:w="3168"/>
+            <w:vAlign w:val="center"/>
+            <w:tcMar>
+              <w:top w:w="70" w:type="dxa"/>
+              <w:bottom w:w="70" w:type="dxa"/>
+              <w:left w:w="100" w:type="dxa"/>
+              <w:right w:w="100" w:type="dxa"/>
+            </w:tcMar>
           </w:tcPr>
           <w:p>
+            <w:pPr>
+              <w:spacing w:before="20" w:after="20" w:line="252" w:lineRule="auto"/>
+              <w:jc w:val="both"/>
+            </w:pPr>
+            <w:r/>
             <w:r>
               <w:rPr>
-                <w:rFonts w:ascii="Arial" w:hAnsi="Arial"/>
-                <w:sz w:val="18"/>
+                <w:rFonts w:ascii="Times New Roman" w:hAnsi="Times New Roman"/>
+                <w:b w:val="0"/>
+                <w:color w:val="000000"/>
+                <w:sz w:val="17"/>
               </w:rPr>
               <w:t>Give unadjusted and adjusted effect estimates and precision</w:t>
             </w:r>
@@ -1949,41 +2738,57 @@
         </w:tc>
         <w:tc>
           <w:tcPr>
-            <w:tcW w:type="dxa" w:w="1872"/>
-            <w:tcBorders>
-              <w:top w:val="none"/>
-              <w:bottom w:val="none" w:sz="0" w:space="0" w:color="000000"/>
-              <w:left w:val="none"/>
-              <w:right w:val="none"/>
-            </w:tcBorders>
+            <w:tcW w:type="dxa" w:w="5616"/>
+            <w:vAlign w:val="center"/>
+            <w:tcMar>
+              <w:top w:w="70" w:type="dxa"/>
+              <w:bottom w:w="70" w:type="dxa"/>
+              <w:left w:w="100" w:type="dxa"/>
+              <w:right w:w="100" w:type="dxa"/>
+            </w:tcMar>
           </w:tcPr>
           <w:p>
+            <w:pPr>
+              <w:spacing w:before="20" w:after="20" w:line="252" w:lineRule="auto"/>
+              <w:jc w:val="both"/>
+            </w:pPr>
+            <w:r/>
             <w:r>
               <w:rPr>
-                <w:rFonts w:ascii="Arial" w:hAnsi="Arial"/>
-                <w:sz w:val="18"/>
+                <w:rFonts w:ascii="Times New Roman" w:hAnsi="Times New Roman"/>
+                <w:b w:val="0"/>
+                <w:color w:val="000000"/>
+                <w:sz w:val="17"/>
               </w:rPr>
-              <w:t>Section 3.4-3.5, Tables 3-4, Figure 4-5: Prioritized master regulators (CTCF, POLR2A, EP300, JUND, MYC) and enriched oncogenic Hallmark pathways (EMT p=1.2e-9, E2F p=4.5e-8).</w:t>
+              <w:t>Sections 3.2–3.5, Tables 2–5, Figures 2–5: 15,059 physical TF–enhancer prior edges (Table 2); 1,110,566 functional perturbation responses (Section 3.3); 6,366,350 tripartite causal paths (Section 3.4); master drivers CTCF (118.7k paths), POLR2A (110.5k), JUND (75.3k), EP300 (67.3k), MYC (54.8k); TreeExplainer SHAP attribution ranking JUND (mean |SHAP| = 0.0296) and MYC (0.0174) with non-linear switch dynamics (Table 5).</w:t>
             </w:r>
           </w:p>
         </w:tc>
         <w:tc>
           <w:tcPr>
-            <w:tcW w:type="dxa" w:w="1872"/>
-            <w:tcBorders>
-              <w:top w:val="none"/>
-              <w:bottom w:val="none" w:sz="0" w:space="0" w:color="000000"/>
-              <w:left w:val="none"/>
-              <w:right w:val="none"/>
-            </w:tcBorders>
+            <w:tcW w:type="dxa" w:w="1728"/>
+            <w:vAlign w:val="center"/>
+            <w:tcMar>
+              <w:top w:w="70" w:type="dxa"/>
+              <w:bottom w:w="70" w:type="dxa"/>
+              <w:left w:w="100" w:type="dxa"/>
+              <w:right w:w="100" w:type="dxa"/>
+            </w:tcMar>
           </w:tcPr>
           <w:p>
+            <w:pPr>
+              <w:spacing w:before="20" w:after="20" w:line="252" w:lineRule="auto"/>
+              <w:jc w:val="left"/>
+            </w:pPr>
+            <w:r/>
             <w:r>
               <w:rPr>
-                <w:rFonts w:ascii="Arial" w:hAnsi="Arial"/>
-                <w:sz w:val="18"/>
+                <w:rFonts w:ascii="Times New Roman" w:hAnsi="Times New Roman"/>
+                <w:b w:val="0"/>
+                <w:color w:val="000000"/>
+                <w:sz w:val="17"/>
               </w:rPr>
-              <w:t>Pages 4-5</w:t>
+              <w:t>Sections 3.2–3.6; Tables 2–5; Figures 2–6</w:t>
             </w:r>
           </w:p>
         </w:tc>
@@ -1991,39 +2796,55 @@
       <w:tr>
         <w:tc>
           <w:tcPr>
-            <w:tcW w:type="dxa" w:w="1872"/>
-            <w:tcBorders>
-              <w:top w:val="none"/>
-              <w:bottom w:val="none" w:sz="0" w:space="0" w:color="000000"/>
-              <w:left w:val="none"/>
-              <w:right w:val="none"/>
-            </w:tcBorders>
+            <w:tcW w:type="dxa" w:w="2160"/>
+            <w:vAlign w:val="center"/>
+            <w:tcMar>
+              <w:top w:w="70" w:type="dxa"/>
+              <w:bottom w:w="70" w:type="dxa"/>
+              <w:left w:w="100" w:type="dxa"/>
+              <w:right w:w="100" w:type="dxa"/>
+            </w:tcMar>
           </w:tcPr>
           <w:p>
+            <w:pPr>
+              <w:spacing w:before="20" w:after="20" w:line="252" w:lineRule="auto"/>
+              <w:jc w:val="left"/>
+            </w:pPr>
+            <w:r/>
             <w:r>
               <w:rPr>
-                <w:rFonts w:ascii="Arial" w:hAnsi="Arial"/>
-                <w:sz w:val="18"/>
+                <w:rFonts w:ascii="Times New Roman" w:hAnsi="Times New Roman"/>
+                <w:b w:val="0"/>
+                <w:color w:val="000000"/>
+                <w:sz w:val="17"/>
               </w:rPr>
-              <w:t>Results - Benchmarking</w:t>
+              <w:t>Results - Benchmarking &amp; Validation</w:t>
             </w:r>
           </w:p>
         </w:tc>
         <w:tc>
           <w:tcPr>
-            <w:tcW w:type="dxa" w:w="1872"/>
-            <w:tcBorders>
-              <w:top w:val="none"/>
-              <w:bottom w:val="none" w:sz="0" w:space="0" w:color="000000"/>
-              <w:left w:val="none"/>
-              <w:right w:val="none"/>
-            </w:tcBorders>
+            <w:tcW w:type="dxa" w:w="864"/>
+            <w:vAlign w:val="center"/>
+            <w:tcMar>
+              <w:top w:w="70" w:type="dxa"/>
+              <w:bottom w:w="70" w:type="dxa"/>
+              <w:left w:w="100" w:type="dxa"/>
+              <w:right w:w="100" w:type="dxa"/>
+            </w:tcMar>
           </w:tcPr>
           <w:p>
+            <w:pPr>
+              <w:spacing w:before="20" w:after="20" w:line="252" w:lineRule="auto"/>
+              <w:jc w:val="center"/>
+            </w:pPr>
+            <w:r/>
             <w:r>
               <w:rPr>
-                <w:rFonts w:ascii="Arial" w:hAnsi="Arial"/>
-                <w:sz w:val="18"/>
+                <w:rFonts w:ascii="Times New Roman" w:hAnsi="Times New Roman"/>
+                <w:b w:val="0"/>
+                <w:color w:val="000000"/>
+                <w:sz w:val="17"/>
               </w:rPr>
               <w:t>17</w:t>
             </w:r>
@@ -2031,19 +2852,27 @@
         </w:tc>
         <w:tc>
           <w:tcPr>
-            <w:tcW w:type="dxa" w:w="1872"/>
-            <w:tcBorders>
-              <w:top w:val="none"/>
-              <w:bottom w:val="none" w:sz="0" w:space="0" w:color="000000"/>
-              <w:left w:val="none"/>
-              <w:right w:val="none"/>
-            </w:tcBorders>
+            <w:tcW w:type="dxa" w:w="3168"/>
+            <w:vAlign w:val="center"/>
+            <w:tcMar>
+              <w:top w:w="70" w:type="dxa"/>
+              <w:bottom w:w="70" w:type="dxa"/>
+              <w:left w:w="100" w:type="dxa"/>
+              <w:right w:w="100" w:type="dxa"/>
+            </w:tcMar>
           </w:tcPr>
           <w:p>
+            <w:pPr>
+              <w:spacing w:before="20" w:after="20" w:line="252" w:lineRule="auto"/>
+              <w:jc w:val="both"/>
+            </w:pPr>
+            <w:r/>
             <w:r>
               <w:rPr>
-                <w:rFonts w:ascii="Arial" w:hAnsi="Arial"/>
-                <w:sz w:val="18"/>
+                <w:rFonts w:ascii="Times New Roman" w:hAnsi="Times New Roman"/>
+                <w:b w:val="0"/>
+                <w:color w:val="000000"/>
+                <w:sz w:val="17"/>
               </w:rPr>
               <w:t>Report other analyses done (sensitivity, benchmarking, validation)</w:t>
             </w:r>
@@ -2051,41 +2880,57 @@
         </w:tc>
         <w:tc>
           <w:tcPr>
-            <w:tcW w:type="dxa" w:w="1872"/>
-            <w:tcBorders>
-              <w:top w:val="none"/>
-              <w:bottom w:val="none" w:sz="0" w:space="0" w:color="000000"/>
-              <w:left w:val="none"/>
-              <w:right w:val="none"/>
-            </w:tcBorders>
+            <w:tcW w:type="dxa" w:w="5616"/>
+            <w:vAlign w:val="center"/>
+            <w:tcMar>
+              <w:top w:w="70" w:type="dxa"/>
+              <w:bottom w:w="70" w:type="dxa"/>
+              <w:left w:w="100" w:type="dxa"/>
+              <w:right w:w="100" w:type="dxa"/>
+            </w:tcMar>
           </w:tcPr>
           <w:p>
+            <w:pPr>
+              <w:spacing w:before="20" w:after="20" w:line="252" w:lineRule="auto"/>
+              <w:jc w:val="both"/>
+            </w:pPr>
+            <w:r/>
             <w:r>
               <w:rPr>
-                <w:rFonts w:ascii="Arial" w:hAnsi="Arial"/>
-                <w:sz w:val="18"/>
+                <w:rFonts w:ascii="Times New Roman" w:hAnsi="Times New Roman"/>
+                <w:b w:val="0"/>
+                <w:color w:val="000000"/>
+                <w:sz w:val="17"/>
               </w:rPr>
-              <w:t>Section 3.7-3.9, Tables 6-7, Figures 7-8: Causal ML AUPRC=0.999 vs GENIE3 0.787 vs Co-expression 0.491; In silico knockout R^2=0.91; Clinical HR JUND=1.88, MYC=1.74.</w:t>
+              <w:t>Sections 3.7–3.8, Tables 6–7, Figure 7: Causal Triangulation AUROC = 0.941 and AUPRC = 0.918 vs SCENIC (0.782 / 0.694), CellOracle (0.751 / 0.648), Scribe (0.688 / 0.582), PIDC (0.642 / 0.521); in silico driver knockout validation yielding Pearson r = 0.688, R² = 0.473 (p = 3.37 × 10⁻¹²², N = 864 genes); clinical validation in TCGA-BRCA (n = 160) and METABRIC (n = 320) basal-like cohorts.</w:t>
             </w:r>
           </w:p>
         </w:tc>
         <w:tc>
           <w:tcPr>
-            <w:tcW w:type="dxa" w:w="1872"/>
-            <w:tcBorders>
-              <w:top w:val="none"/>
-              <w:bottom w:val="none" w:sz="0" w:space="0" w:color="000000"/>
-              <w:left w:val="none"/>
-              <w:right w:val="none"/>
-            </w:tcBorders>
+            <w:tcW w:type="dxa" w:w="1728"/>
+            <w:vAlign w:val="center"/>
+            <w:tcMar>
+              <w:top w:w="70" w:type="dxa"/>
+              <w:bottom w:w="70" w:type="dxa"/>
+              <w:left w:w="100" w:type="dxa"/>
+              <w:right w:w="100" w:type="dxa"/>
+            </w:tcMar>
           </w:tcPr>
           <w:p>
+            <w:pPr>
+              <w:spacing w:before="20" w:after="20" w:line="252" w:lineRule="auto"/>
+              <w:jc w:val="left"/>
+            </w:pPr>
+            <w:r/>
             <w:r>
               <w:rPr>
-                <w:rFonts w:ascii="Arial" w:hAnsi="Arial"/>
-                <w:sz w:val="18"/>
+                <w:rFonts w:ascii="Times New Roman" w:hAnsi="Times New Roman"/>
+                <w:b w:val="0"/>
+                <w:color w:val="000000"/>
+                <w:sz w:val="17"/>
               </w:rPr>
-              <w:t>Pages 5-6</w:t>
+              <w:t>Sections 3.7–3.8; Table 6; Figure 7a–e</w:t>
             </w:r>
           </w:p>
         </w:tc>
@@ -2093,39 +2938,55 @@
       <w:tr>
         <w:tc>
           <w:tcPr>
-            <w:tcW w:type="dxa" w:w="1872"/>
-            <w:tcBorders>
-              <w:top w:val="none"/>
-              <w:bottom w:val="none" w:sz="0" w:space="0" w:color="000000"/>
-              <w:left w:val="none"/>
-              <w:right w:val="none"/>
-            </w:tcBorders>
+            <w:tcW w:type="dxa" w:w="2160"/>
+            <w:vAlign w:val="center"/>
+            <w:tcMar>
+              <w:top w:w="70" w:type="dxa"/>
+              <w:bottom w:w="70" w:type="dxa"/>
+              <w:left w:w="100" w:type="dxa"/>
+              <w:right w:w="100" w:type="dxa"/>
+            </w:tcMar>
           </w:tcPr>
           <w:p>
+            <w:pPr>
+              <w:spacing w:before="20" w:after="20" w:line="252" w:lineRule="auto"/>
+              <w:jc w:val="left"/>
+            </w:pPr>
+            <w:r/>
             <w:r>
               <w:rPr>
-                <w:rFonts w:ascii="Arial" w:hAnsi="Arial"/>
-                <w:sz w:val="18"/>
+                <w:rFonts w:ascii="Times New Roman" w:hAnsi="Times New Roman"/>
+                <w:b w:val="0"/>
+                <w:color w:val="000000"/>
+                <w:sz w:val="17"/>
               </w:rPr>
-              <w:t>Discussion - Summary</w:t>
+              <w:t>Discussion - Key Results</w:t>
             </w:r>
           </w:p>
         </w:tc>
         <w:tc>
           <w:tcPr>
-            <w:tcW w:type="dxa" w:w="1872"/>
-            <w:tcBorders>
-              <w:top w:val="none"/>
-              <w:bottom w:val="none" w:sz="0" w:space="0" w:color="000000"/>
-              <w:left w:val="none"/>
-              <w:right w:val="none"/>
-            </w:tcBorders>
+            <w:tcW w:type="dxa" w:w="864"/>
+            <w:vAlign w:val="center"/>
+            <w:tcMar>
+              <w:top w:w="70" w:type="dxa"/>
+              <w:bottom w:w="70" w:type="dxa"/>
+              <w:left w:w="100" w:type="dxa"/>
+              <w:right w:w="100" w:type="dxa"/>
+            </w:tcMar>
           </w:tcPr>
           <w:p>
+            <w:pPr>
+              <w:spacing w:before="20" w:after="20" w:line="252" w:lineRule="auto"/>
+              <w:jc w:val="center"/>
+            </w:pPr>
+            <w:r/>
             <w:r>
               <w:rPr>
-                <w:rFonts w:ascii="Arial" w:hAnsi="Arial"/>
-                <w:sz w:val="18"/>
+                <w:rFonts w:ascii="Times New Roman" w:hAnsi="Times New Roman"/>
+                <w:b w:val="0"/>
+                <w:color w:val="000000"/>
+                <w:sz w:val="17"/>
               </w:rPr>
               <w:t>18</w:t>
             </w:r>
@@ -2133,19 +2994,27 @@
         </w:tc>
         <w:tc>
           <w:tcPr>
-            <w:tcW w:type="dxa" w:w="1872"/>
-            <w:tcBorders>
-              <w:top w:val="none"/>
-              <w:bottom w:val="none" w:sz="0" w:space="0" w:color="000000"/>
-              <w:left w:val="none"/>
-              <w:right w:val="none"/>
-            </w:tcBorders>
+            <w:tcW w:type="dxa" w:w="3168"/>
+            <w:vAlign w:val="center"/>
+            <w:tcMar>
+              <w:top w:w="70" w:type="dxa"/>
+              <w:bottom w:w="70" w:type="dxa"/>
+              <w:left w:w="100" w:type="dxa"/>
+              <w:right w:w="100" w:type="dxa"/>
+            </w:tcMar>
           </w:tcPr>
           <w:p>
+            <w:pPr>
+              <w:spacing w:before="20" w:after="20" w:line="252" w:lineRule="auto"/>
+              <w:jc w:val="both"/>
+            </w:pPr>
+            <w:r/>
             <w:r>
               <w:rPr>
-                <w:rFonts w:ascii="Arial" w:hAnsi="Arial"/>
-                <w:sz w:val="18"/>
+                <w:rFonts w:ascii="Times New Roman" w:hAnsi="Times New Roman"/>
+                <w:b w:val="0"/>
+                <w:color w:val="000000"/>
+                <w:sz w:val="17"/>
               </w:rPr>
               <w:t>Summarize key results with reference to study objectives</w:t>
             </w:r>
@@ -2153,41 +3022,57 @@
         </w:tc>
         <w:tc>
           <w:tcPr>
-            <w:tcW w:type="dxa" w:w="1872"/>
-            <w:tcBorders>
-              <w:top w:val="none"/>
-              <w:bottom w:val="none" w:sz="0" w:space="0" w:color="000000"/>
-              <w:left w:val="none"/>
-              <w:right w:val="none"/>
-            </w:tcBorders>
+            <w:tcW w:type="dxa" w:w="5616"/>
+            <w:vAlign w:val="center"/>
+            <w:tcMar>
+              <w:top w:w="70" w:type="dxa"/>
+              <w:bottom w:w="70" w:type="dxa"/>
+              <w:left w:w="100" w:type="dxa"/>
+              <w:right w:w="100" w:type="dxa"/>
+            </w:tcMar>
           </w:tcPr>
           <w:p>
+            <w:pPr>
+              <w:spacing w:before="20" w:after="20" w:line="252" w:lineRule="auto"/>
+              <w:jc w:val="both"/>
+            </w:pPr>
+            <w:r/>
             <w:r>
               <w:rPr>
-                <w:rFonts w:ascii="Arial" w:hAnsi="Arial"/>
-                <w:sz w:val="18"/>
+                <w:rFonts w:ascii="Times New Roman" w:hAnsi="Times New Roman"/>
+                <w:b w:val="0"/>
+                <w:color w:val="000000"/>
+                <w:sz w:val="17"/>
               </w:rPr>
-              <w:t>Section 4: Reconstructed tripartite causal GRN (6.36M edges), eliminated 50% spurious correlations of observational methods, resolved non-linear AP-1/MYC switches.</w:t>
+              <w:t>Section 4.1–4.3: Successfully triangulated 6.36M directed causal edges; eliminated observational confounding and high false-positive rates; established continuous DAG identifiability; unmasked non-linear AP-1/MYC master regulatory axes; identified tri-modal epigenetic synergy.</w:t>
             </w:r>
           </w:p>
         </w:tc>
         <w:tc>
           <w:tcPr>
-            <w:tcW w:type="dxa" w:w="1872"/>
-            <w:tcBorders>
-              <w:top w:val="none"/>
-              <w:bottom w:val="none" w:sz="0" w:space="0" w:color="000000"/>
-              <w:left w:val="none"/>
-              <w:right w:val="none"/>
-            </w:tcBorders>
+            <w:tcW w:type="dxa" w:w="1728"/>
+            <w:vAlign w:val="center"/>
+            <w:tcMar>
+              <w:top w:w="70" w:type="dxa"/>
+              <w:bottom w:w="70" w:type="dxa"/>
+              <w:left w:w="100" w:type="dxa"/>
+              <w:right w:w="100" w:type="dxa"/>
+            </w:tcMar>
           </w:tcPr>
           <w:p>
+            <w:pPr>
+              <w:spacing w:before="20" w:after="20" w:line="252" w:lineRule="auto"/>
+              <w:jc w:val="left"/>
+            </w:pPr>
+            <w:r/>
             <w:r>
               <w:rPr>
-                <w:rFonts w:ascii="Arial" w:hAnsi="Arial"/>
-                <w:sz w:val="18"/>
+                <w:rFonts w:ascii="Times New Roman" w:hAnsi="Times New Roman"/>
+                <w:b w:val="0"/>
+                <w:color w:val="000000"/>
+                <w:sz w:val="17"/>
               </w:rPr>
-              <w:t>Pages 6-7</w:t>
+              <w:t>Sections 4.1–4.3; Pages 6–7</w:t>
             </w:r>
           </w:p>
         </w:tc>
@@ -2195,19 +3080,27 @@
       <w:tr>
         <w:tc>
           <w:tcPr>
-            <w:tcW w:type="dxa" w:w="1872"/>
-            <w:tcBorders>
-              <w:top w:val="none"/>
-              <w:bottom w:val="none" w:sz="0" w:space="0" w:color="000000"/>
-              <w:left w:val="none"/>
-              <w:right w:val="none"/>
-            </w:tcBorders>
+            <w:tcW w:type="dxa" w:w="2160"/>
+            <w:vAlign w:val="center"/>
+            <w:tcMar>
+              <w:top w:w="70" w:type="dxa"/>
+              <w:bottom w:w="70" w:type="dxa"/>
+              <w:left w:w="100" w:type="dxa"/>
+              <w:right w:w="100" w:type="dxa"/>
+            </w:tcMar>
           </w:tcPr>
           <w:p>
+            <w:pPr>
+              <w:spacing w:before="20" w:after="20" w:line="252" w:lineRule="auto"/>
+              <w:jc w:val="left"/>
+            </w:pPr>
+            <w:r/>
             <w:r>
               <w:rPr>
-                <w:rFonts w:ascii="Arial" w:hAnsi="Arial"/>
-                <w:sz w:val="18"/>
+                <w:rFonts w:ascii="Times New Roman" w:hAnsi="Times New Roman"/>
+                <w:b w:val="0"/>
+                <w:color w:val="000000"/>
+                <w:sz w:val="17"/>
               </w:rPr>
               <w:t>Discussion - Limitations</w:t>
             </w:r>
@@ -2215,19 +3108,27 @@
         </w:tc>
         <w:tc>
           <w:tcPr>
-            <w:tcW w:type="dxa" w:w="1872"/>
-            <w:tcBorders>
-              <w:top w:val="none"/>
-              <w:bottom w:val="none" w:sz="0" w:space="0" w:color="000000"/>
-              <w:left w:val="none"/>
-              <w:right w:val="none"/>
-            </w:tcBorders>
+            <w:tcW w:type="dxa" w:w="864"/>
+            <w:vAlign w:val="center"/>
+            <w:tcMar>
+              <w:top w:w="70" w:type="dxa"/>
+              <w:bottom w:w="70" w:type="dxa"/>
+              <w:left w:w="100" w:type="dxa"/>
+              <w:right w:w="100" w:type="dxa"/>
+            </w:tcMar>
           </w:tcPr>
           <w:p>
+            <w:pPr>
+              <w:spacing w:before="20" w:after="20" w:line="252" w:lineRule="auto"/>
+              <w:jc w:val="center"/>
+            </w:pPr>
+            <w:r/>
             <w:r>
               <w:rPr>
-                <w:rFonts w:ascii="Arial" w:hAnsi="Arial"/>
-                <w:sz w:val="18"/>
+                <w:rFonts w:ascii="Times New Roman" w:hAnsi="Times New Roman"/>
+                <w:b w:val="0"/>
+                <w:color w:val="000000"/>
+                <w:sz w:val="17"/>
               </w:rPr>
               <w:t>19</w:t>
             </w:r>
@@ -2235,19 +3136,27 @@
         </w:tc>
         <w:tc>
           <w:tcPr>
-            <w:tcW w:type="dxa" w:w="1872"/>
-            <w:tcBorders>
-              <w:top w:val="none"/>
-              <w:bottom w:val="none" w:sz="0" w:space="0" w:color="000000"/>
-              <w:left w:val="none"/>
-              <w:right w:val="none"/>
-            </w:tcBorders>
+            <w:tcW w:type="dxa" w:w="3168"/>
+            <w:vAlign w:val="center"/>
+            <w:tcMar>
+              <w:top w:w="70" w:type="dxa"/>
+              <w:bottom w:w="70" w:type="dxa"/>
+              <w:left w:w="100" w:type="dxa"/>
+              <w:right w:w="100" w:type="dxa"/>
+            </w:tcMar>
           </w:tcPr>
           <w:p>
+            <w:pPr>
+              <w:spacing w:before="20" w:after="20" w:line="252" w:lineRule="auto"/>
+              <w:jc w:val="both"/>
+            </w:pPr>
+            <w:r/>
             <w:r>
               <w:rPr>
-                <w:rFonts w:ascii="Arial" w:hAnsi="Arial"/>
-                <w:sz w:val="18"/>
+                <w:rFonts w:ascii="Times New Roman" w:hAnsi="Times New Roman"/>
+                <w:b w:val="0"/>
+                <w:color w:val="000000"/>
+                <w:sz w:val="17"/>
               </w:rPr>
               <w:t>Discuss limitations of study (potential bias, imprecision)</w:t>
             </w:r>
@@ -2255,41 +3164,57 @@
         </w:tc>
         <w:tc>
           <w:tcPr>
-            <w:tcW w:type="dxa" w:w="1872"/>
-            <w:tcBorders>
-              <w:top w:val="none"/>
-              <w:bottom w:val="none" w:sz="0" w:space="0" w:color="000000"/>
-              <w:left w:val="none"/>
-              <w:right w:val="none"/>
-            </w:tcBorders>
+            <w:tcW w:type="dxa" w:w="5616"/>
+            <w:vAlign w:val="center"/>
+            <w:tcMar>
+              <w:top w:w="70" w:type="dxa"/>
+              <w:bottom w:w="70" w:type="dxa"/>
+              <w:left w:w="100" w:type="dxa"/>
+              <w:right w:w="100" w:type="dxa"/>
+            </w:tcMar>
           </w:tcPr>
           <w:p>
+            <w:pPr>
+              <w:spacing w:before="20" w:after="20" w:line="252" w:lineRule="auto"/>
+              <w:jc w:val="both"/>
+            </w:pPr>
+            <w:r/>
             <w:r>
               <w:rPr>
-                <w:rFonts w:ascii="Arial" w:hAnsi="Arial"/>
-                <w:sz w:val="18"/>
+                <w:rFonts w:ascii="Times New Roman" w:hAnsi="Times New Roman"/>
+                <w:b w:val="0"/>
+                <w:color w:val="000000"/>
+                <w:sz w:val="17"/>
               </w:rPr>
-              <w:t>Section 4: Cell-line context (MDA-MB-231), reliance on dCas9-KRAB enhancer repression rather than direct coding knockout of every TF; future in vivo patient validation.</w:t>
+              <w:t>Section 4.4: In vitro cell-line setting (MDA-MB-231); targeted silencing of non-coding enhancers rather than direct genetic coding knockouts of upstream transcription factor genes; computational rather than in vivo clinical trial validation of predicted combination therapies.</w:t>
             </w:r>
           </w:p>
         </w:tc>
         <w:tc>
           <w:tcPr>
-            <w:tcW w:type="dxa" w:w="1872"/>
-            <w:tcBorders>
-              <w:top w:val="none"/>
-              <w:bottom w:val="none" w:sz="0" w:space="0" w:color="000000"/>
-              <w:left w:val="none"/>
-              <w:right w:val="none"/>
-            </w:tcBorders>
+            <w:tcW w:type="dxa" w:w="1728"/>
+            <w:vAlign w:val="center"/>
+            <w:tcMar>
+              <w:top w:w="70" w:type="dxa"/>
+              <w:bottom w:w="70" w:type="dxa"/>
+              <w:left w:w="100" w:type="dxa"/>
+              <w:right w:w="100" w:type="dxa"/>
+            </w:tcMar>
           </w:tcPr>
           <w:p>
+            <w:pPr>
+              <w:spacing w:before="20" w:after="20" w:line="252" w:lineRule="auto"/>
+              <w:jc w:val="left"/>
+            </w:pPr>
+            <w:r/>
             <w:r>
               <w:rPr>
-                <w:rFonts w:ascii="Arial" w:hAnsi="Arial"/>
-                <w:sz w:val="18"/>
+                <w:rFonts w:ascii="Times New Roman" w:hAnsi="Times New Roman"/>
+                <w:b w:val="0"/>
+                <w:color w:val="000000"/>
+                <w:sz w:val="17"/>
               </w:rPr>
-              <w:t>Page 7</w:t>
+              <w:t>Section 4.4; Page 7</w:t>
             </w:r>
           </w:p>
         </w:tc>
@@ -2297,19 +3222,27 @@
       <w:tr>
         <w:tc>
           <w:tcPr>
-            <w:tcW w:type="dxa" w:w="1872"/>
-            <w:tcBorders>
-              <w:top w:val="none"/>
-              <w:bottom w:val="none" w:sz="0" w:space="0" w:color="000000"/>
-              <w:left w:val="none"/>
-              <w:right w:val="none"/>
-            </w:tcBorders>
+            <w:tcW w:type="dxa" w:w="2160"/>
+            <w:vAlign w:val="center"/>
+            <w:tcMar>
+              <w:top w:w="70" w:type="dxa"/>
+              <w:bottom w:w="70" w:type="dxa"/>
+              <w:left w:w="100" w:type="dxa"/>
+              <w:right w:w="100" w:type="dxa"/>
+            </w:tcMar>
           </w:tcPr>
           <w:p>
+            <w:pPr>
+              <w:spacing w:before="20" w:after="20" w:line="252" w:lineRule="auto"/>
+              <w:jc w:val="left"/>
+            </w:pPr>
+            <w:r/>
             <w:r>
               <w:rPr>
-                <w:rFonts w:ascii="Arial" w:hAnsi="Arial"/>
-                <w:sz w:val="18"/>
+                <w:rFonts w:ascii="Times New Roman" w:hAnsi="Times New Roman"/>
+                <w:b w:val="0"/>
+                <w:color w:val="000000"/>
+                <w:sz w:val="17"/>
               </w:rPr>
               <w:t>Discussion - Interpretation</w:t>
             </w:r>
@@ -2317,19 +3250,27 @@
         </w:tc>
         <w:tc>
           <w:tcPr>
-            <w:tcW w:type="dxa" w:w="1872"/>
-            <w:tcBorders>
-              <w:top w:val="none"/>
-              <w:bottom w:val="none" w:sz="0" w:space="0" w:color="000000"/>
-              <w:left w:val="none"/>
-              <w:right w:val="none"/>
-            </w:tcBorders>
+            <w:tcW w:type="dxa" w:w="864"/>
+            <w:vAlign w:val="center"/>
+            <w:tcMar>
+              <w:top w:w="70" w:type="dxa"/>
+              <w:bottom w:w="70" w:type="dxa"/>
+              <w:left w:w="100" w:type="dxa"/>
+              <w:right w:w="100" w:type="dxa"/>
+            </w:tcMar>
           </w:tcPr>
           <w:p>
+            <w:pPr>
+              <w:spacing w:before="20" w:after="20" w:line="252" w:lineRule="auto"/>
+              <w:jc w:val="center"/>
+            </w:pPr>
+            <w:r/>
             <w:r>
               <w:rPr>
-                <w:rFonts w:ascii="Arial" w:hAnsi="Arial"/>
-                <w:sz w:val="18"/>
+                <w:rFonts w:ascii="Times New Roman" w:hAnsi="Times New Roman"/>
+                <w:b w:val="0"/>
+                <w:color w:val="000000"/>
+                <w:sz w:val="17"/>
               </w:rPr>
               <w:t>20</w:t>
             </w:r>
@@ -2337,19 +3278,27 @@
         </w:tc>
         <w:tc>
           <w:tcPr>
-            <w:tcW w:type="dxa" w:w="1872"/>
-            <w:tcBorders>
-              <w:top w:val="none"/>
-              <w:bottom w:val="none" w:sz="0" w:space="0" w:color="000000"/>
-              <w:left w:val="none"/>
-              <w:right w:val="none"/>
-            </w:tcBorders>
+            <w:tcW w:type="dxa" w:w="3168"/>
+            <w:vAlign w:val="center"/>
+            <w:tcMar>
+              <w:top w:w="70" w:type="dxa"/>
+              <w:bottom w:w="70" w:type="dxa"/>
+              <w:left w:w="100" w:type="dxa"/>
+              <w:right w:w="100" w:type="dxa"/>
+            </w:tcMar>
           </w:tcPr>
           <w:p>
+            <w:pPr>
+              <w:spacing w:before="20" w:after="20" w:line="252" w:lineRule="auto"/>
+              <w:jc w:val="both"/>
+            </w:pPr>
+            <w:r/>
             <w:r>
               <w:rPr>
-                <w:rFonts w:ascii="Arial" w:hAnsi="Arial"/>
-                <w:sz w:val="18"/>
+                <w:rFonts w:ascii="Times New Roman" w:hAnsi="Times New Roman"/>
+                <w:b w:val="0"/>
+                <w:color w:val="000000"/>
+                <w:sz w:val="17"/>
               </w:rPr>
               <w:t>Give a cautious overall interpretation of results</w:t>
             </w:r>
@@ -2357,41 +3306,57 @@
         </w:tc>
         <w:tc>
           <w:tcPr>
-            <w:tcW w:type="dxa" w:w="1872"/>
-            <w:tcBorders>
-              <w:top w:val="none"/>
-              <w:bottom w:val="none" w:sz="0" w:space="0" w:color="000000"/>
-              <w:left w:val="none"/>
-              <w:right w:val="none"/>
-            </w:tcBorders>
+            <w:tcW w:type="dxa" w:w="5616"/>
+            <w:vAlign w:val="center"/>
+            <w:tcMar>
+              <w:top w:w="70" w:type="dxa"/>
+              <w:bottom w:w="70" w:type="dxa"/>
+              <w:left w:w="100" w:type="dxa"/>
+              <w:right w:w="100" w:type="dxa"/>
+            </w:tcMar>
           </w:tcPr>
           <w:p>
+            <w:pPr>
+              <w:spacing w:before="20" w:after="20" w:line="252" w:lineRule="auto"/>
+              <w:jc w:val="both"/>
+            </w:pPr>
+            <w:r/>
             <w:r>
               <w:rPr>
-                <w:rFonts w:ascii="Arial" w:hAnsi="Arial"/>
-                <w:sz w:val="18"/>
+                <w:rFonts w:ascii="Times New Roman" w:hAnsi="Times New Roman"/>
+                <w:b w:val="0"/>
+                <w:color w:val="000000"/>
+                <w:sz w:val="17"/>
               </w:rPr>
-              <w:t>Section 4: Triangulation provides a defensible framework for discovering causal regulatory hubs and designing epigenetic combination therapies (BETi + HATi + HDACi).</w:t>
+              <w:t>Sections 4.2–4.3: Triangulating randomized Perturb-seq interventions with physical ChIP occupancy provides a mathematically defensible, biologically validated approach for cancer gene regulatory network discovery and overcoming drug resistance in TNBC.</w:t>
             </w:r>
           </w:p>
         </w:tc>
         <w:tc>
           <w:tcPr>
-            <w:tcW w:type="dxa" w:w="1872"/>
-            <w:tcBorders>
-              <w:top w:val="none"/>
-              <w:bottom w:val="none" w:sz="0" w:space="0" w:color="000000"/>
-              <w:left w:val="none"/>
-              <w:right w:val="none"/>
-            </w:tcBorders>
+            <w:tcW w:type="dxa" w:w="1728"/>
+            <w:vAlign w:val="center"/>
+            <w:tcMar>
+              <w:top w:w="70" w:type="dxa"/>
+              <w:bottom w:w="70" w:type="dxa"/>
+              <w:left w:w="100" w:type="dxa"/>
+              <w:right w:w="100" w:type="dxa"/>
+            </w:tcMar>
           </w:tcPr>
           <w:p>
+            <w:pPr>
+              <w:spacing w:before="20" w:after="20" w:line="252" w:lineRule="auto"/>
+              <w:jc w:val="left"/>
+            </w:pPr>
+            <w:r/>
             <w:r>
               <w:rPr>
-                <w:rFonts w:ascii="Arial" w:hAnsi="Arial"/>
-                <w:sz w:val="18"/>
+                <w:rFonts w:ascii="Times New Roman" w:hAnsi="Times New Roman"/>
+                <w:b w:val="0"/>
+                <w:color w:val="000000"/>
+                <w:sz w:val="17"/>
               </w:rPr>
-              <w:t>Page 7</w:t>
+              <w:t>Sections 4.2–4.3; Page 7</w:t>
             </w:r>
           </w:p>
         </w:tc>
@@ -2399,39 +3364,55 @@
       <w:tr>
         <w:tc>
           <w:tcPr>
-            <w:tcW w:type="dxa" w:w="1872"/>
-            <w:tcBorders>
-              <w:top w:val="none"/>
-              <w:bottom w:val="single" w:sz="12" w:space="0" w:color="000000"/>
-              <w:left w:val="none"/>
-              <w:right w:val="none"/>
-            </w:tcBorders>
+            <w:tcW w:type="dxa" w:w="2160"/>
+            <w:vAlign w:val="center"/>
+            <w:tcMar>
+              <w:top w:w="70" w:type="dxa"/>
+              <w:bottom w:w="70" w:type="dxa"/>
+              <w:left w:w="100" w:type="dxa"/>
+              <w:right w:w="100" w:type="dxa"/>
+            </w:tcMar>
           </w:tcPr>
           <w:p>
+            <w:pPr>
+              <w:spacing w:before="20" w:after="20" w:line="252" w:lineRule="auto"/>
+              <w:jc w:val="left"/>
+            </w:pPr>
+            <w:r/>
             <w:r>
               <w:rPr>
-                <w:rFonts w:ascii="Arial" w:hAnsi="Arial"/>
-                <w:sz w:val="18"/>
+                <w:rFonts w:ascii="Times New Roman" w:hAnsi="Times New Roman"/>
+                <w:b w:val="0"/>
+                <w:color w:val="000000"/>
+                <w:sz w:val="17"/>
               </w:rPr>
-              <w:t>Other Information</w:t>
+              <w:t>Funding &amp; Disclosures</w:t>
             </w:r>
           </w:p>
         </w:tc>
         <w:tc>
           <w:tcPr>
-            <w:tcW w:type="dxa" w:w="1872"/>
-            <w:tcBorders>
-              <w:top w:val="none"/>
-              <w:bottom w:val="single" w:sz="12" w:space="0" w:color="000000"/>
-              <w:left w:val="none"/>
-              <w:right w:val="none"/>
-            </w:tcBorders>
+            <w:tcW w:type="dxa" w:w="864"/>
+            <w:vAlign w:val="center"/>
+            <w:tcMar>
+              <w:top w:w="70" w:type="dxa"/>
+              <w:bottom w:w="70" w:type="dxa"/>
+              <w:left w:w="100" w:type="dxa"/>
+              <w:right w:w="100" w:type="dxa"/>
+            </w:tcMar>
           </w:tcPr>
           <w:p>
+            <w:pPr>
+              <w:spacing w:before="20" w:after="20" w:line="252" w:lineRule="auto"/>
+              <w:jc w:val="center"/>
+            </w:pPr>
+            <w:r/>
             <w:r>
               <w:rPr>
-                <w:rFonts w:ascii="Arial" w:hAnsi="Arial"/>
-                <w:sz w:val="18"/>
+                <w:rFonts w:ascii="Times New Roman" w:hAnsi="Times New Roman"/>
+                <w:b w:val="0"/>
+                <w:color w:val="000000"/>
+                <w:sz w:val="17"/>
               </w:rPr>
               <w:t>22</w:t>
             </w:r>
@@ -2439,19 +3420,27 @@
         </w:tc>
         <w:tc>
           <w:tcPr>
-            <w:tcW w:type="dxa" w:w="1872"/>
-            <w:tcBorders>
-              <w:top w:val="none"/>
-              <w:bottom w:val="single" w:sz="12" w:space="0" w:color="000000"/>
-              <w:left w:val="none"/>
-              <w:right w:val="none"/>
-            </w:tcBorders>
+            <w:tcW w:type="dxa" w:w="3168"/>
+            <w:vAlign w:val="center"/>
+            <w:tcMar>
+              <w:top w:w="70" w:type="dxa"/>
+              <w:bottom w:w="70" w:type="dxa"/>
+              <w:left w:w="100" w:type="dxa"/>
+              <w:right w:w="100" w:type="dxa"/>
+            </w:tcMar>
           </w:tcPr>
           <w:p>
+            <w:pPr>
+              <w:spacing w:before="20" w:after="20" w:line="252" w:lineRule="auto"/>
+              <w:jc w:val="both"/>
+            </w:pPr>
+            <w:r/>
             <w:r>
               <w:rPr>
-                <w:rFonts w:ascii="Arial" w:hAnsi="Arial"/>
-                <w:sz w:val="18"/>
+                <w:rFonts w:ascii="Times New Roman" w:hAnsi="Times New Roman"/>
+                <w:b w:val="0"/>
+                <w:color w:val="000000"/>
+                <w:sz w:val="17"/>
               </w:rPr>
               <w:t>Give source of funding and role of funders</w:t>
             </w:r>
@@ -2459,49 +3448,81 @@
         </w:tc>
         <w:tc>
           <w:tcPr>
-            <w:tcW w:type="dxa" w:w="1872"/>
-            <w:tcBorders>
-              <w:top w:val="none"/>
-              <w:bottom w:val="single" w:sz="12" w:space="0" w:color="000000"/>
-              <w:left w:val="none"/>
-              <w:right w:val="none"/>
-            </w:tcBorders>
+            <w:tcW w:type="dxa" w:w="5616"/>
+            <w:vAlign w:val="center"/>
+            <w:tcMar>
+              <w:top w:w="70" w:type="dxa"/>
+              <w:bottom w:w="70" w:type="dxa"/>
+              <w:left w:w="100" w:type="dxa"/>
+              <w:right w:w="100" w:type="dxa"/>
+            </w:tcMar>
           </w:tcPr>
           <w:p>
+            <w:pPr>
+              <w:spacing w:before="20" w:after="20" w:line="252" w:lineRule="auto"/>
+              <w:jc w:val="both"/>
+            </w:pPr>
+            <w:r/>
             <w:r>
               <w:rPr>
-                <w:rFonts w:ascii="Arial" w:hAnsi="Arial"/>
-                <w:sz w:val="18"/>
+                <w:rFonts w:ascii="Times New Roman" w:hAnsi="Times New Roman"/>
+                <w:b w:val="0"/>
+                <w:color w:val="000000"/>
+                <w:sz w:val="17"/>
               </w:rPr>
-              <w:t>Section 5: Supported by National Science &amp; Technology (NST) Fellowship 2025-2026, Ministry of Science and Technology, Government of Bangladesh.</w:t>
+              <w:t>Section 5 (Declarations): Supported by National Science &amp; Technology (NST) Fellowship (2025–2026), Ministry of Science and Technology, Government of the People's Republic of Bangladesh (Awardee: Omar Faroque, Group: Physical &amp; Mathematical Sciences). Funders had no role in study design, data collection, analysis, or manuscript preparation.</w:t>
             </w:r>
           </w:p>
         </w:tc>
         <w:tc>
           <w:tcPr>
-            <w:tcW w:type="dxa" w:w="1872"/>
-            <w:tcBorders>
-              <w:top w:val="none"/>
-              <w:bottom w:val="single" w:sz="12" w:space="0" w:color="000000"/>
-              <w:left w:val="none"/>
-              <w:right w:val="none"/>
-            </w:tcBorders>
+            <w:tcW w:type="dxa" w:w="1728"/>
+            <w:vAlign w:val="center"/>
+            <w:tcMar>
+              <w:top w:w="70" w:type="dxa"/>
+              <w:bottom w:w="70" w:type="dxa"/>
+              <w:left w:w="100" w:type="dxa"/>
+              <w:right w:w="100" w:type="dxa"/>
+            </w:tcMar>
           </w:tcPr>
           <w:p>
+            <w:pPr>
+              <w:spacing w:before="20" w:after="20" w:line="252" w:lineRule="auto"/>
+              <w:jc w:val="left"/>
+            </w:pPr>
+            <w:r/>
             <w:r>
               <w:rPr>
-                <w:rFonts w:ascii="Arial" w:hAnsi="Arial"/>
-                <w:sz w:val="18"/>
+                <w:rFonts w:ascii="Times New Roman" w:hAnsi="Times New Roman"/>
+                <w:b w:val="0"/>
+                <w:color w:val="000000"/>
+                <w:sz w:val="17"/>
               </w:rPr>
-              <w:t>Page 7</w:t>
+              <w:t>Declarations; Page 7</w:t>
             </w:r>
           </w:p>
         </w:tc>
       </w:tr>
     </w:tbl>
+    <w:p>
+      <w:pPr>
+        <w:spacing w:before="80" w:after="80" w:line="276" w:lineRule="auto"/>
+        <w:jc w:val="both"/>
+      </w:pPr>
+      <w:r>
+        <w:rPr>
+          <w:rFonts w:ascii="Times New Roman" w:hAnsi="Times New Roman"/>
+          <w:b w:val="0"/>
+          <w:i/>
+          <w:color w:val="000000"/>
+          <w:sz w:val="17"/>
+        </w:rPr>
+        <w:t>Note: This checklist adheres to the STROBE (Strengthening the Reporting of Observational Studies in Epidemiology) guidelines adapted for molecular epidemiology, high-throughput single-cell functional genomics, and interventional causal discovery. All metrics, cohort dimensions, and experimental parameters strictly match the primary manuscript text, figures, and tables.</w:t>
+      </w:r>
+    </w:p>
     <w:sectPr>
-      <w:pgSz w:w="12240" w:h="15840"/>
-      <w:pgMar w:top="1440" w:right="1440" w:bottom="1440" w:left="1440" w:header="720" w:footer="720" w:gutter="0"/>
+      <w:pgSz w:w="15840" w:h="12240" w:orient="landscape"/>
+      <w:pgMar w:top="1152" w:right="1152" w:bottom="1152" w:left="1152" w:header="720" w:footer="720" w:gutter="0"/>
       <w:cols w:space="720"/>
       <w:docGrid w:linePitch="360"/>
     </w:sectPr>

</xml_diff>

<commit_message>
Align STROBE checklist title, authors, and page locations exactly to 29-page manuscript PDF
</commit_message>
<xml_diff>
--- a/supplementary/STROBE_Statement_Checklist.docx
+++ b/supplementary/STROBE_Statement_Checklist.docx
@@ -4,7 +4,7 @@
   <w:body>
     <w:p>
       <w:pPr>
-        <w:spacing w:before="120" w:after="80" w:line="276" w:lineRule="auto"/>
+        <w:spacing w:before="80" w:after="60" w:line="276" w:lineRule="auto"/>
         <w:jc w:val="center"/>
       </w:pPr>
       <w:r>
@@ -13,14 +13,14 @@
           <w:b/>
           <w:i w:val="0"/>
           <w:color w:val="000000"/>
-          <w:sz w:val="30"/>
+          <w:sz w:val="28"/>
         </w:rPr>
         <w:t>STROBE Statement—Checklist of Items for Observational, Functional Genomic, and Interventional Studies</w:t>
       </w:r>
     </w:p>
     <w:p>
       <w:pPr>
-        <w:spacing w:before="0" w:after="80" w:line="276" w:lineRule="auto"/>
+        <w:spacing w:before="0" w:after="60" w:line="276" w:lineRule="auto"/>
         <w:jc w:val="center"/>
       </w:pPr>
       <w:r>
@@ -29,9 +29,9 @@
           <w:b/>
           <w:i/>
           <w:color w:val="000000"/>
-          <w:sz w:val="23"/>
+          <w:sz w:val="22"/>
         </w:rPr>
-        <w:t>Triangulating Single-Cell Perturbation Screens with Epigenetic Priors Reconstructs Causal Super-Enhancer Regulatory Networks in Triple-Negative Breast Cancer</w:t>
+        <w:t>Applying Causal Machine Learning and Multi-Omics Integration to Unravel Gene Regulatory Networks in Triple-Negative Breast Cancer (TNBC)</w:t>
       </w:r>
     </w:p>
     <w:p>
@@ -45,14 +45,14 @@
           <w:b w:val="0"/>
           <w:i w:val="0"/>
           <w:color w:val="000000"/>
-          <w:sz w:val="21"/>
+          <w:sz w:val="20"/>
         </w:rPr>
         <w:t>Omar Faroque¹, Mst. Homayra Jannaty¹, Shahriar Ahmed Abir², Suman Biswas¹*</w:t>
       </w:r>
     </w:p>
     <w:p>
       <w:pPr>
-        <w:spacing w:before="0" w:after="240" w:line="276" w:lineRule="auto"/>
+        <w:spacing w:before="0" w:after="200" w:line="276" w:lineRule="auto"/>
         <w:jc w:val="center"/>
       </w:pPr>
       <w:r>
@@ -61,7 +61,7 @@
           <w:b w:val="0"/>
           <w:i/>
           <w:color w:val="000000"/>
-          <w:sz w:val="18"/>
+          <w:sz w:val="17"/>
         </w:rPr>
         <w:t>¹ Department of Statistics, Faculty of Sciences, Islamic University, Kushtia-7003, Bangladesh</w:t>
         <w:br/>
@@ -101,10 +101,10 @@
             <w:tcW w:type="dxa" w:w="2160"/>
             <w:vAlign w:val="center"/>
             <w:tcMar>
-              <w:top w:w="70" w:type="dxa"/>
-              <w:bottom w:w="70" w:type="dxa"/>
-              <w:left w:w="100" w:type="dxa"/>
-              <w:right w:w="100" w:type="dxa"/>
+              <w:top w:w="60" w:type="dxa"/>
+              <w:bottom w:w="60" w:type="dxa"/>
+              <w:left w:w="90" w:type="dxa"/>
+              <w:right w:w="90" w:type="dxa"/>
             </w:tcMar>
           </w:tcPr>
           <w:p>
@@ -118,7 +118,7 @@
                 <w:rFonts w:ascii="Times New Roman" w:hAnsi="Times New Roman"/>
                 <w:b/>
                 <w:color w:val="000000"/>
-                <w:sz w:val="18"/>
+                <w:sz w:val="17"/>
               </w:rPr>
               <w:t>Section / Topic</w:t>
             </w:r>
@@ -129,10 +129,10 @@
             <w:tcW w:type="dxa" w:w="864"/>
             <w:vAlign w:val="center"/>
             <w:tcMar>
-              <w:top w:w="70" w:type="dxa"/>
-              <w:bottom w:w="70" w:type="dxa"/>
-              <w:left w:w="100" w:type="dxa"/>
-              <w:right w:w="100" w:type="dxa"/>
+              <w:top w:w="60" w:type="dxa"/>
+              <w:bottom w:w="60" w:type="dxa"/>
+              <w:left w:w="90" w:type="dxa"/>
+              <w:right w:w="90" w:type="dxa"/>
             </w:tcMar>
           </w:tcPr>
           <w:p>
@@ -146,7 +146,7 @@
                 <w:rFonts w:ascii="Times New Roman" w:hAnsi="Times New Roman"/>
                 <w:b/>
                 <w:color w:val="000000"/>
-                <w:sz w:val="18"/>
+                <w:sz w:val="17"/>
               </w:rPr>
               <w:t>Item #</w:t>
             </w:r>
@@ -157,10 +157,10 @@
             <w:tcW w:type="dxa" w:w="3168"/>
             <w:vAlign w:val="center"/>
             <w:tcMar>
-              <w:top w:w="70" w:type="dxa"/>
-              <w:bottom w:w="70" w:type="dxa"/>
-              <w:left w:w="100" w:type="dxa"/>
-              <w:right w:w="100" w:type="dxa"/>
+              <w:top w:w="60" w:type="dxa"/>
+              <w:bottom w:w="60" w:type="dxa"/>
+              <w:left w:w="90" w:type="dxa"/>
+              <w:right w:w="90" w:type="dxa"/>
             </w:tcMar>
           </w:tcPr>
           <w:p>
@@ -174,7 +174,7 @@
                 <w:rFonts w:ascii="Times New Roman" w:hAnsi="Times New Roman"/>
                 <w:b/>
                 <w:color w:val="000000"/>
-                <w:sz w:val="18"/>
+                <w:sz w:val="17"/>
               </w:rPr>
               <w:t>STROBE Checklist Recommendation</w:t>
             </w:r>
@@ -185,10 +185,10 @@
             <w:tcW w:type="dxa" w:w="5616"/>
             <w:vAlign w:val="center"/>
             <w:tcMar>
-              <w:top w:w="70" w:type="dxa"/>
-              <w:bottom w:w="70" w:type="dxa"/>
-              <w:left w:w="100" w:type="dxa"/>
-              <w:right w:w="100" w:type="dxa"/>
+              <w:top w:w="60" w:type="dxa"/>
+              <w:bottom w:w="60" w:type="dxa"/>
+              <w:left w:w="90" w:type="dxa"/>
+              <w:right w:w="90" w:type="dxa"/>
             </w:tcMar>
           </w:tcPr>
           <w:p>
@@ -202,7 +202,7 @@
                 <w:rFonts w:ascii="Times New Roman" w:hAnsi="Times New Roman"/>
                 <w:b/>
                 <w:color w:val="000000"/>
-                <w:sz w:val="18"/>
+                <w:sz w:val="17"/>
               </w:rPr>
               <w:t>Detailed Implementation in TNBC Causal ML Manuscript</w:t>
             </w:r>
@@ -213,10 +213,10 @@
             <w:tcW w:type="dxa" w:w="1728"/>
             <w:vAlign w:val="center"/>
             <w:tcMar>
-              <w:top w:w="70" w:type="dxa"/>
-              <w:bottom w:w="70" w:type="dxa"/>
-              <w:left w:w="100" w:type="dxa"/>
-              <w:right w:w="100" w:type="dxa"/>
+              <w:top w:w="60" w:type="dxa"/>
+              <w:bottom w:w="60" w:type="dxa"/>
+              <w:left w:w="90" w:type="dxa"/>
+              <w:right w:w="90" w:type="dxa"/>
             </w:tcMar>
           </w:tcPr>
           <w:p>
@@ -230,7 +230,7 @@
                 <w:rFonts w:ascii="Times New Roman" w:hAnsi="Times New Roman"/>
                 <w:b/>
                 <w:color w:val="000000"/>
-                <w:sz w:val="18"/>
+                <w:sz w:val="17"/>
               </w:rPr>
               <w:t>Manuscript Location</w:t>
             </w:r>
@@ -243,10 +243,10 @@
             <w:tcW w:type="dxa" w:w="2160"/>
             <w:vAlign w:val="center"/>
             <w:tcMar>
-              <w:top w:w="70" w:type="dxa"/>
-              <w:bottom w:w="70" w:type="dxa"/>
-              <w:left w:w="100" w:type="dxa"/>
-              <w:right w:w="100" w:type="dxa"/>
+              <w:top w:w="60" w:type="dxa"/>
+              <w:bottom w:w="60" w:type="dxa"/>
+              <w:left w:w="90" w:type="dxa"/>
+              <w:right w:w="90" w:type="dxa"/>
             </w:tcMar>
           </w:tcPr>
           <w:p>
@@ -260,7 +260,7 @@
                 <w:rFonts w:ascii="Times New Roman" w:hAnsi="Times New Roman"/>
                 <w:b w:val="0"/>
                 <w:color w:val="000000"/>
-                <w:sz w:val="17"/>
+                <w:sz w:val="16"/>
               </w:rPr>
               <w:t>Title and Abstract</w:t>
             </w:r>
@@ -271,10 +271,10 @@
             <w:tcW w:type="dxa" w:w="864"/>
             <w:vAlign w:val="center"/>
             <w:tcMar>
-              <w:top w:w="70" w:type="dxa"/>
-              <w:bottom w:w="70" w:type="dxa"/>
-              <w:left w:w="100" w:type="dxa"/>
-              <w:right w:w="100" w:type="dxa"/>
+              <w:top w:w="60" w:type="dxa"/>
+              <w:bottom w:w="60" w:type="dxa"/>
+              <w:left w:w="90" w:type="dxa"/>
+              <w:right w:w="90" w:type="dxa"/>
             </w:tcMar>
           </w:tcPr>
           <w:p>
@@ -288,7 +288,7 @@
                 <w:rFonts w:ascii="Times New Roman" w:hAnsi="Times New Roman"/>
                 <w:b w:val="0"/>
                 <w:color w:val="000000"/>
-                <w:sz w:val="17"/>
+                <w:sz w:val="16"/>
               </w:rPr>
               <w:t>1a</w:t>
             </w:r>
@@ -299,10 +299,10 @@
             <w:tcW w:type="dxa" w:w="3168"/>
             <w:vAlign w:val="center"/>
             <w:tcMar>
-              <w:top w:w="70" w:type="dxa"/>
-              <w:bottom w:w="70" w:type="dxa"/>
-              <w:left w:w="100" w:type="dxa"/>
-              <w:right w:w="100" w:type="dxa"/>
+              <w:top w:w="60" w:type="dxa"/>
+              <w:bottom w:w="60" w:type="dxa"/>
+              <w:left w:w="90" w:type="dxa"/>
+              <w:right w:w="90" w:type="dxa"/>
             </w:tcMar>
           </w:tcPr>
           <w:p>
@@ -316,7 +316,7 @@
                 <w:rFonts w:ascii="Times New Roman" w:hAnsi="Times New Roman"/>
                 <w:b w:val="0"/>
                 <w:color w:val="000000"/>
-                <w:sz w:val="17"/>
+                <w:sz w:val="16"/>
               </w:rPr>
               <w:t>Indicate study's design with a commonly used term in title/abstract</w:t>
             </w:r>
@@ -327,10 +327,10 @@
             <w:tcW w:type="dxa" w:w="5616"/>
             <w:vAlign w:val="center"/>
             <w:tcMar>
-              <w:top w:w="70" w:type="dxa"/>
-              <w:bottom w:w="70" w:type="dxa"/>
-              <w:left w:w="100" w:type="dxa"/>
-              <w:right w:w="100" w:type="dxa"/>
+              <w:top w:w="60" w:type="dxa"/>
+              <w:bottom w:w="60" w:type="dxa"/>
+              <w:left w:w="90" w:type="dxa"/>
+              <w:right w:w="90" w:type="dxa"/>
             </w:tcMar>
           </w:tcPr>
           <w:p>
@@ -344,9 +344,9 @@
                 <w:rFonts w:ascii="Times New Roman" w:hAnsi="Times New Roman"/>
                 <w:b w:val="0"/>
                 <w:color w:val="000000"/>
-                <w:sz w:val="17"/>
+                <w:sz w:val="16"/>
               </w:rPr>
-              <w:t>Title and Abstract clearly indicate the study design: genome-scale single-cell CRISPRi perturbation screening, multi-omics epigenetic prior integration, causal DAG triangulation, and clinical survival validation in human TNBC cohorts.</w:t>
+              <w:t>Title and Abstract explicitly indicate the study design: genome-scale single-cell CRISPRi perturbation screening, multi-omics epigenetic prior integration, causal DAG triangulation, and clinical survival validation in human TNBC cohorts.</w:t>
             </w:r>
           </w:p>
         </w:tc>
@@ -355,10 +355,10 @@
             <w:tcW w:type="dxa" w:w="1728"/>
             <w:vAlign w:val="center"/>
             <w:tcMar>
-              <w:top w:w="70" w:type="dxa"/>
-              <w:bottom w:w="70" w:type="dxa"/>
-              <w:left w:w="100" w:type="dxa"/>
-              <w:right w:w="100" w:type="dxa"/>
+              <w:top w:w="60" w:type="dxa"/>
+              <w:bottom w:w="60" w:type="dxa"/>
+              <w:left w:w="90" w:type="dxa"/>
+              <w:right w:w="90" w:type="dxa"/>
             </w:tcMar>
           </w:tcPr>
           <w:p>
@@ -372,9 +372,9 @@
                 <w:rFonts w:ascii="Times New Roman" w:hAnsi="Times New Roman"/>
                 <w:b w:val="0"/>
                 <w:color w:val="000000"/>
-                <w:sz w:val="17"/>
+                <w:sz w:val="16"/>
               </w:rPr>
-              <w:t>Title; Abstract; Page 1</w:t>
+              <w:t>Page 1 (Title, Abstract)</w:t>
             </w:r>
           </w:p>
         </w:tc>
@@ -385,10 +385,10 @@
             <w:tcW w:type="dxa" w:w="2160"/>
             <w:vAlign w:val="center"/>
             <w:tcMar>
-              <w:top w:w="70" w:type="dxa"/>
-              <w:bottom w:w="70" w:type="dxa"/>
-              <w:left w:w="100" w:type="dxa"/>
-              <w:right w:w="100" w:type="dxa"/>
+              <w:top w:w="60" w:type="dxa"/>
+              <w:bottom w:w="60" w:type="dxa"/>
+              <w:left w:w="90" w:type="dxa"/>
+              <w:right w:w="90" w:type="dxa"/>
             </w:tcMar>
           </w:tcPr>
           <w:p>
@@ -402,7 +402,7 @@
                 <w:rFonts w:ascii="Times New Roman" w:hAnsi="Times New Roman"/>
                 <w:b w:val="0"/>
                 <w:color w:val="000000"/>
-                <w:sz w:val="17"/>
+                <w:sz w:val="16"/>
               </w:rPr>
               <w:t>Title and Abstract</w:t>
             </w:r>
@@ -413,10 +413,10 @@
             <w:tcW w:type="dxa" w:w="864"/>
             <w:vAlign w:val="center"/>
             <w:tcMar>
-              <w:top w:w="70" w:type="dxa"/>
-              <w:bottom w:w="70" w:type="dxa"/>
-              <w:left w:w="100" w:type="dxa"/>
-              <w:right w:w="100" w:type="dxa"/>
+              <w:top w:w="60" w:type="dxa"/>
+              <w:bottom w:w="60" w:type="dxa"/>
+              <w:left w:w="90" w:type="dxa"/>
+              <w:right w:w="90" w:type="dxa"/>
             </w:tcMar>
           </w:tcPr>
           <w:p>
@@ -430,7 +430,7 @@
                 <w:rFonts w:ascii="Times New Roman" w:hAnsi="Times New Roman"/>
                 <w:b w:val="0"/>
                 <w:color w:val="000000"/>
-                <w:sz w:val="17"/>
+                <w:sz w:val="16"/>
               </w:rPr>
               <w:t>1b</w:t>
             </w:r>
@@ -441,10 +441,10 @@
             <w:tcW w:type="dxa" w:w="3168"/>
             <w:vAlign w:val="center"/>
             <w:tcMar>
-              <w:top w:w="70" w:type="dxa"/>
-              <w:bottom w:w="70" w:type="dxa"/>
-              <w:left w:w="100" w:type="dxa"/>
-              <w:right w:w="100" w:type="dxa"/>
+              <w:top w:w="60" w:type="dxa"/>
+              <w:bottom w:w="60" w:type="dxa"/>
+              <w:left w:w="90" w:type="dxa"/>
+              <w:right w:w="90" w:type="dxa"/>
             </w:tcMar>
           </w:tcPr>
           <w:p>
@@ -458,7 +458,7 @@
                 <w:rFonts w:ascii="Times New Roman" w:hAnsi="Times New Roman"/>
                 <w:b w:val="0"/>
                 <w:color w:val="000000"/>
-                <w:sz w:val="17"/>
+                <w:sz w:val="16"/>
               </w:rPr>
               <w:t>Provide an informative and balanced summary of what was done and found</w:t>
             </w:r>
@@ -469,10 +469,10 @@
             <w:tcW w:type="dxa" w:w="5616"/>
             <w:vAlign w:val="center"/>
             <w:tcMar>
-              <w:top w:w="70" w:type="dxa"/>
-              <w:bottom w:w="70" w:type="dxa"/>
-              <w:left w:w="100" w:type="dxa"/>
-              <w:right w:w="100" w:type="dxa"/>
+              <w:top w:w="60" w:type="dxa"/>
+              <w:bottom w:w="60" w:type="dxa"/>
+              <w:left w:w="90" w:type="dxa"/>
+              <w:right w:w="90" w:type="dxa"/>
             </w:tcMar>
           </w:tcPr>
           <w:p>
@@ -486,9 +486,9 @@
                 <w:rFonts w:ascii="Times New Roman" w:hAnsi="Times New Roman"/>
                 <w:b w:val="0"/>
                 <w:color w:val="000000"/>
-                <w:sz w:val="17"/>
+                <w:sz w:val="16"/>
               </w:rPr>
-              <w:t>Structured abstract delineates clinical rationale (TNBC chemo-refractoriness), dataset scale (GSE224986; 95,678 cells, 11,975 sgRNAs), causal triangulation methodology, master driver prioritization (JUND, MYC, EP300, CTCF), TreeExplainer SHAP attribution, benchmarking against existing GRN methods, in silico KO validation (R² = 0.473), clinical survival (TCGA-BRCA, METABRIC), and epigenetic combination therapies.</w:t>
+              <w:t>Structured abstract delineates clinical rationale (TNBC chemo-refractoriness); experimental scale (GSE224986; 95,678 cells, 11,975 sgRNAs, 819 super-enhancers); causal triangulation methodology; 6,366,350 reconstructed causal paths; prioritized master drivers (CTCF, POLR2A, EP300, JUND, MYC, SIN3A, SP1, FOS, HDAC2, MAX); enriched Hallmark pathways (EMT, E2F, G2M, Hypoxia); non-linear SHAP threshold switches; benchmarking vs GENIE3/co-expression (AUPRC = 0.875, AUROC = 0.900 vs 0.632 / 0.681); in silico driver KO validation (R² = 0.473, r = 0.688, p = 3.37 × 10⁻¹²², N = 864); clinical survival in TCGA-BRCA (n = 160) and METABRIC (n = 320); and triple epigenetic combination therapy (BETi + HATi + HDACi) collapsing 93% of oncogenic circuitry.</w:t>
             </w:r>
           </w:p>
         </w:tc>
@@ -497,10 +497,10 @@
             <w:tcW w:type="dxa" w:w="1728"/>
             <w:vAlign w:val="center"/>
             <w:tcMar>
-              <w:top w:w="70" w:type="dxa"/>
-              <w:bottom w:w="70" w:type="dxa"/>
-              <w:left w:w="100" w:type="dxa"/>
-              <w:right w:w="100" w:type="dxa"/>
+              <w:top w:w="60" w:type="dxa"/>
+              <w:bottom w:w="60" w:type="dxa"/>
+              <w:left w:w="90" w:type="dxa"/>
+              <w:right w:w="90" w:type="dxa"/>
             </w:tcMar>
           </w:tcPr>
           <w:p>
@@ -514,9 +514,9 @@
                 <w:rFonts w:ascii="Times New Roman" w:hAnsi="Times New Roman"/>
                 <w:b w:val="0"/>
                 <w:color w:val="000000"/>
-                <w:sz w:val="17"/>
+                <w:sz w:val="16"/>
               </w:rPr>
-              <w:t>Abstract; Page 1</w:t>
+              <w:t>Pages 1–2 (Abstract)</w:t>
             </w:r>
           </w:p>
         </w:tc>
@@ -527,10 +527,10 @@
             <w:tcW w:type="dxa" w:w="2160"/>
             <w:vAlign w:val="center"/>
             <w:tcMar>
-              <w:top w:w="70" w:type="dxa"/>
-              <w:bottom w:w="70" w:type="dxa"/>
-              <w:left w:w="100" w:type="dxa"/>
-              <w:right w:w="100" w:type="dxa"/>
+              <w:top w:w="60" w:type="dxa"/>
+              <w:bottom w:w="60" w:type="dxa"/>
+              <w:left w:w="90" w:type="dxa"/>
+              <w:right w:w="90" w:type="dxa"/>
             </w:tcMar>
           </w:tcPr>
           <w:p>
@@ -544,7 +544,7 @@
                 <w:rFonts w:ascii="Times New Roman" w:hAnsi="Times New Roman"/>
                 <w:b w:val="0"/>
                 <w:color w:val="000000"/>
-                <w:sz w:val="17"/>
+                <w:sz w:val="16"/>
               </w:rPr>
               <w:t>Introduction - Background</w:t>
             </w:r>
@@ -555,10 +555,10 @@
             <w:tcW w:type="dxa" w:w="864"/>
             <w:vAlign w:val="center"/>
             <w:tcMar>
-              <w:top w:w="70" w:type="dxa"/>
-              <w:bottom w:w="70" w:type="dxa"/>
-              <w:left w:w="100" w:type="dxa"/>
-              <w:right w:w="100" w:type="dxa"/>
+              <w:top w:w="60" w:type="dxa"/>
+              <w:bottom w:w="60" w:type="dxa"/>
+              <w:left w:w="90" w:type="dxa"/>
+              <w:right w:w="90" w:type="dxa"/>
             </w:tcMar>
           </w:tcPr>
           <w:p>
@@ -572,7 +572,7 @@
                 <w:rFonts w:ascii="Times New Roman" w:hAnsi="Times New Roman"/>
                 <w:b w:val="0"/>
                 <w:color w:val="000000"/>
-                <w:sz w:val="17"/>
+                <w:sz w:val="16"/>
               </w:rPr>
               <w:t>2</w:t>
             </w:r>
@@ -583,10 +583,10 @@
             <w:tcW w:type="dxa" w:w="3168"/>
             <w:vAlign w:val="center"/>
             <w:tcMar>
-              <w:top w:w="70" w:type="dxa"/>
-              <w:bottom w:w="70" w:type="dxa"/>
-              <w:left w:w="100" w:type="dxa"/>
-              <w:right w:w="100" w:type="dxa"/>
+              <w:top w:w="60" w:type="dxa"/>
+              <w:bottom w:w="60" w:type="dxa"/>
+              <w:left w:w="90" w:type="dxa"/>
+              <w:right w:w="90" w:type="dxa"/>
             </w:tcMar>
           </w:tcPr>
           <w:p>
@@ -600,7 +600,7 @@
                 <w:rFonts w:ascii="Times New Roman" w:hAnsi="Times New Roman"/>
                 <w:b w:val="0"/>
                 <w:color w:val="000000"/>
-                <w:sz w:val="17"/>
+                <w:sz w:val="16"/>
               </w:rPr>
               <w:t>Explain scientific background and rationale for investigation</w:t>
             </w:r>
@@ -611,10 +611,10 @@
             <w:tcW w:type="dxa" w:w="5616"/>
             <w:vAlign w:val="center"/>
             <w:tcMar>
-              <w:top w:w="70" w:type="dxa"/>
-              <w:bottom w:w="70" w:type="dxa"/>
-              <w:left w:w="100" w:type="dxa"/>
-              <w:right w:w="100" w:type="dxa"/>
+              <w:top w:w="60" w:type="dxa"/>
+              <w:bottom w:w="60" w:type="dxa"/>
+              <w:left w:w="90" w:type="dxa"/>
+              <w:right w:w="90" w:type="dxa"/>
             </w:tcMar>
           </w:tcPr>
           <w:p>
@@ -628,9 +628,9 @@
                 <w:rFonts w:ascii="Times New Roman" w:hAnsi="Times New Roman"/>
                 <w:b w:val="0"/>
                 <w:color w:val="000000"/>
-                <w:sz w:val="17"/>
+                <w:sz w:val="16"/>
               </w:rPr>
-              <w:t>Section 1.1–1.3: Aggressive clinical trajectory and lack of targeted receptor therapies in TNBC; high reliance on distal super-enhancers; mathematical and biological failure of observational transcriptomic GRNs (GENIE3, SCENIC) driven by dropout zero-inflation (&gt;45% FDR); necessity of interventional do-calculus and functional single-cell CRISPRi.</w:t>
+              <w:t>Sections 1.1–1.3: Aggressive clinical trajectory and lack of targeted receptor therapies in TNBC; reliance on dense distal super-enhancers; mathematical proof that observational transcriptomic GRNs (GENIE3, SCENIC) suffer high false discovery rates (&gt;45% FDR) due to single-cell dropout zero-inflation; and necessity of interventional do-calculus and functional single-cell CRISPRi.</w:t>
             </w:r>
           </w:p>
         </w:tc>
@@ -639,10 +639,10 @@
             <w:tcW w:type="dxa" w:w="1728"/>
             <w:vAlign w:val="center"/>
             <w:tcMar>
-              <w:top w:w="70" w:type="dxa"/>
-              <w:bottom w:w="70" w:type="dxa"/>
-              <w:left w:w="100" w:type="dxa"/>
-              <w:right w:w="100" w:type="dxa"/>
+              <w:top w:w="60" w:type="dxa"/>
+              <w:bottom w:w="60" w:type="dxa"/>
+              <w:left w:w="90" w:type="dxa"/>
+              <w:right w:w="90" w:type="dxa"/>
             </w:tcMar>
           </w:tcPr>
           <w:p>
@@ -656,9 +656,9 @@
                 <w:rFonts w:ascii="Times New Roman" w:hAnsi="Times New Roman"/>
                 <w:b w:val="0"/>
                 <w:color w:val="000000"/>
-                <w:sz w:val="17"/>
+                <w:sz w:val="16"/>
               </w:rPr>
-              <w:t>Sections 1.1–1.3; Pages 1–2</w:t>
+              <w:t>Pages 2–4 (Sections 1.1–1.3)</w:t>
             </w:r>
           </w:p>
         </w:tc>
@@ -669,10 +669,10 @@
             <w:tcW w:type="dxa" w:w="2160"/>
             <w:vAlign w:val="center"/>
             <w:tcMar>
-              <w:top w:w="70" w:type="dxa"/>
-              <w:bottom w:w="70" w:type="dxa"/>
-              <w:left w:w="100" w:type="dxa"/>
-              <w:right w:w="100" w:type="dxa"/>
+              <w:top w:w="60" w:type="dxa"/>
+              <w:bottom w:w="60" w:type="dxa"/>
+              <w:left w:w="90" w:type="dxa"/>
+              <w:right w:w="90" w:type="dxa"/>
             </w:tcMar>
           </w:tcPr>
           <w:p>
@@ -686,7 +686,7 @@
                 <w:rFonts w:ascii="Times New Roman" w:hAnsi="Times New Roman"/>
                 <w:b w:val="0"/>
                 <w:color w:val="000000"/>
-                <w:sz w:val="17"/>
+                <w:sz w:val="16"/>
               </w:rPr>
               <w:t>Introduction - Objectives</w:t>
             </w:r>
@@ -697,10 +697,10 @@
             <w:tcW w:type="dxa" w:w="864"/>
             <w:vAlign w:val="center"/>
             <w:tcMar>
-              <w:top w:w="70" w:type="dxa"/>
-              <w:bottom w:w="70" w:type="dxa"/>
-              <w:left w:w="100" w:type="dxa"/>
-              <w:right w:w="100" w:type="dxa"/>
+              <w:top w:w="60" w:type="dxa"/>
+              <w:bottom w:w="60" w:type="dxa"/>
+              <w:left w:w="90" w:type="dxa"/>
+              <w:right w:w="90" w:type="dxa"/>
             </w:tcMar>
           </w:tcPr>
           <w:p>
@@ -714,7 +714,7 @@
                 <w:rFonts w:ascii="Times New Roman" w:hAnsi="Times New Roman"/>
                 <w:b w:val="0"/>
                 <w:color w:val="000000"/>
-                <w:sz w:val="17"/>
+                <w:sz w:val="16"/>
               </w:rPr>
               <w:t>3</w:t>
             </w:r>
@@ -725,10 +725,10 @@
             <w:tcW w:type="dxa" w:w="3168"/>
             <w:vAlign w:val="center"/>
             <w:tcMar>
-              <w:top w:w="70" w:type="dxa"/>
-              <w:bottom w:w="70" w:type="dxa"/>
-              <w:left w:w="100" w:type="dxa"/>
-              <w:right w:w="100" w:type="dxa"/>
+              <w:top w:w="60" w:type="dxa"/>
+              <w:bottom w:w="60" w:type="dxa"/>
+              <w:left w:w="90" w:type="dxa"/>
+              <w:right w:w="90" w:type="dxa"/>
             </w:tcMar>
           </w:tcPr>
           <w:p>
@@ -742,7 +742,7 @@
                 <w:rFonts w:ascii="Times New Roman" w:hAnsi="Times New Roman"/>
                 <w:b w:val="0"/>
                 <w:color w:val="000000"/>
-                <w:sz w:val="17"/>
+                <w:sz w:val="16"/>
               </w:rPr>
               <w:t>State specific objectives, including any prespecified hypotheses</w:t>
             </w:r>
@@ -753,10 +753,10 @@
             <w:tcW w:type="dxa" w:w="5616"/>
             <w:vAlign w:val="center"/>
             <w:tcMar>
-              <w:top w:w="70" w:type="dxa"/>
-              <w:bottom w:w="70" w:type="dxa"/>
-              <w:left w:w="100" w:type="dxa"/>
-              <w:right w:w="100" w:type="dxa"/>
+              <w:top w:w="60" w:type="dxa"/>
+              <w:bottom w:w="60" w:type="dxa"/>
+              <w:left w:w="90" w:type="dxa"/>
+              <w:right w:w="90" w:type="dxa"/>
             </w:tcMar>
           </w:tcPr>
           <w:p>
@@ -770,9 +770,9 @@
                 <w:rFonts w:ascii="Times New Roman" w:hAnsi="Times New Roman"/>
                 <w:b w:val="0"/>
                 <w:color w:val="000000"/>
-                <w:sz w:val="17"/>
+                <w:sz w:val="16"/>
               </w:rPr>
-              <w:t>Section 1.4: Explicitly defines 6 primary investigative objectives: (i) construct tripartite causal GRN (TF → Enhancer → Gene); (ii) prioritize master drivers via PageRank and MRS; (iii) decode non-linear cooperativity via Explainable AI (SHAP); (iv) benchmark against state-of-the-art GRN algorithms; (v) validate clinical prognosis in independent patient cohorts; and (vi) map synergistic epigenetic combination therapies.</w:t>
+              <w:t>Section 1.4: Defines 6 primary investigative objectives: (i) construct tripartite causal GRN (TF → Enhancer → Target Gene); (ii) prioritize master drivers via PageRank and MRS; (iii) decode non-linear cooperativity via Explainable AI (SHAP); (iv) benchmark against state-of-the-art GRN algorithms; (v) validate clinical prognosis in independent patient cohorts; and (vi) map synergistic epigenetic combination therapies.</w:t>
             </w:r>
           </w:p>
         </w:tc>
@@ -781,10 +781,10 @@
             <w:tcW w:type="dxa" w:w="1728"/>
             <w:vAlign w:val="center"/>
             <w:tcMar>
-              <w:top w:w="70" w:type="dxa"/>
-              <w:bottom w:w="70" w:type="dxa"/>
-              <w:left w:w="100" w:type="dxa"/>
-              <w:right w:w="100" w:type="dxa"/>
+              <w:top w:w="60" w:type="dxa"/>
+              <w:bottom w:w="60" w:type="dxa"/>
+              <w:left w:w="90" w:type="dxa"/>
+              <w:right w:w="90" w:type="dxa"/>
             </w:tcMar>
           </w:tcPr>
           <w:p>
@@ -798,9 +798,9 @@
                 <w:rFonts w:ascii="Times New Roman" w:hAnsi="Times New Roman"/>
                 <w:b w:val="0"/>
                 <w:color w:val="000000"/>
-                <w:sz w:val="17"/>
+                <w:sz w:val="16"/>
               </w:rPr>
-              <w:t>Section 1.4; Page 2</w:t>
+              <w:t>Page 4 (Section 1.4)</w:t>
             </w:r>
           </w:p>
         </w:tc>
@@ -811,10 +811,10 @@
             <w:tcW w:type="dxa" w:w="2160"/>
             <w:vAlign w:val="center"/>
             <w:tcMar>
-              <w:top w:w="70" w:type="dxa"/>
-              <w:bottom w:w="70" w:type="dxa"/>
-              <w:left w:w="100" w:type="dxa"/>
-              <w:right w:w="100" w:type="dxa"/>
+              <w:top w:w="60" w:type="dxa"/>
+              <w:bottom w:w="60" w:type="dxa"/>
+              <w:left w:w="90" w:type="dxa"/>
+              <w:right w:w="90" w:type="dxa"/>
             </w:tcMar>
           </w:tcPr>
           <w:p>
@@ -828,7 +828,7 @@
                 <w:rFonts w:ascii="Times New Roman" w:hAnsi="Times New Roman"/>
                 <w:b w:val="0"/>
                 <w:color w:val="000000"/>
-                <w:sz w:val="17"/>
+                <w:sz w:val="16"/>
               </w:rPr>
               <w:t>Methods - Study Design</w:t>
             </w:r>
@@ -839,10 +839,10 @@
             <w:tcW w:type="dxa" w:w="864"/>
             <w:vAlign w:val="center"/>
             <w:tcMar>
-              <w:top w:w="70" w:type="dxa"/>
-              <w:bottom w:w="70" w:type="dxa"/>
-              <w:left w:w="100" w:type="dxa"/>
-              <w:right w:w="100" w:type="dxa"/>
+              <w:top w:w="60" w:type="dxa"/>
+              <w:bottom w:w="60" w:type="dxa"/>
+              <w:left w:w="90" w:type="dxa"/>
+              <w:right w:w="90" w:type="dxa"/>
             </w:tcMar>
           </w:tcPr>
           <w:p>
@@ -856,7 +856,7 @@
                 <w:rFonts w:ascii="Times New Roman" w:hAnsi="Times New Roman"/>
                 <w:b w:val="0"/>
                 <w:color w:val="000000"/>
-                <w:sz w:val="17"/>
+                <w:sz w:val="16"/>
               </w:rPr>
               <w:t>4</w:t>
             </w:r>
@@ -867,10 +867,10 @@
             <w:tcW w:type="dxa" w:w="3168"/>
             <w:vAlign w:val="center"/>
             <w:tcMar>
-              <w:top w:w="70" w:type="dxa"/>
-              <w:bottom w:w="70" w:type="dxa"/>
-              <w:left w:w="100" w:type="dxa"/>
-              <w:right w:w="100" w:type="dxa"/>
+              <w:top w:w="60" w:type="dxa"/>
+              <w:bottom w:w="60" w:type="dxa"/>
+              <w:left w:w="90" w:type="dxa"/>
+              <w:right w:w="90" w:type="dxa"/>
             </w:tcMar>
           </w:tcPr>
           <w:p>
@@ -884,7 +884,7 @@
                 <w:rFonts w:ascii="Times New Roman" w:hAnsi="Times New Roman"/>
                 <w:b w:val="0"/>
                 <w:color w:val="000000"/>
-                <w:sz w:val="17"/>
+                <w:sz w:val="16"/>
               </w:rPr>
               <w:t>Present key elements of study design early in the paper</w:t>
             </w:r>
@@ -895,10 +895,10 @@
             <w:tcW w:type="dxa" w:w="5616"/>
             <w:vAlign w:val="center"/>
             <w:tcMar>
-              <w:top w:w="70" w:type="dxa"/>
-              <w:bottom w:w="70" w:type="dxa"/>
-              <w:left w:w="100" w:type="dxa"/>
-              <w:right w:w="100" w:type="dxa"/>
+              <w:top w:w="60" w:type="dxa"/>
+              <w:bottom w:w="60" w:type="dxa"/>
+              <w:left w:w="90" w:type="dxa"/>
+              <w:right w:w="90" w:type="dxa"/>
             </w:tcMar>
           </w:tcPr>
           <w:p>
@@ -912,9 +912,9 @@
                 <w:rFonts w:ascii="Times New Roman" w:hAnsi="Times New Roman"/>
                 <w:b w:val="0"/>
                 <w:color w:val="000000"/>
-                <w:sz w:val="17"/>
+                <w:sz w:val="16"/>
               </w:rPr>
-              <w:t>Section 2.1–2.4: Comprehensive end-to-end causal machine learning workflow uniting physical chromatin occupancy (ENCODE Factorbook ChIP-seq) with randomized interventional perturbation response (single-cell CRISPRi / dCas9-KRAB).</w:t>
+              <w:t>Sections 2.1–2.4: Comprehensive end-to-end causal machine learning workflow uniting physical chromatin occupancy (ENCODE Factorbook ChIP-seq) with randomized interventional perturbation responses (single-cell CRISPRi / dCas9-KRAB).</w:t>
             </w:r>
           </w:p>
         </w:tc>
@@ -923,10 +923,10 @@
             <w:tcW w:type="dxa" w:w="1728"/>
             <w:vAlign w:val="center"/>
             <w:tcMar>
-              <w:top w:w="70" w:type="dxa"/>
-              <w:bottom w:w="70" w:type="dxa"/>
-              <w:left w:w="100" w:type="dxa"/>
-              <w:right w:w="100" w:type="dxa"/>
+              <w:top w:w="60" w:type="dxa"/>
+              <w:bottom w:w="60" w:type="dxa"/>
+              <w:left w:w="90" w:type="dxa"/>
+              <w:right w:w="90" w:type="dxa"/>
             </w:tcMar>
           </w:tcPr>
           <w:p>
@@ -940,9 +940,9 @@
                 <w:rFonts w:ascii="Times New Roman" w:hAnsi="Times New Roman"/>
                 <w:b w:val="0"/>
                 <w:color w:val="000000"/>
-                <w:sz w:val="17"/>
+                <w:sz w:val="16"/>
               </w:rPr>
-              <w:t>Sections 2.1–2.4; Pages 2–3</w:t>
+              <w:t>Pages 4–6 (Sections 2.1–2.4)</w:t>
             </w:r>
           </w:p>
         </w:tc>
@@ -953,10 +953,10 @@
             <w:tcW w:type="dxa" w:w="2160"/>
             <w:vAlign w:val="center"/>
             <w:tcMar>
-              <w:top w:w="70" w:type="dxa"/>
-              <w:bottom w:w="70" w:type="dxa"/>
-              <w:left w:w="100" w:type="dxa"/>
-              <w:right w:w="100" w:type="dxa"/>
+              <w:top w:w="60" w:type="dxa"/>
+              <w:bottom w:w="60" w:type="dxa"/>
+              <w:left w:w="90" w:type="dxa"/>
+              <w:right w:w="90" w:type="dxa"/>
             </w:tcMar>
           </w:tcPr>
           <w:p>
@@ -970,7 +970,7 @@
                 <w:rFonts w:ascii="Times New Roman" w:hAnsi="Times New Roman"/>
                 <w:b w:val="0"/>
                 <w:color w:val="000000"/>
-                <w:sz w:val="17"/>
+                <w:sz w:val="16"/>
               </w:rPr>
               <w:t>Methods - Setting</w:t>
             </w:r>
@@ -981,10 +981,10 @@
             <w:tcW w:type="dxa" w:w="864"/>
             <w:vAlign w:val="center"/>
             <w:tcMar>
-              <w:top w:w="70" w:type="dxa"/>
-              <w:bottom w:w="70" w:type="dxa"/>
-              <w:left w:w="100" w:type="dxa"/>
-              <w:right w:w="100" w:type="dxa"/>
+              <w:top w:w="60" w:type="dxa"/>
+              <w:bottom w:w="60" w:type="dxa"/>
+              <w:left w:w="90" w:type="dxa"/>
+              <w:right w:w="90" w:type="dxa"/>
             </w:tcMar>
           </w:tcPr>
           <w:p>
@@ -998,7 +998,7 @@
                 <w:rFonts w:ascii="Times New Roman" w:hAnsi="Times New Roman"/>
                 <w:b w:val="0"/>
                 <w:color w:val="000000"/>
-                <w:sz w:val="17"/>
+                <w:sz w:val="16"/>
               </w:rPr>
               <w:t>5</w:t>
             </w:r>
@@ -1009,10 +1009,10 @@
             <w:tcW w:type="dxa" w:w="3168"/>
             <w:vAlign w:val="center"/>
             <w:tcMar>
-              <w:top w:w="70" w:type="dxa"/>
-              <w:bottom w:w="70" w:type="dxa"/>
-              <w:left w:w="100" w:type="dxa"/>
-              <w:right w:w="100" w:type="dxa"/>
+              <w:top w:w="60" w:type="dxa"/>
+              <w:bottom w:w="60" w:type="dxa"/>
+              <w:left w:w="90" w:type="dxa"/>
+              <w:right w:w="90" w:type="dxa"/>
             </w:tcMar>
           </w:tcPr>
           <w:p>
@@ -1026,7 +1026,7 @@
                 <w:rFonts w:ascii="Times New Roman" w:hAnsi="Times New Roman"/>
                 <w:b w:val="0"/>
                 <w:color w:val="000000"/>
-                <w:sz w:val="17"/>
+                <w:sz w:val="16"/>
               </w:rPr>
               <w:t>Describe setting, locations, relevant dates, exposure periods</w:t>
             </w:r>
@@ -1037,10 +1037,10 @@
             <w:tcW w:type="dxa" w:w="5616"/>
             <w:vAlign w:val="center"/>
             <w:tcMar>
-              <w:top w:w="70" w:type="dxa"/>
-              <w:bottom w:w="70" w:type="dxa"/>
-              <w:left w:w="100" w:type="dxa"/>
-              <w:right w:w="100" w:type="dxa"/>
+              <w:top w:w="60" w:type="dxa"/>
+              <w:bottom w:w="60" w:type="dxa"/>
+              <w:left w:w="90" w:type="dxa"/>
+              <w:right w:w="90" w:type="dxa"/>
             </w:tcMar>
           </w:tcPr>
           <w:p>
@@ -1054,9 +1054,9 @@
                 <w:rFonts w:ascii="Times New Roman" w:hAnsi="Times New Roman"/>
                 <w:b w:val="0"/>
                 <w:color w:val="000000"/>
-                <w:sz w:val="17"/>
+                <w:sz w:val="16"/>
               </w:rPr>
-              <w:t>Section 2.1: In vitro model system MDA-MB-231 (archetypal mesenchymal/basal-like TNBC); genome-scale single-cell CRISPRi Perturb-seq screen across 8 independent 10x Genomics Chromium 3' sequencing lanes (GEO accession GSE224986).</w:t>
+              <w:t>Section 2.1: Preclinical cellular model MDA-MB-231 (human mesenchymal basal-like TNBC); genome-scale single-cell CRISPRi Perturb-seq screen across 8 independent 10x Genomics Chromium 3' sequencing lanes (GEO accession GSE224986).</w:t>
             </w:r>
           </w:p>
         </w:tc>
@@ -1065,10 +1065,10 @@
             <w:tcW w:type="dxa" w:w="1728"/>
             <w:vAlign w:val="center"/>
             <w:tcMar>
-              <w:top w:w="70" w:type="dxa"/>
-              <w:bottom w:w="70" w:type="dxa"/>
-              <w:left w:w="100" w:type="dxa"/>
-              <w:right w:w="100" w:type="dxa"/>
+              <w:top w:w="60" w:type="dxa"/>
+              <w:bottom w:w="60" w:type="dxa"/>
+              <w:left w:w="90" w:type="dxa"/>
+              <w:right w:w="90" w:type="dxa"/>
             </w:tcMar>
           </w:tcPr>
           <w:p>
@@ -1082,9 +1082,9 @@
                 <w:rFonts w:ascii="Times New Roman" w:hAnsi="Times New Roman"/>
                 <w:b w:val="0"/>
                 <w:color w:val="000000"/>
-                <w:sz w:val="17"/>
+                <w:sz w:val="16"/>
               </w:rPr>
-              <w:t>Section 2.1; Page 2</w:t>
+              <w:t>Pages 4–5 (Section 2.1)</w:t>
             </w:r>
           </w:p>
         </w:tc>
@@ -1095,10 +1095,10 @@
             <w:tcW w:type="dxa" w:w="2160"/>
             <w:vAlign w:val="center"/>
             <w:tcMar>
-              <w:top w:w="70" w:type="dxa"/>
-              <w:bottom w:w="70" w:type="dxa"/>
-              <w:left w:w="100" w:type="dxa"/>
-              <w:right w:w="100" w:type="dxa"/>
+              <w:top w:w="60" w:type="dxa"/>
+              <w:bottom w:w="60" w:type="dxa"/>
+              <w:left w:w="90" w:type="dxa"/>
+              <w:right w:w="90" w:type="dxa"/>
             </w:tcMar>
           </w:tcPr>
           <w:p>
@@ -1112,7 +1112,7 @@
                 <w:rFonts w:ascii="Times New Roman" w:hAnsi="Times New Roman"/>
                 <w:b w:val="0"/>
                 <w:color w:val="000000"/>
-                <w:sz w:val="17"/>
+                <w:sz w:val="16"/>
               </w:rPr>
               <w:t>Methods - Participants / Cells</w:t>
             </w:r>
@@ -1123,10 +1123,10 @@
             <w:tcW w:type="dxa" w:w="864"/>
             <w:vAlign w:val="center"/>
             <w:tcMar>
-              <w:top w:w="70" w:type="dxa"/>
-              <w:bottom w:w="70" w:type="dxa"/>
-              <w:left w:w="100" w:type="dxa"/>
-              <w:right w:w="100" w:type="dxa"/>
+              <w:top w:w="60" w:type="dxa"/>
+              <w:bottom w:w="60" w:type="dxa"/>
+              <w:left w:w="90" w:type="dxa"/>
+              <w:right w:w="90" w:type="dxa"/>
             </w:tcMar>
           </w:tcPr>
           <w:p>
@@ -1140,7 +1140,7 @@
                 <w:rFonts w:ascii="Times New Roman" w:hAnsi="Times New Roman"/>
                 <w:b w:val="0"/>
                 <w:color w:val="000000"/>
-                <w:sz w:val="17"/>
+                <w:sz w:val="16"/>
               </w:rPr>
               <w:t>6a</w:t>
             </w:r>
@@ -1151,10 +1151,10 @@
             <w:tcW w:type="dxa" w:w="3168"/>
             <w:vAlign w:val="center"/>
             <w:tcMar>
-              <w:top w:w="70" w:type="dxa"/>
-              <w:bottom w:w="70" w:type="dxa"/>
-              <w:left w:w="100" w:type="dxa"/>
-              <w:right w:w="100" w:type="dxa"/>
+              <w:top w:w="60" w:type="dxa"/>
+              <w:bottom w:w="60" w:type="dxa"/>
+              <w:left w:w="90" w:type="dxa"/>
+              <w:right w:w="90" w:type="dxa"/>
             </w:tcMar>
           </w:tcPr>
           <w:p>
@@ -1168,7 +1168,7 @@
                 <w:rFonts w:ascii="Times New Roman" w:hAnsi="Times New Roman"/>
                 <w:b w:val="0"/>
                 <w:color w:val="000000"/>
-                <w:sz w:val="17"/>
+                <w:sz w:val="16"/>
               </w:rPr>
               <w:t>Give eligibility criteria, sources, and selection methods</w:t>
             </w:r>
@@ -1179,10 +1179,10 @@
             <w:tcW w:type="dxa" w:w="5616"/>
             <w:vAlign w:val="center"/>
             <w:tcMar>
-              <w:top w:w="70" w:type="dxa"/>
-              <w:bottom w:w="70" w:type="dxa"/>
-              <w:left w:w="100" w:type="dxa"/>
-              <w:right w:w="100" w:type="dxa"/>
+              <w:top w:w="60" w:type="dxa"/>
+              <w:bottom w:w="60" w:type="dxa"/>
+              <w:left w:w="90" w:type="dxa"/>
+              <w:right w:w="90" w:type="dxa"/>
             </w:tcMar>
           </w:tcPr>
           <w:p>
@@ -1196,9 +1196,9 @@
                 <w:rFonts w:ascii="Times New Roman" w:hAnsi="Times New Roman"/>
                 <w:b w:val="0"/>
                 <w:color w:val="000000"/>
-                <w:sz w:val="17"/>
+                <w:sz w:val="16"/>
               </w:rPr>
-              <w:t>Section 2.1: Stringent single-cell quality control thresholds: cells retaining &gt;= 200 detected genes and &lt;= 15% mitochondrial reads; genes expressed in &gt;= 3 cells; resulting in 95,678 high-quality single cells and 32,799 gene features.</w:t>
+              <w:t>Section 2.1: Stringent single-cell quality control thresholds: cells retaining &gt;= 200 detected genes and &lt;= 15% mitochondrial reads; genes expressed in &gt;= 3 cells; resulting in 95,678 high-quality single cells and 32,799 reliably expressed gene features.</w:t>
             </w:r>
           </w:p>
         </w:tc>
@@ -1207,10 +1207,10 @@
             <w:tcW w:type="dxa" w:w="1728"/>
             <w:vAlign w:val="center"/>
             <w:tcMar>
-              <w:top w:w="70" w:type="dxa"/>
-              <w:bottom w:w="70" w:type="dxa"/>
-              <w:left w:w="100" w:type="dxa"/>
-              <w:right w:w="100" w:type="dxa"/>
+              <w:top w:w="60" w:type="dxa"/>
+              <w:bottom w:w="60" w:type="dxa"/>
+              <w:left w:w="90" w:type="dxa"/>
+              <w:right w:w="90" w:type="dxa"/>
             </w:tcMar>
           </w:tcPr>
           <w:p>
@@ -1224,9 +1224,9 @@
                 <w:rFonts w:ascii="Times New Roman" w:hAnsi="Times New Roman"/>
                 <w:b w:val="0"/>
                 <w:color w:val="000000"/>
-                <w:sz w:val="17"/>
+                <w:sz w:val="16"/>
               </w:rPr>
-              <w:t>Section 2.1; Table 1; Figure 1</w:t>
+              <w:t>Pages 4–5, 8–10 (Section 2.1; Table 1; Figure 1)</w:t>
             </w:r>
           </w:p>
         </w:tc>
@@ -1237,10 +1237,10 @@
             <w:tcW w:type="dxa" w:w="2160"/>
             <w:vAlign w:val="center"/>
             <w:tcMar>
-              <w:top w:w="70" w:type="dxa"/>
-              <w:bottom w:w="70" w:type="dxa"/>
-              <w:left w:w="100" w:type="dxa"/>
-              <w:right w:w="100" w:type="dxa"/>
+              <w:top w:w="60" w:type="dxa"/>
+              <w:bottom w:w="60" w:type="dxa"/>
+              <w:left w:w="90" w:type="dxa"/>
+              <w:right w:w="90" w:type="dxa"/>
             </w:tcMar>
           </w:tcPr>
           <w:p>
@@ -1254,7 +1254,7 @@
                 <w:rFonts w:ascii="Times New Roman" w:hAnsi="Times New Roman"/>
                 <w:b w:val="0"/>
                 <w:color w:val="000000"/>
-                <w:sz w:val="17"/>
+                <w:sz w:val="16"/>
               </w:rPr>
               <w:t>Methods - Variables</w:t>
             </w:r>
@@ -1265,10 +1265,10 @@
             <w:tcW w:type="dxa" w:w="864"/>
             <w:vAlign w:val="center"/>
             <w:tcMar>
-              <w:top w:w="70" w:type="dxa"/>
-              <w:bottom w:w="70" w:type="dxa"/>
-              <w:left w:w="100" w:type="dxa"/>
-              <w:right w:w="100" w:type="dxa"/>
+              <w:top w:w="60" w:type="dxa"/>
+              <w:bottom w:w="60" w:type="dxa"/>
+              <w:left w:w="90" w:type="dxa"/>
+              <w:right w:w="90" w:type="dxa"/>
             </w:tcMar>
           </w:tcPr>
           <w:p>
@@ -1282,7 +1282,7 @@
                 <w:rFonts w:ascii="Times New Roman" w:hAnsi="Times New Roman"/>
                 <w:b w:val="0"/>
                 <w:color w:val="000000"/>
-                <w:sz w:val="17"/>
+                <w:sz w:val="16"/>
               </w:rPr>
               <w:t>7</w:t>
             </w:r>
@@ -1293,10 +1293,10 @@
             <w:tcW w:type="dxa" w:w="3168"/>
             <w:vAlign w:val="center"/>
             <w:tcMar>
-              <w:top w:w="70" w:type="dxa"/>
-              <w:bottom w:w="70" w:type="dxa"/>
-              <w:left w:w="100" w:type="dxa"/>
-              <w:right w:w="100" w:type="dxa"/>
+              <w:top w:w="60" w:type="dxa"/>
+              <w:bottom w:w="60" w:type="dxa"/>
+              <w:left w:w="90" w:type="dxa"/>
+              <w:right w:w="90" w:type="dxa"/>
             </w:tcMar>
           </w:tcPr>
           <w:p>
@@ -1310,7 +1310,7 @@
                 <w:rFonts w:ascii="Times New Roman" w:hAnsi="Times New Roman"/>
                 <w:b w:val="0"/>
                 <w:color w:val="000000"/>
-                <w:sz w:val="17"/>
+                <w:sz w:val="16"/>
               </w:rPr>
               <w:t>Clearly define all outcomes, exposures, predictors, confounders</w:t>
             </w:r>
@@ -1321,10 +1321,10 @@
             <w:tcW w:type="dxa" w:w="5616"/>
             <w:vAlign w:val="center"/>
             <w:tcMar>
-              <w:top w:w="70" w:type="dxa"/>
-              <w:bottom w:w="70" w:type="dxa"/>
-              <w:left w:w="100" w:type="dxa"/>
-              <w:right w:w="100" w:type="dxa"/>
+              <w:top w:w="60" w:type="dxa"/>
+              <w:bottom w:w="60" w:type="dxa"/>
+              <w:left w:w="90" w:type="dxa"/>
+              <w:right w:w="90" w:type="dxa"/>
             </w:tcMar>
           </w:tcPr>
           <w:p>
@@ -1338,9 +1338,9 @@
                 <w:rFonts w:ascii="Times New Roman" w:hAnsi="Times New Roman"/>
                 <w:b w:val="0"/>
                 <w:color w:val="000000"/>
-                <w:sz w:val="17"/>
+                <w:sz w:val="16"/>
               </w:rPr>
-              <w:t>Sections 2.1–2.4: Exposure = targeted dCas9-KRAB single-guide enhancer silencing (819 somatic mutation loci); Outcome = log2 fold change and Welch t-statistic of target genes; Predictors = ChIP peak confidence score C_ChIP(i, e) in [0, 1000] and causal weight W_causal; Potential Confounders = technical dropout zeros, 10x sequencing lane batches, and multi-guide epistatic crosstalk.</w:t>
+              <w:t>Sections 2.1–2.4: Exposure = targeted dCas9-KRAB single-guide enhancer silencing (819 somatic mutation loci); Outcome = log2 fold change and Welch t-statistic of downstream target genes; Predictors = ChIP peak confidence score C_ChIP(i, e) in [0, 1000] and causal weight W_causal; Potential Confounders = technical dropout zeros, 10x sequencing lane batches, and multi-guide epistatic crosstalk.</w:t>
             </w:r>
           </w:p>
         </w:tc>
@@ -1349,10 +1349,10 @@
             <w:tcW w:type="dxa" w:w="1728"/>
             <w:vAlign w:val="center"/>
             <w:tcMar>
-              <w:top w:w="70" w:type="dxa"/>
-              <w:bottom w:w="70" w:type="dxa"/>
-              <w:left w:w="100" w:type="dxa"/>
-              <w:right w:w="100" w:type="dxa"/>
+              <w:top w:w="60" w:type="dxa"/>
+              <w:bottom w:w="60" w:type="dxa"/>
+              <w:left w:w="90" w:type="dxa"/>
+              <w:right w:w="90" w:type="dxa"/>
             </w:tcMar>
           </w:tcPr>
           <w:p>
@@ -1366,9 +1366,9 @@
                 <w:rFonts w:ascii="Times New Roman" w:hAnsi="Times New Roman"/>
                 <w:b w:val="0"/>
                 <w:color w:val="000000"/>
-                <w:sz w:val="17"/>
+                <w:sz w:val="16"/>
               </w:rPr>
-              <w:t>Sections 2.1, 2.3, 2.4; Table 1</w:t>
+              <w:t>Pages 4–6 (Sections 2.1, 2.3, 2.4; Table 1)</w:t>
             </w:r>
           </w:p>
         </w:tc>
@@ -1379,10 +1379,10 @@
             <w:tcW w:type="dxa" w:w="2160"/>
             <w:vAlign w:val="center"/>
             <w:tcMar>
-              <w:top w:w="70" w:type="dxa"/>
-              <w:bottom w:w="70" w:type="dxa"/>
-              <w:left w:w="100" w:type="dxa"/>
-              <w:right w:w="100" w:type="dxa"/>
+              <w:top w:w="60" w:type="dxa"/>
+              <w:bottom w:w="60" w:type="dxa"/>
+              <w:left w:w="90" w:type="dxa"/>
+              <w:right w:w="90" w:type="dxa"/>
             </w:tcMar>
           </w:tcPr>
           <w:p>
@@ -1396,7 +1396,7 @@
                 <w:rFonts w:ascii="Times New Roman" w:hAnsi="Times New Roman"/>
                 <w:b w:val="0"/>
                 <w:color w:val="000000"/>
-                <w:sz w:val="17"/>
+                <w:sz w:val="16"/>
               </w:rPr>
               <w:t>Methods - Data Sources</w:t>
             </w:r>
@@ -1407,10 +1407,10 @@
             <w:tcW w:type="dxa" w:w="864"/>
             <w:vAlign w:val="center"/>
             <w:tcMar>
-              <w:top w:w="70" w:type="dxa"/>
-              <w:bottom w:w="70" w:type="dxa"/>
-              <w:left w:w="100" w:type="dxa"/>
-              <w:right w:w="100" w:type="dxa"/>
+              <w:top w:w="60" w:type="dxa"/>
+              <w:bottom w:w="60" w:type="dxa"/>
+              <w:left w:w="90" w:type="dxa"/>
+              <w:right w:w="90" w:type="dxa"/>
             </w:tcMar>
           </w:tcPr>
           <w:p>
@@ -1424,7 +1424,7 @@
                 <w:rFonts w:ascii="Times New Roman" w:hAnsi="Times New Roman"/>
                 <w:b w:val="0"/>
                 <w:color w:val="000000"/>
-                <w:sz w:val="17"/>
+                <w:sz w:val="16"/>
               </w:rPr>
               <w:t>8</w:t>
             </w:r>
@@ -1435,10 +1435,10 @@
             <w:tcW w:type="dxa" w:w="3168"/>
             <w:vAlign w:val="center"/>
             <w:tcMar>
-              <w:top w:w="70" w:type="dxa"/>
-              <w:bottom w:w="70" w:type="dxa"/>
-              <w:left w:w="100" w:type="dxa"/>
-              <w:right w:w="100" w:type="dxa"/>
+              <w:top w:w="60" w:type="dxa"/>
+              <w:bottom w:w="60" w:type="dxa"/>
+              <w:left w:w="90" w:type="dxa"/>
+              <w:right w:w="90" w:type="dxa"/>
             </w:tcMar>
           </w:tcPr>
           <w:p>
@@ -1452,7 +1452,7 @@
                 <w:rFonts w:ascii="Times New Roman" w:hAnsi="Times New Roman"/>
                 <w:b w:val="0"/>
                 <w:color w:val="000000"/>
-                <w:sz w:val="17"/>
+                <w:sz w:val="16"/>
               </w:rPr>
               <w:t>Give sources of data and details of measurement methods</w:t>
             </w:r>
@@ -1463,10 +1463,10 @@
             <w:tcW w:type="dxa" w:w="5616"/>
             <w:vAlign w:val="center"/>
             <w:tcMar>
-              <w:top w:w="70" w:type="dxa"/>
-              <w:bottom w:w="70" w:type="dxa"/>
-              <w:left w:w="100" w:type="dxa"/>
-              <w:right w:w="100" w:type="dxa"/>
+              <w:top w:w="60" w:type="dxa"/>
+              <w:bottom w:w="60" w:type="dxa"/>
+              <w:left w:w="90" w:type="dxa"/>
+              <w:right w:w="90" w:type="dxa"/>
             </w:tcMar>
           </w:tcPr>
           <w:p>
@@ -1480,9 +1480,9 @@
                 <w:rFonts w:ascii="Times New Roman" w:hAnsi="Times New Roman"/>
                 <w:b w:val="0"/>
                 <w:color w:val="000000"/>
-                <w:sz w:val="17"/>
+                <w:sz w:val="16"/>
               </w:rPr>
-              <w:t>Sections 2.1, 2.2, 2.7: GEO GSE224986 (single-cell CRISPRi), GSE223812 (enhancer coordinates), UCSC / ENCODE encRegTfbsClustered (ChIP-seq priors across 340 TFs), TCGA-BRCA (n = 160 TNBC) and METABRIC (n = 320 TNBC) clinical cohorts.</w:t>
+              <w:t>Sections 2.1, 2.2, 2.7, 5: GEO GSE224986 (Perturb-seq), GEO GSE223812 (enhancer coordinates), ENCODE Factorbook / UCSC encRegTfbsClustered (ChIP-seq priors across 340 TFs), TCGA-BRCA (n = 160 TNBC) and METABRIC (n = 320 TNBC) clinical cohorts, and DGIdb/ChEMBL/ClinicalTrials.gov for therapeutics.</w:t>
             </w:r>
           </w:p>
         </w:tc>
@@ -1491,10 +1491,10 @@
             <w:tcW w:type="dxa" w:w="1728"/>
             <w:vAlign w:val="center"/>
             <w:tcMar>
-              <w:top w:w="70" w:type="dxa"/>
-              <w:bottom w:w="70" w:type="dxa"/>
-              <w:left w:w="100" w:type="dxa"/>
-              <w:right w:w="100" w:type="dxa"/>
+              <w:top w:w="60" w:type="dxa"/>
+              <w:bottom w:w="60" w:type="dxa"/>
+              <w:left w:w="90" w:type="dxa"/>
+              <w:right w:w="90" w:type="dxa"/>
             </w:tcMar>
           </w:tcPr>
           <w:p>
@@ -1508,9 +1508,9 @@
                 <w:rFonts w:ascii="Times New Roman" w:hAnsi="Times New Roman"/>
                 <w:b w:val="0"/>
                 <w:color w:val="000000"/>
-                <w:sz w:val="17"/>
+                <w:sz w:val="16"/>
               </w:rPr>
-              <w:t>Sections 2.1, 2.2, 2.7; Pages 2–4</w:t>
+              <w:t>Pages 4–5, 7–8, 21–22 (Sections 2.1, 2.2, 2.7, 5)</w:t>
             </w:r>
           </w:p>
         </w:tc>
@@ -1521,10 +1521,10 @@
             <w:tcW w:type="dxa" w:w="2160"/>
             <w:vAlign w:val="center"/>
             <w:tcMar>
-              <w:top w:w="70" w:type="dxa"/>
-              <w:bottom w:w="70" w:type="dxa"/>
-              <w:left w:w="100" w:type="dxa"/>
-              <w:right w:w="100" w:type="dxa"/>
+              <w:top w:w="60" w:type="dxa"/>
+              <w:bottom w:w="60" w:type="dxa"/>
+              <w:left w:w="90" w:type="dxa"/>
+              <w:right w:w="90" w:type="dxa"/>
             </w:tcMar>
           </w:tcPr>
           <w:p>
@@ -1538,7 +1538,7 @@
                 <w:rFonts w:ascii="Times New Roman" w:hAnsi="Times New Roman"/>
                 <w:b w:val="0"/>
                 <w:color w:val="000000"/>
-                <w:sz w:val="17"/>
+                <w:sz w:val="16"/>
               </w:rPr>
               <w:t>Methods - Bias Control</w:t>
             </w:r>
@@ -1549,10 +1549,10 @@
             <w:tcW w:type="dxa" w:w="864"/>
             <w:vAlign w:val="center"/>
             <w:tcMar>
-              <w:top w:w="70" w:type="dxa"/>
-              <w:bottom w:w="70" w:type="dxa"/>
-              <w:left w:w="100" w:type="dxa"/>
-              <w:right w:w="100" w:type="dxa"/>
+              <w:top w:w="60" w:type="dxa"/>
+              <w:bottom w:w="60" w:type="dxa"/>
+              <w:left w:w="90" w:type="dxa"/>
+              <w:right w:w="90" w:type="dxa"/>
             </w:tcMar>
           </w:tcPr>
           <w:p>
@@ -1566,7 +1566,7 @@
                 <w:rFonts w:ascii="Times New Roman" w:hAnsi="Times New Roman"/>
                 <w:b w:val="0"/>
                 <w:color w:val="000000"/>
-                <w:sz w:val="17"/>
+                <w:sz w:val="16"/>
               </w:rPr>
               <w:t>9</w:t>
             </w:r>
@@ -1577,10 +1577,10 @@
             <w:tcW w:type="dxa" w:w="3168"/>
             <w:vAlign w:val="center"/>
             <w:tcMar>
-              <w:top w:w="70" w:type="dxa"/>
-              <w:bottom w:w="70" w:type="dxa"/>
-              <w:left w:w="100" w:type="dxa"/>
-              <w:right w:w="100" w:type="dxa"/>
+              <w:top w:w="60" w:type="dxa"/>
+              <w:bottom w:w="60" w:type="dxa"/>
+              <w:left w:w="90" w:type="dxa"/>
+              <w:right w:w="90" w:type="dxa"/>
             </w:tcMar>
           </w:tcPr>
           <w:p>
@@ -1594,7 +1594,7 @@
                 <w:rFonts w:ascii="Times New Roman" w:hAnsi="Times New Roman"/>
                 <w:b w:val="0"/>
                 <w:color w:val="000000"/>
-                <w:sz w:val="17"/>
+                <w:sz w:val="16"/>
               </w:rPr>
               <w:t>Describe any efforts to address potential sources of bias</w:t>
             </w:r>
@@ -1605,10 +1605,10 @@
             <w:tcW w:type="dxa" w:w="5616"/>
             <w:vAlign w:val="center"/>
             <w:tcMar>
-              <w:top w:w="70" w:type="dxa"/>
-              <w:bottom w:w="70" w:type="dxa"/>
-              <w:left w:w="100" w:type="dxa"/>
-              <w:right w:w="100" w:type="dxa"/>
+              <w:top w:w="60" w:type="dxa"/>
+              <w:bottom w:w="60" w:type="dxa"/>
+              <w:left w:w="90" w:type="dxa"/>
+              <w:right w:w="90" w:type="dxa"/>
             </w:tcMar>
           </w:tcPr>
           <w:p>
@@ -1622,9 +1622,9 @@
                 <w:rFonts w:ascii="Times New Roman" w:hAnsi="Times New Roman"/>
                 <w:b w:val="0"/>
                 <w:color w:val="000000"/>
-                <w:sz w:val="17"/>
+                <w:sz w:val="16"/>
               </w:rPr>
-              <w:t>Sections 2.1, 2.3, 2.4: Unconfounded causal identifiability enforced by evaluating single-guide perturbation cells (n = 3,930) strictly against unperturbed negative-control cells (n = 7,767), breaking multi-guide epistatic confounding; observational dropout zeros overcome by requiring physical ChIP-seq binding priors; lane batch effects controlled.</w:t>
+              <w:t>Sections 2.1, 2.4, 4.1: Unconfounded causal identifiability enforced by evaluating single-guide perturbation cells (n = 3,930) strictly against unperturbed negative-control cells (n = 7,767), breaking multi-guide epistatic confounding; observational dropout zeros overcome by requiring physical ChIP-seq binding priors; lane batch effects controlled; acyclicity misspecification avoided by modeling multigraph topology rather than global continuous DAG inversion (Section 4.1).</w:t>
             </w:r>
           </w:p>
         </w:tc>
@@ -1633,10 +1633,10 @@
             <w:tcW w:type="dxa" w:w="1728"/>
             <w:vAlign w:val="center"/>
             <w:tcMar>
-              <w:top w:w="70" w:type="dxa"/>
-              <w:bottom w:w="70" w:type="dxa"/>
-              <w:left w:w="100" w:type="dxa"/>
-              <w:right w:w="100" w:type="dxa"/>
+              <w:top w:w="60" w:type="dxa"/>
+              <w:bottom w:w="60" w:type="dxa"/>
+              <w:left w:w="90" w:type="dxa"/>
+              <w:right w:w="90" w:type="dxa"/>
             </w:tcMar>
           </w:tcPr>
           <w:p>
@@ -1650,9 +1650,9 @@
                 <w:rFonts w:ascii="Times New Roman" w:hAnsi="Times New Roman"/>
                 <w:b w:val="0"/>
                 <w:color w:val="000000"/>
-                <w:sz w:val="17"/>
+                <w:sz w:val="16"/>
               </w:rPr>
-              <w:t>Sections 2.1, 2.4; Supplementary Note 2</w:t>
+              <w:t>Pages 4–6, 18–19 (Sections 2.1, 2.4, 4.1; Supplementary Note 2)</w:t>
             </w:r>
           </w:p>
         </w:tc>
@@ -1663,10 +1663,10 @@
             <w:tcW w:type="dxa" w:w="2160"/>
             <w:vAlign w:val="center"/>
             <w:tcMar>
-              <w:top w:w="70" w:type="dxa"/>
-              <w:bottom w:w="70" w:type="dxa"/>
-              <w:left w:w="100" w:type="dxa"/>
-              <w:right w:w="100" w:type="dxa"/>
+              <w:top w:w="60" w:type="dxa"/>
+              <w:bottom w:w="60" w:type="dxa"/>
+              <w:left w:w="90" w:type="dxa"/>
+              <w:right w:w="90" w:type="dxa"/>
             </w:tcMar>
           </w:tcPr>
           <w:p>
@@ -1680,7 +1680,7 @@
                 <w:rFonts w:ascii="Times New Roman" w:hAnsi="Times New Roman"/>
                 <w:b w:val="0"/>
                 <w:color w:val="000000"/>
-                <w:sz w:val="17"/>
+                <w:sz w:val="16"/>
               </w:rPr>
               <w:t>Methods - Study Size</w:t>
             </w:r>
@@ -1691,10 +1691,10 @@
             <w:tcW w:type="dxa" w:w="864"/>
             <w:vAlign w:val="center"/>
             <w:tcMar>
-              <w:top w:w="70" w:type="dxa"/>
-              <w:bottom w:w="70" w:type="dxa"/>
-              <w:left w:w="100" w:type="dxa"/>
-              <w:right w:w="100" w:type="dxa"/>
+              <w:top w:w="60" w:type="dxa"/>
+              <w:bottom w:w="60" w:type="dxa"/>
+              <w:left w:w="90" w:type="dxa"/>
+              <w:right w:w="90" w:type="dxa"/>
             </w:tcMar>
           </w:tcPr>
           <w:p>
@@ -1708,7 +1708,7 @@
                 <w:rFonts w:ascii="Times New Roman" w:hAnsi="Times New Roman"/>
                 <w:b w:val="0"/>
                 <w:color w:val="000000"/>
-                <w:sz w:val="17"/>
+                <w:sz w:val="16"/>
               </w:rPr>
               <w:t>10</w:t>
             </w:r>
@@ -1719,10 +1719,10 @@
             <w:tcW w:type="dxa" w:w="3168"/>
             <w:vAlign w:val="center"/>
             <w:tcMar>
-              <w:top w:w="70" w:type="dxa"/>
-              <w:bottom w:w="70" w:type="dxa"/>
-              <w:left w:w="100" w:type="dxa"/>
-              <w:right w:w="100" w:type="dxa"/>
+              <w:top w:w="60" w:type="dxa"/>
+              <w:bottom w:w="60" w:type="dxa"/>
+              <w:left w:w="90" w:type="dxa"/>
+              <w:right w:w="90" w:type="dxa"/>
             </w:tcMar>
           </w:tcPr>
           <w:p>
@@ -1736,7 +1736,7 @@
                 <w:rFonts w:ascii="Times New Roman" w:hAnsi="Times New Roman"/>
                 <w:b w:val="0"/>
                 <w:color w:val="000000"/>
-                <w:sz w:val="17"/>
+                <w:sz w:val="16"/>
               </w:rPr>
               <w:t>Explain how study size was arrived at</w:t>
             </w:r>
@@ -1747,10 +1747,10 @@
             <w:tcW w:type="dxa" w:w="5616"/>
             <w:vAlign w:val="center"/>
             <w:tcMar>
-              <w:top w:w="70" w:type="dxa"/>
-              <w:bottom w:w="70" w:type="dxa"/>
-              <w:left w:w="100" w:type="dxa"/>
-              <w:right w:w="100" w:type="dxa"/>
+              <w:top w:w="60" w:type="dxa"/>
+              <w:bottom w:w="60" w:type="dxa"/>
+              <w:left w:w="90" w:type="dxa"/>
+              <w:right w:w="90" w:type="dxa"/>
             </w:tcMar>
           </w:tcPr>
           <w:p>
@@ -1764,9 +1764,9 @@
                 <w:rFonts w:ascii="Times New Roman" w:hAnsi="Times New Roman"/>
                 <w:b w:val="0"/>
                 <w:color w:val="000000"/>
-                <w:sz w:val="17"/>
+                <w:sz w:val="16"/>
               </w:rPr>
-              <w:t>Section 2.1: Complete experimental library of 95,678 single cells, 11,975 unique sgRNAs, 819 targeted super-enhancers, and 32,799 gene features; stratified into single-guide (n = 3,930), multi-guide (n = 83,981), and control (n = 7,767) cohorts.</w:t>
+              <w:t>Section 2.1: Complete experimental library of 95,678 single cells, 11,975 unique sgRNAs, 819 targeted super-enhancers, and 32,799 gene features; stratified into single-guide (n = 3,930), multi-guide (n = 83,981), and negative control (n = 7,767) cohorts.</w:t>
             </w:r>
           </w:p>
         </w:tc>
@@ -1775,10 +1775,10 @@
             <w:tcW w:type="dxa" w:w="1728"/>
             <w:vAlign w:val="center"/>
             <w:tcMar>
-              <w:top w:w="70" w:type="dxa"/>
-              <w:bottom w:w="70" w:type="dxa"/>
-              <w:left w:w="100" w:type="dxa"/>
-              <w:right w:w="100" w:type="dxa"/>
+              <w:top w:w="60" w:type="dxa"/>
+              <w:bottom w:w="60" w:type="dxa"/>
+              <w:left w:w="90" w:type="dxa"/>
+              <w:right w:w="90" w:type="dxa"/>
             </w:tcMar>
           </w:tcPr>
           <w:p>
@@ -1792,9 +1792,9 @@
                 <w:rFonts w:ascii="Times New Roman" w:hAnsi="Times New Roman"/>
                 <w:b w:val="0"/>
                 <w:color w:val="000000"/>
-                <w:sz w:val="17"/>
+                <w:sz w:val="16"/>
               </w:rPr>
-              <w:t>Section 2.1; Table 1; Figure 1d</w:t>
+              <w:t>Pages 4–5, 8–10 (Section 2.1; Table 1; Figure 1d)</w:t>
             </w:r>
           </w:p>
         </w:tc>
@@ -1805,10 +1805,10 @@
             <w:tcW w:type="dxa" w:w="2160"/>
             <w:vAlign w:val="center"/>
             <w:tcMar>
-              <w:top w:w="70" w:type="dxa"/>
-              <w:bottom w:w="70" w:type="dxa"/>
-              <w:left w:w="100" w:type="dxa"/>
-              <w:right w:w="100" w:type="dxa"/>
+              <w:top w:w="60" w:type="dxa"/>
+              <w:bottom w:w="60" w:type="dxa"/>
+              <w:left w:w="90" w:type="dxa"/>
+              <w:right w:w="90" w:type="dxa"/>
             </w:tcMar>
           </w:tcPr>
           <w:p>
@@ -1822,7 +1822,7 @@
                 <w:rFonts w:ascii="Times New Roman" w:hAnsi="Times New Roman"/>
                 <w:b w:val="0"/>
                 <w:color w:val="000000"/>
-                <w:sz w:val="17"/>
+                <w:sz w:val="16"/>
               </w:rPr>
               <w:t>Methods - Quantitative Variables</w:t>
             </w:r>
@@ -1833,10 +1833,10 @@
             <w:tcW w:type="dxa" w:w="864"/>
             <w:vAlign w:val="center"/>
             <w:tcMar>
-              <w:top w:w="70" w:type="dxa"/>
-              <w:bottom w:w="70" w:type="dxa"/>
-              <w:left w:w="100" w:type="dxa"/>
-              <w:right w:w="100" w:type="dxa"/>
+              <w:top w:w="60" w:type="dxa"/>
+              <w:bottom w:w="60" w:type="dxa"/>
+              <w:left w:w="90" w:type="dxa"/>
+              <w:right w:w="90" w:type="dxa"/>
             </w:tcMar>
           </w:tcPr>
           <w:p>
@@ -1850,7 +1850,7 @@
                 <w:rFonts w:ascii="Times New Roman" w:hAnsi="Times New Roman"/>
                 <w:b w:val="0"/>
                 <w:color w:val="000000"/>
-                <w:sz w:val="17"/>
+                <w:sz w:val="16"/>
               </w:rPr>
               <w:t>11</w:t>
             </w:r>
@@ -1861,10 +1861,10 @@
             <w:tcW w:type="dxa" w:w="3168"/>
             <w:vAlign w:val="center"/>
             <w:tcMar>
-              <w:top w:w="70" w:type="dxa"/>
-              <w:bottom w:w="70" w:type="dxa"/>
-              <w:left w:w="100" w:type="dxa"/>
-              <w:right w:w="100" w:type="dxa"/>
+              <w:top w:w="60" w:type="dxa"/>
+              <w:bottom w:w="60" w:type="dxa"/>
+              <w:left w:w="90" w:type="dxa"/>
+              <w:right w:w="90" w:type="dxa"/>
             </w:tcMar>
           </w:tcPr>
           <w:p>
@@ -1878,7 +1878,7 @@
                 <w:rFonts w:ascii="Times New Roman" w:hAnsi="Times New Roman"/>
                 <w:b w:val="0"/>
                 <w:color w:val="000000"/>
-                <w:sz w:val="17"/>
+                <w:sz w:val="16"/>
               </w:rPr>
               <w:t>Explain how quantitative variables were handled in analyses</w:t>
             </w:r>
@@ -1889,10 +1889,10 @@
             <w:tcW w:type="dxa" w:w="5616"/>
             <w:vAlign w:val="center"/>
             <w:tcMar>
-              <w:top w:w="70" w:type="dxa"/>
-              <w:bottom w:w="70" w:type="dxa"/>
-              <w:left w:w="100" w:type="dxa"/>
-              <w:right w:w="100" w:type="dxa"/>
+              <w:top w:w="60" w:type="dxa"/>
+              <w:bottom w:w="60" w:type="dxa"/>
+              <w:left w:w="90" w:type="dxa"/>
+              <w:right w:w="90" w:type="dxa"/>
             </w:tcMar>
           </w:tcPr>
           <w:p>
@@ -1906,9 +1906,9 @@
                 <w:rFonts w:ascii="Times New Roman" w:hAnsi="Times New Roman"/>
                 <w:b w:val="0"/>
                 <w:color w:val="000000"/>
-                <w:sz w:val="17"/>
+                <w:sz w:val="16"/>
               </w:rPr>
-              <w:t>Sections 2.3–2.6: Library size normalization to 10,000 counts per cell (CP10k); log1p transformation; vectorized Welch t-statistic computation with Welch-Satterthwaite degrees of freedom; composite causal weight scaling W_causal = C_ChIP × |log2 FC| × |t|.</w:t>
+              <w:t>Sections 2.3–2.6: Library size normalization to 10,000 counts per cell (CP10k); log-transformation X_norm = ln(1 + CP10k); vectorized Welch t-statistic computation with Satterthwaite degrees of freedom ν; composite causal weight scaling W_causal = C_ChIP × |log2 FC| × |t|.</w:t>
             </w:r>
           </w:p>
         </w:tc>
@@ -1917,10 +1917,10 @@
             <w:tcW w:type="dxa" w:w="1728"/>
             <w:vAlign w:val="center"/>
             <w:tcMar>
-              <w:top w:w="70" w:type="dxa"/>
-              <w:bottom w:w="70" w:type="dxa"/>
-              <w:left w:w="100" w:type="dxa"/>
-              <w:right w:w="100" w:type="dxa"/>
+              <w:top w:w="60" w:type="dxa"/>
+              <w:bottom w:w="60" w:type="dxa"/>
+              <w:left w:w="90" w:type="dxa"/>
+              <w:right w:w="90" w:type="dxa"/>
             </w:tcMar>
           </w:tcPr>
           <w:p>
@@ -1934,9 +1934,9 @@
                 <w:rFonts w:ascii="Times New Roman" w:hAnsi="Times New Roman"/>
                 <w:b w:val="0"/>
                 <w:color w:val="000000"/>
-                <w:sz w:val="17"/>
+                <w:sz w:val="16"/>
               </w:rPr>
-              <w:t>Sections 2.3, 2.4; Supplementary Notes 1, 3</w:t>
+              <w:t>Pages 5–6 (Sections 2.3, 2.4; Supplementary Notes 1, 3)</w:t>
             </w:r>
           </w:p>
         </w:tc>
@@ -1947,10 +1947,10 @@
             <w:tcW w:type="dxa" w:w="2160"/>
             <w:vAlign w:val="center"/>
             <w:tcMar>
-              <w:top w:w="70" w:type="dxa"/>
-              <w:bottom w:w="70" w:type="dxa"/>
-              <w:left w:w="100" w:type="dxa"/>
-              <w:right w:w="100" w:type="dxa"/>
+              <w:top w:w="60" w:type="dxa"/>
+              <w:bottom w:w="60" w:type="dxa"/>
+              <w:left w:w="90" w:type="dxa"/>
+              <w:right w:w="90" w:type="dxa"/>
             </w:tcMar>
           </w:tcPr>
           <w:p>
@@ -1964,7 +1964,7 @@
                 <w:rFonts w:ascii="Times New Roman" w:hAnsi="Times New Roman"/>
                 <w:b w:val="0"/>
                 <w:color w:val="000000"/>
-                <w:sz w:val="17"/>
+                <w:sz w:val="16"/>
               </w:rPr>
               <w:t>Methods - Statistical Methods</w:t>
             </w:r>
@@ -1975,10 +1975,10 @@
             <w:tcW w:type="dxa" w:w="864"/>
             <w:vAlign w:val="center"/>
             <w:tcMar>
-              <w:top w:w="70" w:type="dxa"/>
-              <w:bottom w:w="70" w:type="dxa"/>
-              <w:left w:w="100" w:type="dxa"/>
-              <w:right w:w="100" w:type="dxa"/>
+              <w:top w:w="60" w:type="dxa"/>
+              <w:bottom w:w="60" w:type="dxa"/>
+              <w:left w:w="90" w:type="dxa"/>
+              <w:right w:w="90" w:type="dxa"/>
             </w:tcMar>
           </w:tcPr>
           <w:p>
@@ -1992,7 +1992,7 @@
                 <w:rFonts w:ascii="Times New Roman" w:hAnsi="Times New Roman"/>
                 <w:b w:val="0"/>
                 <w:color w:val="000000"/>
-                <w:sz w:val="17"/>
+                <w:sz w:val="16"/>
               </w:rPr>
               <w:t>12a</w:t>
             </w:r>
@@ -2003,10 +2003,10 @@
             <w:tcW w:type="dxa" w:w="3168"/>
             <w:vAlign w:val="center"/>
             <w:tcMar>
-              <w:top w:w="70" w:type="dxa"/>
-              <w:bottom w:w="70" w:type="dxa"/>
-              <w:left w:w="100" w:type="dxa"/>
-              <w:right w:w="100" w:type="dxa"/>
+              <w:top w:w="60" w:type="dxa"/>
+              <w:bottom w:w="60" w:type="dxa"/>
+              <w:left w:w="90" w:type="dxa"/>
+              <w:right w:w="90" w:type="dxa"/>
             </w:tcMar>
           </w:tcPr>
           <w:p>
@@ -2020,7 +2020,7 @@
                 <w:rFonts w:ascii="Times New Roman" w:hAnsi="Times New Roman"/>
                 <w:b w:val="0"/>
                 <w:color w:val="000000"/>
-                <w:sz w:val="17"/>
+                <w:sz w:val="16"/>
               </w:rPr>
               <w:t>Describe all statistical methods, including confounder control</w:t>
             </w:r>
@@ -2031,10 +2031,10 @@
             <w:tcW w:type="dxa" w:w="5616"/>
             <w:vAlign w:val="center"/>
             <w:tcMar>
-              <w:top w:w="70" w:type="dxa"/>
-              <w:bottom w:w="70" w:type="dxa"/>
-              <w:left w:w="100" w:type="dxa"/>
-              <w:right w:w="100" w:type="dxa"/>
+              <w:top w:w="60" w:type="dxa"/>
+              <w:bottom w:w="60" w:type="dxa"/>
+              <w:left w:w="90" w:type="dxa"/>
+              <w:right w:w="90" w:type="dxa"/>
             </w:tcMar>
           </w:tcPr>
           <w:p>
@@ -2048,9 +2048,9 @@
                 <w:rFonts w:ascii="Times New Roman" w:hAnsi="Times New Roman"/>
                 <w:b w:val="0"/>
                 <w:color w:val="000000"/>
-                <w:sz w:val="17"/>
+                <w:sz w:val="16"/>
               </w:rPr>
-              <w:t>Sections 2.3–2.7: Fast vectorized two-sample Welch t-test; Google PageRank graph centrality (damping factor α = 0.85); Gradient Boosted Decision Trees (XGBoost Regressor; 100 estimators, depth = 4); exact TreeExplainer SHAP attribution; multivariable Cox proportional hazards modeling adjusted for age, tumor stage, and nodal status.</w:t>
+              <w:t>Sections 2.3–2.7: Fast vectorized two-sample Welch t-test (Supplementary Note 3); Google PageRank graph centrality (damping factor α = 0.85; Supplementary Note 4); Gradient Boosted Decision Trees (XGBoost Regressor; 100 estimators, depth = 4); exact TreeExplainer SHAP attribution (Supplementary Note 5); multivariable Cox proportional hazards modeling adjusted for age, tumor stage, and nodal status.</w:t>
             </w:r>
           </w:p>
         </w:tc>
@@ -2059,10 +2059,10 @@
             <w:tcW w:type="dxa" w:w="1728"/>
             <w:vAlign w:val="center"/>
             <w:tcMar>
-              <w:top w:w="70" w:type="dxa"/>
-              <w:bottom w:w="70" w:type="dxa"/>
-              <w:left w:w="100" w:type="dxa"/>
-              <w:right w:w="100" w:type="dxa"/>
+              <w:top w:w="60" w:type="dxa"/>
+              <w:bottom w:w="60" w:type="dxa"/>
+              <w:left w:w="90" w:type="dxa"/>
+              <w:right w:w="90" w:type="dxa"/>
             </w:tcMar>
           </w:tcPr>
           <w:p>
@@ -2076,9 +2076,9 @@
                 <w:rFonts w:ascii="Times New Roman" w:hAnsi="Times New Roman"/>
                 <w:b w:val="0"/>
                 <w:color w:val="000000"/>
-                <w:sz w:val="17"/>
+                <w:sz w:val="16"/>
               </w:rPr>
-              <w:t>Sections 2.3–2.7; Supplementary Notes 3–5</w:t>
+              <w:t>Pages 5–8 (Sections 2.3–2.7; Supplementary Notes 3–5)</w:t>
             </w:r>
           </w:p>
         </w:tc>
@@ -2089,10 +2089,10 @@
             <w:tcW w:type="dxa" w:w="2160"/>
             <w:vAlign w:val="center"/>
             <w:tcMar>
-              <w:top w:w="70" w:type="dxa"/>
-              <w:bottom w:w="70" w:type="dxa"/>
-              <w:left w:w="100" w:type="dxa"/>
-              <w:right w:w="100" w:type="dxa"/>
+              <w:top w:w="60" w:type="dxa"/>
+              <w:bottom w:w="60" w:type="dxa"/>
+              <w:left w:w="90" w:type="dxa"/>
+              <w:right w:w="90" w:type="dxa"/>
             </w:tcMar>
           </w:tcPr>
           <w:p>
@@ -2106,7 +2106,7 @@
                 <w:rFonts w:ascii="Times New Roman" w:hAnsi="Times New Roman"/>
                 <w:b w:val="0"/>
                 <w:color w:val="000000"/>
-                <w:sz w:val="17"/>
+                <w:sz w:val="16"/>
               </w:rPr>
               <w:t>Methods - Subgroups &amp; Interactions</w:t>
             </w:r>
@@ -2117,10 +2117,10 @@
             <w:tcW w:type="dxa" w:w="864"/>
             <w:vAlign w:val="center"/>
             <w:tcMar>
-              <w:top w:w="70" w:type="dxa"/>
-              <w:bottom w:w="70" w:type="dxa"/>
-              <w:left w:w="100" w:type="dxa"/>
-              <w:right w:w="100" w:type="dxa"/>
+              <w:top w:w="60" w:type="dxa"/>
+              <w:bottom w:w="60" w:type="dxa"/>
+              <w:left w:w="90" w:type="dxa"/>
+              <w:right w:w="90" w:type="dxa"/>
             </w:tcMar>
           </w:tcPr>
           <w:p>
@@ -2134,7 +2134,7 @@
                 <w:rFonts w:ascii="Times New Roman" w:hAnsi="Times New Roman"/>
                 <w:b w:val="0"/>
                 <w:color w:val="000000"/>
-                <w:sz w:val="17"/>
+                <w:sz w:val="16"/>
               </w:rPr>
               <w:t>12b</w:t>
             </w:r>
@@ -2145,10 +2145,10 @@
             <w:tcW w:type="dxa" w:w="3168"/>
             <w:vAlign w:val="center"/>
             <w:tcMar>
-              <w:top w:w="70" w:type="dxa"/>
-              <w:bottom w:w="70" w:type="dxa"/>
-              <w:left w:w="100" w:type="dxa"/>
-              <w:right w:w="100" w:type="dxa"/>
+              <w:top w:w="60" w:type="dxa"/>
+              <w:bottom w:w="60" w:type="dxa"/>
+              <w:left w:w="90" w:type="dxa"/>
+              <w:right w:w="90" w:type="dxa"/>
             </w:tcMar>
           </w:tcPr>
           <w:p>
@@ -2162,7 +2162,7 @@
                 <w:rFonts w:ascii="Times New Roman" w:hAnsi="Times New Roman"/>
                 <w:b w:val="0"/>
                 <w:color w:val="000000"/>
-                <w:sz w:val="17"/>
+                <w:sz w:val="16"/>
               </w:rPr>
               <w:t>Describe methods examining subgroups and interactions</w:t>
             </w:r>
@@ -2173,10 +2173,10 @@
             <w:tcW w:type="dxa" w:w="5616"/>
             <w:vAlign w:val="center"/>
             <w:tcMar>
-              <w:top w:w="70" w:type="dxa"/>
-              <w:bottom w:w="70" w:type="dxa"/>
-              <w:left w:w="100" w:type="dxa"/>
-              <w:right w:w="100" w:type="dxa"/>
+              <w:top w:w="60" w:type="dxa"/>
+              <w:bottom w:w="60" w:type="dxa"/>
+              <w:left w:w="90" w:type="dxa"/>
+              <w:right w:w="90" w:type="dxa"/>
             </w:tcMar>
           </w:tcPr>
           <w:p>
@@ -2190,9 +2190,9 @@
                 <w:rFonts w:ascii="Times New Roman" w:hAnsi="Times New Roman"/>
                 <w:b w:val="0"/>
                 <w:color w:val="000000"/>
-                <w:sz w:val="17"/>
+                <w:sz w:val="16"/>
               </w:rPr>
-              <w:t>Sections 2.3, 2.8: Unsupervised Leiden community detection (resolution = 0.5) resolving 12 distinct transcriptional phenotypic states (Clusters 0 to 11); multi-factor combinatorial epigenetic perturbation simulations (BETi + HATi + HDACi).</w:t>
+              <w:t>Sections 2.3, 2.8: Unsupervised Leiden community detection (resolution = 0.5) resolving 12 distinct phenotypic states (Clusters 0 to 11); multi-factor combinatorial epigenetic perturbation simulations (BETi + HATi + HDACi).</w:t>
             </w:r>
           </w:p>
         </w:tc>
@@ -2201,10 +2201,10 @@
             <w:tcW w:type="dxa" w:w="1728"/>
             <w:vAlign w:val="center"/>
             <w:tcMar>
-              <w:top w:w="70" w:type="dxa"/>
-              <w:bottom w:w="70" w:type="dxa"/>
-              <w:left w:w="100" w:type="dxa"/>
-              <w:right w:w="100" w:type="dxa"/>
+              <w:top w:w="60" w:type="dxa"/>
+              <w:bottom w:w="60" w:type="dxa"/>
+              <w:left w:w="90" w:type="dxa"/>
+              <w:right w:w="90" w:type="dxa"/>
             </w:tcMar>
           </w:tcPr>
           <w:p>
@@ -2218,9 +2218,9 @@
                 <w:rFonts w:ascii="Times New Roman" w:hAnsi="Times New Roman"/>
                 <w:b w:val="0"/>
                 <w:color w:val="000000"/>
-                <w:sz w:val="17"/>
+                <w:sz w:val="16"/>
               </w:rPr>
-              <w:t>Sections 2.3, 2.8; Figures 1c, 8</w:t>
+              <w:t>Pages 5–6, 8, 17 (Sections 2.3, 2.8; Figures 1c, 8)</w:t>
             </w:r>
           </w:p>
         </w:tc>
@@ -2231,10 +2231,10 @@
             <w:tcW w:type="dxa" w:w="2160"/>
             <w:vAlign w:val="center"/>
             <w:tcMar>
-              <w:top w:w="70" w:type="dxa"/>
-              <w:bottom w:w="70" w:type="dxa"/>
-              <w:left w:w="100" w:type="dxa"/>
-              <w:right w:w="100" w:type="dxa"/>
+              <w:top w:w="60" w:type="dxa"/>
+              <w:bottom w:w="60" w:type="dxa"/>
+              <w:left w:w="90" w:type="dxa"/>
+              <w:right w:w="90" w:type="dxa"/>
             </w:tcMar>
           </w:tcPr>
           <w:p>
@@ -2248,7 +2248,7 @@
                 <w:rFonts w:ascii="Times New Roman" w:hAnsi="Times New Roman"/>
                 <w:b w:val="0"/>
                 <w:color w:val="000000"/>
-                <w:sz w:val="17"/>
+                <w:sz w:val="16"/>
               </w:rPr>
               <w:t>Methods - Missing Data Handling</w:t>
             </w:r>
@@ -2259,10 +2259,10 @@
             <w:tcW w:type="dxa" w:w="864"/>
             <w:vAlign w:val="center"/>
             <w:tcMar>
-              <w:top w:w="70" w:type="dxa"/>
-              <w:bottom w:w="70" w:type="dxa"/>
-              <w:left w:w="100" w:type="dxa"/>
-              <w:right w:w="100" w:type="dxa"/>
+              <w:top w:w="60" w:type="dxa"/>
+              <w:bottom w:w="60" w:type="dxa"/>
+              <w:left w:w="90" w:type="dxa"/>
+              <w:right w:w="90" w:type="dxa"/>
             </w:tcMar>
           </w:tcPr>
           <w:p>
@@ -2276,7 +2276,7 @@
                 <w:rFonts w:ascii="Times New Roman" w:hAnsi="Times New Roman"/>
                 <w:b w:val="0"/>
                 <w:color w:val="000000"/>
-                <w:sz w:val="17"/>
+                <w:sz w:val="16"/>
               </w:rPr>
               <w:t>12c</w:t>
             </w:r>
@@ -2287,10 +2287,10 @@
             <w:tcW w:type="dxa" w:w="3168"/>
             <w:vAlign w:val="center"/>
             <w:tcMar>
-              <w:top w:w="70" w:type="dxa"/>
-              <w:bottom w:w="70" w:type="dxa"/>
-              <w:left w:w="100" w:type="dxa"/>
-              <w:right w:w="100" w:type="dxa"/>
+              <w:top w:w="60" w:type="dxa"/>
+              <w:bottom w:w="60" w:type="dxa"/>
+              <w:left w:w="90" w:type="dxa"/>
+              <w:right w:w="90" w:type="dxa"/>
             </w:tcMar>
           </w:tcPr>
           <w:p>
@@ -2304,7 +2304,7 @@
                 <w:rFonts w:ascii="Times New Roman" w:hAnsi="Times New Roman"/>
                 <w:b w:val="0"/>
                 <w:color w:val="000000"/>
-                <w:sz w:val="17"/>
+                <w:sz w:val="16"/>
               </w:rPr>
               <w:t>Explain how missing data were addressed</w:t>
             </w:r>
@@ -2315,10 +2315,10 @@
             <w:tcW w:type="dxa" w:w="5616"/>
             <w:vAlign w:val="center"/>
             <w:tcMar>
-              <w:top w:w="70" w:type="dxa"/>
-              <w:bottom w:w="70" w:type="dxa"/>
-              <w:left w:w="100" w:type="dxa"/>
-              <w:right w:w="100" w:type="dxa"/>
+              <w:top w:w="60" w:type="dxa"/>
+              <w:bottom w:w="60" w:type="dxa"/>
+              <w:left w:w="90" w:type="dxa"/>
+              <w:right w:w="90" w:type="dxa"/>
             </w:tcMar>
           </w:tcPr>
           <w:p>
@@ -2332,7 +2332,7 @@
                 <w:rFonts w:ascii="Times New Roman" w:hAnsi="Times New Roman"/>
                 <w:b w:val="0"/>
                 <w:color w:val="000000"/>
-                <w:sz w:val="17"/>
+                <w:sz w:val="16"/>
               </w:rPr>
               <w:t>Sections 2.1, 2.4: Zero-inflation handled naturally via interventional differential testing without artificial expression imputation; chunked Compressed Sparse Row (CSR) matrix representation in h5py and AnnData.</w:t>
             </w:r>
@@ -2343,10 +2343,10 @@
             <w:tcW w:type="dxa" w:w="1728"/>
             <w:vAlign w:val="center"/>
             <w:tcMar>
-              <w:top w:w="70" w:type="dxa"/>
-              <w:bottom w:w="70" w:type="dxa"/>
-              <w:left w:w="100" w:type="dxa"/>
-              <w:right w:w="100" w:type="dxa"/>
+              <w:top w:w="60" w:type="dxa"/>
+              <w:bottom w:w="60" w:type="dxa"/>
+              <w:left w:w="90" w:type="dxa"/>
+              <w:right w:w="90" w:type="dxa"/>
             </w:tcMar>
           </w:tcPr>
           <w:p>
@@ -2360,9 +2360,9 @@
                 <w:rFonts w:ascii="Times New Roman" w:hAnsi="Times New Roman"/>
                 <w:b w:val="0"/>
                 <w:color w:val="000000"/>
-                <w:sz w:val="17"/>
+                <w:sz w:val="16"/>
               </w:rPr>
-              <w:t>Sections 2.1, 2.4; Pages 2–3</w:t>
+              <w:t>Pages 4–6 (Sections 2.1, 2.4)</w:t>
             </w:r>
           </w:p>
         </w:tc>
@@ -2373,10 +2373,10 @@
             <w:tcW w:type="dxa" w:w="2160"/>
             <w:vAlign w:val="center"/>
             <w:tcMar>
-              <w:top w:w="70" w:type="dxa"/>
-              <w:bottom w:w="70" w:type="dxa"/>
-              <w:left w:w="100" w:type="dxa"/>
-              <w:right w:w="100" w:type="dxa"/>
+              <w:top w:w="60" w:type="dxa"/>
+              <w:bottom w:w="60" w:type="dxa"/>
+              <w:left w:w="90" w:type="dxa"/>
+              <w:right w:w="90" w:type="dxa"/>
             </w:tcMar>
           </w:tcPr>
           <w:p>
@@ -2390,9 +2390,9 @@
                 <w:rFonts w:ascii="Times New Roman" w:hAnsi="Times New Roman"/>
                 <w:b w:val="0"/>
                 <w:color w:val="000000"/>
-                <w:sz w:val="17"/>
+                <w:sz w:val="16"/>
               </w:rPr>
-              <w:t>Results - Participants / Cells</w:t>
+              <w:t>Methods - Sensitivity &amp; Cross-Validation</w:t>
             </w:r>
           </w:p>
         </w:tc>
@@ -2401,10 +2401,10 @@
             <w:tcW w:type="dxa" w:w="864"/>
             <w:vAlign w:val="center"/>
             <w:tcMar>
-              <w:top w:w="70" w:type="dxa"/>
-              <w:bottom w:w="70" w:type="dxa"/>
-              <w:left w:w="100" w:type="dxa"/>
-              <w:right w:w="100" w:type="dxa"/>
+              <w:top w:w="60" w:type="dxa"/>
+              <w:bottom w:w="60" w:type="dxa"/>
+              <w:left w:w="90" w:type="dxa"/>
+              <w:right w:w="90" w:type="dxa"/>
             </w:tcMar>
           </w:tcPr>
           <w:p>
@@ -2418,9 +2418,9 @@
                 <w:rFonts w:ascii="Times New Roman" w:hAnsi="Times New Roman"/>
                 <w:b w:val="0"/>
                 <w:color w:val="000000"/>
-                <w:sz w:val="17"/>
+                <w:sz w:val="16"/>
               </w:rPr>
-              <w:t>13a</w:t>
+              <w:t>12d</w:t>
             </w:r>
           </w:p>
         </w:tc>
@@ -2429,10 +2429,10 @@
             <w:tcW w:type="dxa" w:w="3168"/>
             <w:vAlign w:val="center"/>
             <w:tcMar>
-              <w:top w:w="70" w:type="dxa"/>
-              <w:bottom w:w="70" w:type="dxa"/>
-              <w:left w:w="100" w:type="dxa"/>
-              <w:right w:w="100" w:type="dxa"/>
+              <w:top w:w="60" w:type="dxa"/>
+              <w:bottom w:w="60" w:type="dxa"/>
+              <w:left w:w="90" w:type="dxa"/>
+              <w:right w:w="90" w:type="dxa"/>
             </w:tcMar>
           </w:tcPr>
           <w:p>
@@ -2446,9 +2446,9 @@
                 <w:rFonts w:ascii="Times New Roman" w:hAnsi="Times New Roman"/>
                 <w:b w:val="0"/>
                 <w:color w:val="000000"/>
-                <w:sz w:val="17"/>
+                <w:sz w:val="16"/>
               </w:rPr>
-              <w:t>Report numbers of individuals/cells at each stage of study</w:t>
+              <w:t>Describe sensitivity analyses and cross-validation methods</w:t>
             </w:r>
           </w:p>
         </w:tc>
@@ -2457,10 +2457,10 @@
             <w:tcW w:type="dxa" w:w="5616"/>
             <w:vAlign w:val="center"/>
             <w:tcMar>
-              <w:top w:w="70" w:type="dxa"/>
-              <w:bottom w:w="70" w:type="dxa"/>
-              <w:left w:w="100" w:type="dxa"/>
-              <w:right w:w="100" w:type="dxa"/>
+              <w:top w:w="60" w:type="dxa"/>
+              <w:bottom w:w="60" w:type="dxa"/>
+              <w:left w:w="90" w:type="dxa"/>
+              <w:right w:w="90" w:type="dxa"/>
             </w:tcMar>
           </w:tcPr>
           <w:p>
@@ -2474,9 +2474,9 @@
                 <w:rFonts w:ascii="Times New Roman" w:hAnsi="Times New Roman"/>
                 <w:b w:val="0"/>
                 <w:color w:val="000000"/>
-                <w:sz w:val="17"/>
+                <w:sz w:val="16"/>
               </w:rPr>
-              <w:t>Section 3.1: 95,678 single cells evaluated post-QC; 32,799 expressing genes; stratified across 12 Leiden clusters and 8 experimental sequencing lanes; 3,930 single-guide cells, 83,981 multi-guide cells, 7,767 negative-control cells.</w:t>
+              <w:t>Sections 2.6, 2.7: 5-fold cross-validation in XGBoost models (test R² = 0.742); empirical held-out CRISPRi ground-truth testing across multiple effect size thresholds (|log2 FC| &gt;= 0.50, |t| &gt;= 3.0); in silico driver knockout validation across N = 864 target genes.</w:t>
             </w:r>
           </w:p>
         </w:tc>
@@ -2485,10 +2485,10 @@
             <w:tcW w:type="dxa" w:w="1728"/>
             <w:vAlign w:val="center"/>
             <w:tcMar>
-              <w:top w:w="70" w:type="dxa"/>
-              <w:bottom w:w="70" w:type="dxa"/>
-              <w:left w:w="100" w:type="dxa"/>
-              <w:right w:w="100" w:type="dxa"/>
+              <w:top w:w="60" w:type="dxa"/>
+              <w:bottom w:w="60" w:type="dxa"/>
+              <w:left w:w="90" w:type="dxa"/>
+              <w:right w:w="90" w:type="dxa"/>
             </w:tcMar>
           </w:tcPr>
           <w:p>
@@ -2502,9 +2502,9 @@
                 <w:rFonts w:ascii="Times New Roman" w:hAnsi="Times New Roman"/>
                 <w:b w:val="0"/>
                 <w:color w:val="000000"/>
-                <w:sz w:val="17"/>
+                <w:sz w:val="16"/>
               </w:rPr>
-              <w:t>Section 3.1; Table 1; Figure 1</w:t>
+              <w:t>Pages 7–8, 15–17 (Sections 2.6, 2.7, 3.7, 3.8; Table 6; Figure 7)</w:t>
             </w:r>
           </w:p>
         </w:tc>
@@ -2515,10 +2515,10 @@
             <w:tcW w:type="dxa" w:w="2160"/>
             <w:vAlign w:val="center"/>
             <w:tcMar>
-              <w:top w:w="70" w:type="dxa"/>
-              <w:bottom w:w="70" w:type="dxa"/>
-              <w:left w:w="100" w:type="dxa"/>
-              <w:right w:w="100" w:type="dxa"/>
+              <w:top w:w="60" w:type="dxa"/>
+              <w:bottom w:w="60" w:type="dxa"/>
+              <w:left w:w="90" w:type="dxa"/>
+              <w:right w:w="90" w:type="dxa"/>
             </w:tcMar>
           </w:tcPr>
           <w:p>
@@ -2532,9 +2532,9 @@
                 <w:rFonts w:ascii="Times New Roman" w:hAnsi="Times New Roman"/>
                 <w:b w:val="0"/>
                 <w:color w:val="000000"/>
-                <w:sz w:val="17"/>
+                <w:sz w:val="16"/>
               </w:rPr>
-              <w:t>Results - Descriptive Data</w:t>
+              <w:t>Results - Participants / Cells</w:t>
             </w:r>
           </w:p>
         </w:tc>
@@ -2543,10 +2543,10 @@
             <w:tcW w:type="dxa" w:w="864"/>
             <w:vAlign w:val="center"/>
             <w:tcMar>
-              <w:top w:w="70" w:type="dxa"/>
-              <w:bottom w:w="70" w:type="dxa"/>
-              <w:left w:w="100" w:type="dxa"/>
-              <w:right w:w="100" w:type="dxa"/>
+              <w:top w:w="60" w:type="dxa"/>
+              <w:bottom w:w="60" w:type="dxa"/>
+              <w:left w:w="90" w:type="dxa"/>
+              <w:right w:w="90" w:type="dxa"/>
             </w:tcMar>
           </w:tcPr>
           <w:p>
@@ -2560,9 +2560,9 @@
                 <w:rFonts w:ascii="Times New Roman" w:hAnsi="Times New Roman"/>
                 <w:b w:val="0"/>
                 <w:color w:val="000000"/>
-                <w:sz w:val="17"/>
+                <w:sz w:val="16"/>
               </w:rPr>
-              <w:t>14a</w:t>
+              <w:t>13a</w:t>
             </w:r>
           </w:p>
         </w:tc>
@@ -2571,10 +2571,10 @@
             <w:tcW w:type="dxa" w:w="3168"/>
             <w:vAlign w:val="center"/>
             <w:tcMar>
-              <w:top w:w="70" w:type="dxa"/>
-              <w:bottom w:w="70" w:type="dxa"/>
-              <w:left w:w="100" w:type="dxa"/>
-              <w:right w:w="100" w:type="dxa"/>
+              <w:top w:w="60" w:type="dxa"/>
+              <w:bottom w:w="60" w:type="dxa"/>
+              <w:left w:w="90" w:type="dxa"/>
+              <w:right w:w="90" w:type="dxa"/>
             </w:tcMar>
           </w:tcPr>
           <w:p>
@@ -2588,9 +2588,9 @@
                 <w:rFonts w:ascii="Times New Roman" w:hAnsi="Times New Roman"/>
                 <w:b w:val="0"/>
                 <w:color w:val="000000"/>
-                <w:sz w:val="17"/>
+                <w:sz w:val="16"/>
               </w:rPr>
-              <w:t>Give characteristics of study participants/cells</w:t>
+              <w:t>Report numbers of individuals/cells at each stage of study</w:t>
             </w:r>
           </w:p>
         </w:tc>
@@ -2599,10 +2599,10 @@
             <w:tcW w:type="dxa" w:w="5616"/>
             <w:vAlign w:val="center"/>
             <w:tcMar>
-              <w:top w:w="70" w:type="dxa"/>
-              <w:bottom w:w="70" w:type="dxa"/>
-              <w:left w:w="100" w:type="dxa"/>
-              <w:right w:w="100" w:type="dxa"/>
+              <w:top w:w="60" w:type="dxa"/>
+              <w:bottom w:w="60" w:type="dxa"/>
+              <w:left w:w="90" w:type="dxa"/>
+              <w:right w:w="90" w:type="dxa"/>
             </w:tcMar>
           </w:tcPr>
           <w:p>
@@ -2616,9 +2616,9 @@
                 <w:rFonts w:ascii="Times New Roman" w:hAnsi="Times New Roman"/>
                 <w:b w:val="0"/>
                 <w:color w:val="000000"/>
-                <w:sz w:val="17"/>
+                <w:sz w:val="16"/>
               </w:rPr>
-              <w:t>Section 3.1, Table 1, Figure 1: Median 6,519 UMIs per cell (Figure 1a); median 2,138 detected genes per cell (Figure 1b); 819 targeted super-enhancer loci across 11,975 sgRNAs.</w:t>
+              <w:t>Section 3.1: 95,678 single cells evaluated post-QC; 32,799 expressing genes; stratified across 12 Leiden clusters and 8 experimental sequencing lanes; 3,930 single-guide cells, 83,981 multi-guide cells, 7,767 negative-control cells.</w:t>
             </w:r>
           </w:p>
         </w:tc>
@@ -2627,10 +2627,10 @@
             <w:tcW w:type="dxa" w:w="1728"/>
             <w:vAlign w:val="center"/>
             <w:tcMar>
-              <w:top w:w="70" w:type="dxa"/>
-              <w:bottom w:w="70" w:type="dxa"/>
-              <w:left w:w="100" w:type="dxa"/>
-              <w:right w:w="100" w:type="dxa"/>
+              <w:top w:w="60" w:type="dxa"/>
+              <w:bottom w:w="60" w:type="dxa"/>
+              <w:left w:w="90" w:type="dxa"/>
+              <w:right w:w="90" w:type="dxa"/>
             </w:tcMar>
           </w:tcPr>
           <w:p>
@@ -2644,9 +2644,9 @@
                 <w:rFonts w:ascii="Times New Roman" w:hAnsi="Times New Roman"/>
                 <w:b w:val="0"/>
                 <w:color w:val="000000"/>
-                <w:sz w:val="17"/>
+                <w:sz w:val="16"/>
               </w:rPr>
-              <w:t>Section 3.1; Table 1; Figure 1a–d</w:t>
+              <w:t>Pages 8–10 (Section 3.1; Table 1; Figure 1)</w:t>
             </w:r>
           </w:p>
         </w:tc>
@@ -2657,10 +2657,10 @@
             <w:tcW w:type="dxa" w:w="2160"/>
             <w:vAlign w:val="center"/>
             <w:tcMar>
-              <w:top w:w="70" w:type="dxa"/>
-              <w:bottom w:w="70" w:type="dxa"/>
-              <w:left w:w="100" w:type="dxa"/>
-              <w:right w:w="100" w:type="dxa"/>
+              <w:top w:w="60" w:type="dxa"/>
+              <w:bottom w:w="60" w:type="dxa"/>
+              <w:left w:w="90" w:type="dxa"/>
+              <w:right w:w="90" w:type="dxa"/>
             </w:tcMar>
           </w:tcPr>
           <w:p>
@@ -2674,9 +2674,9 @@
                 <w:rFonts w:ascii="Times New Roman" w:hAnsi="Times New Roman"/>
                 <w:b w:val="0"/>
                 <w:color w:val="000000"/>
-                <w:sz w:val="17"/>
+                <w:sz w:val="16"/>
               </w:rPr>
-              <w:t>Results - Main Findings</w:t>
+              <w:t>Results - Descriptive Data</w:t>
             </w:r>
           </w:p>
         </w:tc>
@@ -2685,10 +2685,10 @@
             <w:tcW w:type="dxa" w:w="864"/>
             <w:vAlign w:val="center"/>
             <w:tcMar>
-              <w:top w:w="70" w:type="dxa"/>
-              <w:bottom w:w="70" w:type="dxa"/>
-              <w:left w:w="100" w:type="dxa"/>
-              <w:right w:w="100" w:type="dxa"/>
+              <w:top w:w="60" w:type="dxa"/>
+              <w:bottom w:w="60" w:type="dxa"/>
+              <w:left w:w="90" w:type="dxa"/>
+              <w:right w:w="90" w:type="dxa"/>
             </w:tcMar>
           </w:tcPr>
           <w:p>
@@ -2702,9 +2702,9 @@
                 <w:rFonts w:ascii="Times New Roman" w:hAnsi="Times New Roman"/>
                 <w:b w:val="0"/>
                 <w:color w:val="000000"/>
-                <w:sz w:val="17"/>
+                <w:sz w:val="16"/>
               </w:rPr>
-              <w:t>16a</w:t>
+              <w:t>14a</w:t>
             </w:r>
           </w:p>
         </w:tc>
@@ -2713,10 +2713,10 @@
             <w:tcW w:type="dxa" w:w="3168"/>
             <w:vAlign w:val="center"/>
             <w:tcMar>
-              <w:top w:w="70" w:type="dxa"/>
-              <w:bottom w:w="70" w:type="dxa"/>
-              <w:left w:w="100" w:type="dxa"/>
-              <w:right w:w="100" w:type="dxa"/>
+              <w:top w:w="60" w:type="dxa"/>
+              <w:bottom w:w="60" w:type="dxa"/>
+              <w:left w:w="90" w:type="dxa"/>
+              <w:right w:w="90" w:type="dxa"/>
             </w:tcMar>
           </w:tcPr>
           <w:p>
@@ -2730,9 +2730,9 @@
                 <w:rFonts w:ascii="Times New Roman" w:hAnsi="Times New Roman"/>
                 <w:b w:val="0"/>
                 <w:color w:val="000000"/>
-                <w:sz w:val="17"/>
+                <w:sz w:val="16"/>
               </w:rPr>
-              <w:t>Give unadjusted and adjusted effect estimates and precision</w:t>
+              <w:t>Give characteristics of study participants/cells</w:t>
             </w:r>
           </w:p>
         </w:tc>
@@ -2741,10 +2741,10 @@
             <w:tcW w:type="dxa" w:w="5616"/>
             <w:vAlign w:val="center"/>
             <w:tcMar>
-              <w:top w:w="70" w:type="dxa"/>
-              <w:bottom w:w="70" w:type="dxa"/>
-              <w:left w:w="100" w:type="dxa"/>
-              <w:right w:w="100" w:type="dxa"/>
+              <w:top w:w="60" w:type="dxa"/>
+              <w:bottom w:w="60" w:type="dxa"/>
+              <w:left w:w="90" w:type="dxa"/>
+              <w:right w:w="90" w:type="dxa"/>
             </w:tcMar>
           </w:tcPr>
           <w:p>
@@ -2758,9 +2758,9 @@
                 <w:rFonts w:ascii="Times New Roman" w:hAnsi="Times New Roman"/>
                 <w:b w:val="0"/>
                 <w:color w:val="000000"/>
-                <w:sz w:val="17"/>
+                <w:sz w:val="16"/>
               </w:rPr>
-              <w:t>Sections 3.2–3.5, Tables 2–5, Figures 2–5: 15,059 physical TF–enhancer prior edges (Table 2); 1,110,566 functional perturbation responses (Section 3.3); 6,366,350 tripartite causal paths (Section 3.4); master drivers CTCF (118.7k paths), POLR2A (110.5k), JUND (75.3k), EP300 (67.3k), MYC (54.8k); TreeExplainer SHAP attribution ranking JUND (mean |SHAP| = 0.0296) and MYC (0.0174) with non-linear switch dynamics (Table 5).</w:t>
+              <w:t>Section 3.1, Table 1, Figure 1: Median 6,519 UMIs per cell (Figure 1a); median 2,138 detected genes per cell (Figure 1b); 819 targeted super-enhancer loci across 11,975 sgRNAs.</w:t>
             </w:r>
           </w:p>
         </w:tc>
@@ -2769,10 +2769,10 @@
             <w:tcW w:type="dxa" w:w="1728"/>
             <w:vAlign w:val="center"/>
             <w:tcMar>
-              <w:top w:w="70" w:type="dxa"/>
-              <w:bottom w:w="70" w:type="dxa"/>
-              <w:left w:w="100" w:type="dxa"/>
-              <w:right w:w="100" w:type="dxa"/>
+              <w:top w:w="60" w:type="dxa"/>
+              <w:bottom w:w="60" w:type="dxa"/>
+              <w:left w:w="90" w:type="dxa"/>
+              <w:right w:w="90" w:type="dxa"/>
             </w:tcMar>
           </w:tcPr>
           <w:p>
@@ -2786,9 +2786,9 @@
                 <w:rFonts w:ascii="Times New Roman" w:hAnsi="Times New Roman"/>
                 <w:b w:val="0"/>
                 <w:color w:val="000000"/>
-                <w:sz w:val="17"/>
+                <w:sz w:val="16"/>
               </w:rPr>
-              <w:t>Sections 3.2–3.6; Tables 2–5; Figures 2–6</w:t>
+              <w:t>Pages 8–10 (Section 3.1; Table 1; Figure 1a–d)</w:t>
             </w:r>
           </w:p>
         </w:tc>
@@ -2799,10 +2799,10 @@
             <w:tcW w:type="dxa" w:w="2160"/>
             <w:vAlign w:val="center"/>
             <w:tcMar>
-              <w:top w:w="70" w:type="dxa"/>
-              <w:bottom w:w="70" w:type="dxa"/>
-              <w:left w:w="100" w:type="dxa"/>
-              <w:right w:w="100" w:type="dxa"/>
+              <w:top w:w="60" w:type="dxa"/>
+              <w:bottom w:w="60" w:type="dxa"/>
+              <w:left w:w="90" w:type="dxa"/>
+              <w:right w:w="90" w:type="dxa"/>
             </w:tcMar>
           </w:tcPr>
           <w:p>
@@ -2816,9 +2816,9 @@
                 <w:rFonts w:ascii="Times New Roman" w:hAnsi="Times New Roman"/>
                 <w:b w:val="0"/>
                 <w:color w:val="000000"/>
-                <w:sz w:val="17"/>
+                <w:sz w:val="16"/>
               </w:rPr>
-              <w:t>Results - Benchmarking &amp; Validation</w:t>
+              <w:t>Results - Outcome Data</w:t>
             </w:r>
           </w:p>
         </w:tc>
@@ -2827,10 +2827,10 @@
             <w:tcW w:type="dxa" w:w="864"/>
             <w:vAlign w:val="center"/>
             <w:tcMar>
-              <w:top w:w="70" w:type="dxa"/>
-              <w:bottom w:w="70" w:type="dxa"/>
-              <w:left w:w="100" w:type="dxa"/>
-              <w:right w:w="100" w:type="dxa"/>
+              <w:top w:w="60" w:type="dxa"/>
+              <w:bottom w:w="60" w:type="dxa"/>
+              <w:left w:w="90" w:type="dxa"/>
+              <w:right w:w="90" w:type="dxa"/>
             </w:tcMar>
           </w:tcPr>
           <w:p>
@@ -2844,9 +2844,9 @@
                 <w:rFonts w:ascii="Times New Roman" w:hAnsi="Times New Roman"/>
                 <w:b w:val="0"/>
                 <w:color w:val="000000"/>
-                <w:sz w:val="17"/>
+                <w:sz w:val="16"/>
               </w:rPr>
-              <w:t>17</w:t>
+              <w:t>15</w:t>
             </w:r>
           </w:p>
         </w:tc>
@@ -2855,10 +2855,10 @@
             <w:tcW w:type="dxa" w:w="3168"/>
             <w:vAlign w:val="center"/>
             <w:tcMar>
-              <w:top w:w="70" w:type="dxa"/>
-              <w:bottom w:w="70" w:type="dxa"/>
-              <w:left w:w="100" w:type="dxa"/>
-              <w:right w:w="100" w:type="dxa"/>
+              <w:top w:w="60" w:type="dxa"/>
+              <w:bottom w:w="60" w:type="dxa"/>
+              <w:left w:w="90" w:type="dxa"/>
+              <w:right w:w="90" w:type="dxa"/>
             </w:tcMar>
           </w:tcPr>
           <w:p>
@@ -2872,9 +2872,9 @@
                 <w:rFonts w:ascii="Times New Roman" w:hAnsi="Times New Roman"/>
                 <w:b w:val="0"/>
                 <w:color w:val="000000"/>
-                <w:sz w:val="17"/>
+                <w:sz w:val="16"/>
               </w:rPr>
-              <w:t>Report other analyses done (sensitivity, benchmarking, validation)</w:t>
+              <w:t>Report numbers of outcome events or summary measures</w:t>
             </w:r>
           </w:p>
         </w:tc>
@@ -2883,10 +2883,10 @@
             <w:tcW w:type="dxa" w:w="5616"/>
             <w:vAlign w:val="center"/>
             <w:tcMar>
-              <w:top w:w="70" w:type="dxa"/>
-              <w:bottom w:w="70" w:type="dxa"/>
-              <w:left w:w="100" w:type="dxa"/>
-              <w:right w:w="100" w:type="dxa"/>
+              <w:top w:w="60" w:type="dxa"/>
+              <w:bottom w:w="60" w:type="dxa"/>
+              <w:left w:w="90" w:type="dxa"/>
+              <w:right w:w="90" w:type="dxa"/>
             </w:tcMar>
           </w:tcPr>
           <w:p>
@@ -2900,9 +2900,9 @@
                 <w:rFonts w:ascii="Times New Roman" w:hAnsi="Times New Roman"/>
                 <w:b w:val="0"/>
                 <w:color w:val="000000"/>
-                <w:sz w:val="17"/>
+                <w:sz w:val="16"/>
               </w:rPr>
-              <w:t>Sections 3.7–3.8, Tables 6–7, Figure 7: Causal Triangulation AUROC = 0.941 and AUPRC = 0.918 vs SCENIC (0.782 / 0.694), CellOracle (0.751 / 0.648), Scribe (0.688 / 0.582), PIDC (0.642 / 0.521); in silico driver knockout validation yielding Pearson r = 0.688, R² = 0.473 (p = 3.37 × 10⁻¹²², N = 864 genes); clinical validation in TCGA-BRCA (n = 160) and METABRIC (n = 320) basal-like cohorts.</w:t>
+              <w:t>Sections 3.2, 3.3: 15,059 physical TF–enhancer prior binding events across 161 unique TFs (Figure 2a; Table 2); 1,110,566 candidate interventional edges identified via vectorized Welch testing (Figure 3; Supplementary Data 2).</w:t>
             </w:r>
           </w:p>
         </w:tc>
@@ -2911,10 +2911,10 @@
             <w:tcW w:type="dxa" w:w="1728"/>
             <w:vAlign w:val="center"/>
             <w:tcMar>
-              <w:top w:w="70" w:type="dxa"/>
-              <w:bottom w:w="70" w:type="dxa"/>
-              <w:left w:w="100" w:type="dxa"/>
-              <w:right w:w="100" w:type="dxa"/>
+              <w:top w:w="60" w:type="dxa"/>
+              <w:bottom w:w="60" w:type="dxa"/>
+              <w:left w:w="90" w:type="dxa"/>
+              <w:right w:w="90" w:type="dxa"/>
             </w:tcMar>
           </w:tcPr>
           <w:p>
@@ -2928,9 +2928,9 @@
                 <w:rFonts w:ascii="Times New Roman" w:hAnsi="Times New Roman"/>
                 <w:b w:val="0"/>
                 <w:color w:val="000000"/>
-                <w:sz w:val="17"/>
+                <w:sz w:val="16"/>
               </w:rPr>
-              <w:t>Sections 3.7–3.8; Table 6; Figure 7a–e</w:t>
+              <w:t>Pages 10–11 (Sections 3.2, 3.3; Table 2; Figures 2, 3)</w:t>
             </w:r>
           </w:p>
         </w:tc>
@@ -2941,10 +2941,10 @@
             <w:tcW w:type="dxa" w:w="2160"/>
             <w:vAlign w:val="center"/>
             <w:tcMar>
-              <w:top w:w="70" w:type="dxa"/>
-              <w:bottom w:w="70" w:type="dxa"/>
-              <w:left w:w="100" w:type="dxa"/>
-              <w:right w:w="100" w:type="dxa"/>
+              <w:top w:w="60" w:type="dxa"/>
+              <w:bottom w:w="60" w:type="dxa"/>
+              <w:left w:w="90" w:type="dxa"/>
+              <w:right w:w="90" w:type="dxa"/>
             </w:tcMar>
           </w:tcPr>
           <w:p>
@@ -2958,9 +2958,9 @@
                 <w:rFonts w:ascii="Times New Roman" w:hAnsi="Times New Roman"/>
                 <w:b w:val="0"/>
                 <w:color w:val="000000"/>
-                <w:sz w:val="17"/>
+                <w:sz w:val="16"/>
               </w:rPr>
-              <w:t>Discussion - Key Results &amp; Conclusion</w:t>
+              <w:t>Results - Main Findings</w:t>
             </w:r>
           </w:p>
         </w:tc>
@@ -2969,10 +2969,10 @@
             <w:tcW w:type="dxa" w:w="864"/>
             <w:vAlign w:val="center"/>
             <w:tcMar>
-              <w:top w:w="70" w:type="dxa"/>
-              <w:bottom w:w="70" w:type="dxa"/>
-              <w:left w:w="100" w:type="dxa"/>
-              <w:right w:w="100" w:type="dxa"/>
+              <w:top w:w="60" w:type="dxa"/>
+              <w:bottom w:w="60" w:type="dxa"/>
+              <w:left w:w="90" w:type="dxa"/>
+              <w:right w:w="90" w:type="dxa"/>
             </w:tcMar>
           </w:tcPr>
           <w:p>
@@ -2986,9 +2986,9 @@
                 <w:rFonts w:ascii="Times New Roman" w:hAnsi="Times New Roman"/>
                 <w:b w:val="0"/>
                 <w:color w:val="000000"/>
-                <w:sz w:val="17"/>
+                <w:sz w:val="16"/>
               </w:rPr>
-              <w:t>18</w:t>
+              <w:t>16a</w:t>
             </w:r>
           </w:p>
         </w:tc>
@@ -2997,10 +2997,10 @@
             <w:tcW w:type="dxa" w:w="3168"/>
             <w:vAlign w:val="center"/>
             <w:tcMar>
-              <w:top w:w="70" w:type="dxa"/>
-              <w:bottom w:w="70" w:type="dxa"/>
-              <w:left w:w="100" w:type="dxa"/>
-              <w:right w:w="100" w:type="dxa"/>
+              <w:top w:w="60" w:type="dxa"/>
+              <w:bottom w:w="60" w:type="dxa"/>
+              <w:left w:w="90" w:type="dxa"/>
+              <w:right w:w="90" w:type="dxa"/>
             </w:tcMar>
           </w:tcPr>
           <w:p>
@@ -3014,9 +3014,9 @@
                 <w:rFonts w:ascii="Times New Roman" w:hAnsi="Times New Roman"/>
                 <w:b w:val="0"/>
                 <w:color w:val="000000"/>
-                <w:sz w:val="17"/>
+                <w:sz w:val="16"/>
               </w:rPr>
-              <w:t>Summarize key results with reference to study objectives</w:t>
+              <w:t>Give unadjusted and adjusted effect estimates and precision</w:t>
             </w:r>
           </w:p>
         </w:tc>
@@ -3025,10 +3025,10 @@
             <w:tcW w:type="dxa" w:w="5616"/>
             <w:vAlign w:val="center"/>
             <w:tcMar>
-              <w:top w:w="70" w:type="dxa"/>
-              <w:bottom w:w="70" w:type="dxa"/>
-              <w:left w:w="100" w:type="dxa"/>
-              <w:right w:w="100" w:type="dxa"/>
+              <w:top w:w="60" w:type="dxa"/>
+              <w:bottom w:w="60" w:type="dxa"/>
+              <w:left w:w="90" w:type="dxa"/>
+              <w:right w:w="90" w:type="dxa"/>
             </w:tcMar>
           </w:tcPr>
           <w:p>
@@ -3042,9 +3042,9 @@
                 <w:rFonts w:ascii="Times New Roman" w:hAnsi="Times New Roman"/>
                 <w:b w:val="0"/>
                 <w:color w:val="000000"/>
-                <w:sz w:val="17"/>
+                <w:sz w:val="16"/>
               </w:rPr>
-              <w:t>Section 4.1–4.6 (Conclusion): Synthesizes causal triangulation of 6.36M directed regulatory edges; elimination of observational dropout confounding (&gt;45% FDR); continuous DAG identifiability; non-linear AP-1/MYC switch dynamics; in silico knockout validation (R² = 0.473); and rational tri-modal epigenetic synergy (BETi + HATi + HDACi) collapsing 93.4% of core oncogenic circuitry while de-repressing tumor suppressor checkpoints.</w:t>
+              <w:t>Sections 3.4–3.6: Reconstructed 6,366,350 tripartite causal paths (Supplementary Data 3); prioritized master drivers: CTCF (118.7k edges, MRS = 0.986), POLR2A (110.5k, MRS = 0.983), EP300 (67.3k, MRS = 0.809), JUND (75.3k, MRS = 0.806), MYC (60.9k, MRS = 0.768), SIN3A, SP1, FOS, HDAC2, MAX (Tables 3, 4; Figures 4, 5); non-linear TreeExplainer SHAP attribution ranking JUND (0.0296) and MYC (0.0174) with threshold dynamics (Table 5; Figure 6).</w:t>
             </w:r>
           </w:p>
         </w:tc>
@@ -3053,10 +3053,10 @@
             <w:tcW w:type="dxa" w:w="1728"/>
             <w:vAlign w:val="center"/>
             <w:tcMar>
-              <w:top w:w="70" w:type="dxa"/>
-              <w:bottom w:w="70" w:type="dxa"/>
-              <w:left w:w="100" w:type="dxa"/>
-              <w:right w:w="100" w:type="dxa"/>
+              <w:top w:w="60" w:type="dxa"/>
+              <w:bottom w:w="60" w:type="dxa"/>
+              <w:left w:w="90" w:type="dxa"/>
+              <w:right w:w="90" w:type="dxa"/>
             </w:tcMar>
           </w:tcPr>
           <w:p>
@@ -3070,9 +3070,9 @@
                 <w:rFonts w:ascii="Times New Roman" w:hAnsi="Times New Roman"/>
                 <w:b w:val="0"/>
                 <w:color w:val="000000"/>
-                <w:sz w:val="17"/>
+                <w:sz w:val="16"/>
               </w:rPr>
-              <w:t>Section 4.6 (Conclusion); Pages 6–7</w:t>
+              <w:t>Pages 11–15 (Sections 3.4–3.6; Tables 3–5; Figures 4–6)</w:t>
             </w:r>
           </w:p>
         </w:tc>
@@ -3083,10 +3083,10 @@
             <w:tcW w:type="dxa" w:w="2160"/>
             <w:vAlign w:val="center"/>
             <w:tcMar>
-              <w:top w:w="70" w:type="dxa"/>
-              <w:bottom w:w="70" w:type="dxa"/>
-              <w:left w:w="100" w:type="dxa"/>
-              <w:right w:w="100" w:type="dxa"/>
+              <w:top w:w="60" w:type="dxa"/>
+              <w:bottom w:w="60" w:type="dxa"/>
+              <w:left w:w="90" w:type="dxa"/>
+              <w:right w:w="90" w:type="dxa"/>
             </w:tcMar>
           </w:tcPr>
           <w:p>
@@ -3100,9 +3100,9 @@
                 <w:rFonts w:ascii="Times New Roman" w:hAnsi="Times New Roman"/>
                 <w:b w:val="0"/>
                 <w:color w:val="000000"/>
-                <w:sz w:val="17"/>
+                <w:sz w:val="16"/>
               </w:rPr>
-              <w:t>Discussion - Limitations</w:t>
+              <w:t>Results - Benchmarking &amp; Validation</w:t>
             </w:r>
           </w:p>
         </w:tc>
@@ -3111,10 +3111,10 @@
             <w:tcW w:type="dxa" w:w="864"/>
             <w:vAlign w:val="center"/>
             <w:tcMar>
-              <w:top w:w="70" w:type="dxa"/>
-              <w:bottom w:w="70" w:type="dxa"/>
-              <w:left w:w="100" w:type="dxa"/>
-              <w:right w:w="100" w:type="dxa"/>
+              <w:top w:w="60" w:type="dxa"/>
+              <w:bottom w:w="60" w:type="dxa"/>
+              <w:left w:w="90" w:type="dxa"/>
+              <w:right w:w="90" w:type="dxa"/>
             </w:tcMar>
           </w:tcPr>
           <w:p>
@@ -3128,9 +3128,9 @@
                 <w:rFonts w:ascii="Times New Roman" w:hAnsi="Times New Roman"/>
                 <w:b w:val="0"/>
                 <w:color w:val="000000"/>
-                <w:sz w:val="17"/>
+                <w:sz w:val="16"/>
               </w:rPr>
-              <w:t>19</w:t>
+              <w:t>17</w:t>
             </w:r>
           </w:p>
         </w:tc>
@@ -3139,10 +3139,10 @@
             <w:tcW w:type="dxa" w:w="3168"/>
             <w:vAlign w:val="center"/>
             <w:tcMar>
-              <w:top w:w="70" w:type="dxa"/>
-              <w:bottom w:w="70" w:type="dxa"/>
-              <w:left w:w="100" w:type="dxa"/>
-              <w:right w:w="100" w:type="dxa"/>
+              <w:top w:w="60" w:type="dxa"/>
+              <w:bottom w:w="60" w:type="dxa"/>
+              <w:left w:w="90" w:type="dxa"/>
+              <w:right w:w="90" w:type="dxa"/>
             </w:tcMar>
           </w:tcPr>
           <w:p>
@@ -3156,9 +3156,9 @@
                 <w:rFonts w:ascii="Times New Roman" w:hAnsi="Times New Roman"/>
                 <w:b w:val="0"/>
                 <w:color w:val="000000"/>
-                <w:sz w:val="17"/>
+                <w:sz w:val="16"/>
               </w:rPr>
-              <w:t>Discuss limitations of study (potential bias, imprecision)</w:t>
+              <w:t>Report other analyses done (sensitivity, benchmarking, validation)</w:t>
             </w:r>
           </w:p>
         </w:tc>
@@ -3167,10 +3167,10 @@
             <w:tcW w:type="dxa" w:w="5616"/>
             <w:vAlign w:val="center"/>
             <w:tcMar>
-              <w:top w:w="70" w:type="dxa"/>
-              <w:bottom w:w="70" w:type="dxa"/>
-              <w:left w:w="100" w:type="dxa"/>
-              <w:right w:w="100" w:type="dxa"/>
+              <w:top w:w="60" w:type="dxa"/>
+              <w:bottom w:w="60" w:type="dxa"/>
+              <w:left w:w="90" w:type="dxa"/>
+              <w:right w:w="90" w:type="dxa"/>
             </w:tcMar>
           </w:tcPr>
           <w:p>
@@ -3184,9 +3184,9 @@
                 <w:rFonts w:ascii="Times New Roman" w:hAnsi="Times New Roman"/>
                 <w:b w:val="0"/>
                 <w:color w:val="000000"/>
-                <w:sz w:val="17"/>
+                <w:sz w:val="16"/>
               </w:rPr>
-              <w:t>Section 4.5: In vitro cell-line setting (MDA-MB-231); targeted silencing of non-coding enhancers rather than direct genetic coding knockouts of upstream transcription factor genes; computational rather than in vivo clinical trial validation of predicted combination therapies.</w:t>
+              <w:t>Sections 3.7–3.9: Triangulated Causal ML achieved AUROC = 0.8999, AUPRC = 0.8745, Top 25% Precision = 0.9013, FDR = 0.0987 vs ChIP-seq alone (AUROC 0.8890 / AUPRC 0.7228 / FDR 0.2440), Co-expression (0.7292 / 0.6814 / 0.3227), and GENIE3 (0.6698 / 0.6323 / 0.3573) (Table 6; Figure 7a,b); in silico driver KO validation yielded Pearson r = 0.688, R² = 0.473 (p = 3.37 × 10⁻¹²², N = 864 genes; Figure 7c); clinical Cox survival modeling in TCGA-BRCA (n = 160) and METABRIC (n = 320) confirmed significant risk for JUND (HR = 1.88, p &lt; 0.001), MYC (HR = 1.74, p &lt; 0.001), FOS (HR = 1.62, p = 0.001), EP300 (HR = 1.45, p = 0.006), and MAX (HR = 1.36, p = 0.019) (Figure 7d); in silico combinatorial therapy demonstrated 93% network collapse under BETi + HATi + HDACi vs 38% under chemotherapy (Figure 8; Table 7).</w:t>
             </w:r>
           </w:p>
         </w:tc>
@@ -3195,10 +3195,10 @@
             <w:tcW w:type="dxa" w:w="1728"/>
             <w:vAlign w:val="center"/>
             <w:tcMar>
-              <w:top w:w="70" w:type="dxa"/>
-              <w:bottom w:w="70" w:type="dxa"/>
-              <w:left w:w="100" w:type="dxa"/>
-              <w:right w:w="100" w:type="dxa"/>
+              <w:top w:w="60" w:type="dxa"/>
+              <w:bottom w:w="60" w:type="dxa"/>
+              <w:left w:w="90" w:type="dxa"/>
+              <w:right w:w="90" w:type="dxa"/>
             </w:tcMar>
           </w:tcPr>
           <w:p>
@@ -3212,9 +3212,9 @@
                 <w:rFonts w:ascii="Times New Roman" w:hAnsi="Times New Roman"/>
                 <w:b w:val="0"/>
                 <w:color w:val="000000"/>
-                <w:sz w:val="17"/>
+                <w:sz w:val="16"/>
               </w:rPr>
-              <w:t>Section 4.5; Page 7</w:t>
+              <w:t>Pages 15–18 (Sections 3.7–3.9; Tables 6, 7; Figures 7, 8)</w:t>
             </w:r>
           </w:p>
         </w:tc>
@@ -3225,10 +3225,10 @@
             <w:tcW w:type="dxa" w:w="2160"/>
             <w:vAlign w:val="center"/>
             <w:tcMar>
-              <w:top w:w="70" w:type="dxa"/>
-              <w:bottom w:w="70" w:type="dxa"/>
-              <w:left w:w="100" w:type="dxa"/>
-              <w:right w:w="100" w:type="dxa"/>
+              <w:top w:w="60" w:type="dxa"/>
+              <w:bottom w:w="60" w:type="dxa"/>
+              <w:left w:w="90" w:type="dxa"/>
+              <w:right w:w="90" w:type="dxa"/>
             </w:tcMar>
           </w:tcPr>
           <w:p>
@@ -3242,9 +3242,9 @@
                 <w:rFonts w:ascii="Times New Roman" w:hAnsi="Times New Roman"/>
                 <w:b w:val="0"/>
                 <w:color w:val="000000"/>
-                <w:sz w:val="17"/>
+                <w:sz w:val="16"/>
               </w:rPr>
-              <w:t>Discussion - Interpretation</w:t>
+              <w:t>Discussion - Key Results &amp; Conclusion</w:t>
             </w:r>
           </w:p>
         </w:tc>
@@ -3253,10 +3253,10 @@
             <w:tcW w:type="dxa" w:w="864"/>
             <w:vAlign w:val="center"/>
             <w:tcMar>
-              <w:top w:w="70" w:type="dxa"/>
-              <w:bottom w:w="70" w:type="dxa"/>
-              <w:left w:w="100" w:type="dxa"/>
-              <w:right w:w="100" w:type="dxa"/>
+              <w:top w:w="60" w:type="dxa"/>
+              <w:bottom w:w="60" w:type="dxa"/>
+              <w:left w:w="90" w:type="dxa"/>
+              <w:right w:w="90" w:type="dxa"/>
             </w:tcMar>
           </w:tcPr>
           <w:p>
@@ -3270,9 +3270,9 @@
                 <w:rFonts w:ascii="Times New Roman" w:hAnsi="Times New Roman"/>
                 <w:b w:val="0"/>
                 <w:color w:val="000000"/>
-                <w:sz w:val="17"/>
+                <w:sz w:val="16"/>
               </w:rPr>
-              <w:t>20</w:t>
+              <w:t>18</w:t>
             </w:r>
           </w:p>
         </w:tc>
@@ -3281,10 +3281,10 @@
             <w:tcW w:type="dxa" w:w="3168"/>
             <w:vAlign w:val="center"/>
             <w:tcMar>
-              <w:top w:w="70" w:type="dxa"/>
-              <w:bottom w:w="70" w:type="dxa"/>
-              <w:left w:w="100" w:type="dxa"/>
-              <w:right w:w="100" w:type="dxa"/>
+              <w:top w:w="60" w:type="dxa"/>
+              <w:bottom w:w="60" w:type="dxa"/>
+              <w:left w:w="90" w:type="dxa"/>
+              <w:right w:w="90" w:type="dxa"/>
             </w:tcMar>
           </w:tcPr>
           <w:p>
@@ -3298,9 +3298,9 @@
                 <w:rFonts w:ascii="Times New Roman" w:hAnsi="Times New Roman"/>
                 <w:b w:val="0"/>
                 <w:color w:val="000000"/>
-                <w:sz w:val="17"/>
+                <w:sz w:val="16"/>
               </w:rPr>
-              <w:t>Give a cautious overall interpretation of results</w:t>
+              <w:t>Summarize key results with reference to study objectives</w:t>
             </w:r>
           </w:p>
         </w:tc>
@@ -3309,10 +3309,10 @@
             <w:tcW w:type="dxa" w:w="5616"/>
             <w:vAlign w:val="center"/>
             <w:tcMar>
-              <w:top w:w="70" w:type="dxa"/>
-              <w:bottom w:w="70" w:type="dxa"/>
-              <w:left w:w="100" w:type="dxa"/>
-              <w:right w:w="100" w:type="dxa"/>
+              <w:top w:w="60" w:type="dxa"/>
+              <w:bottom w:w="60" w:type="dxa"/>
+              <w:left w:w="90" w:type="dxa"/>
+              <w:right w:w="90" w:type="dxa"/>
             </w:tcMar>
           </w:tcPr>
           <w:p>
@@ -3326,9 +3326,9 @@
                 <w:rFonts w:ascii="Times New Roman" w:hAnsi="Times New Roman"/>
                 <w:b w:val="0"/>
                 <w:color w:val="000000"/>
-                <w:sz w:val="17"/>
+                <w:sz w:val="16"/>
               </w:rPr>
-              <w:t>Sections 4.2–4.6: Triangulating randomized Perturb-seq interventions with physical ChIP occupancy provides a mathematically defensible, biologically validated approach for cancer gene regulatory network discovery and overcoming drug resistance in TNBC.</w:t>
+              <w:t>Sections 4.1–4.4, Section 5 (Conclusion): Successfully triangulated 6.36M directed causal edges; resolved mathematical failure of observational GRNs (&gt;45% FDR); established Pearlian interventional identifiability; unmasked non-linear AP-1/MYC switch dynamics; in silico knockout validation (R² = 0.473); and formulated tri-modal epigenetic combination therapy (BETi + HATi + HDACi) collapsing 93.4% of oncogenic super-enhancers while de-repressing tumor suppressors.</w:t>
             </w:r>
           </w:p>
         </w:tc>
@@ -3337,10 +3337,10 @@
             <w:tcW w:type="dxa" w:w="1728"/>
             <w:vAlign w:val="center"/>
             <w:tcMar>
-              <w:top w:w="70" w:type="dxa"/>
-              <w:bottom w:w="70" w:type="dxa"/>
-              <w:left w:w="100" w:type="dxa"/>
-              <w:right w:w="100" w:type="dxa"/>
+              <w:top w:w="60" w:type="dxa"/>
+              <w:bottom w:w="60" w:type="dxa"/>
+              <w:left w:w="90" w:type="dxa"/>
+              <w:right w:w="90" w:type="dxa"/>
             </w:tcMar>
           </w:tcPr>
           <w:p>
@@ -3354,9 +3354,9 @@
                 <w:rFonts w:ascii="Times New Roman" w:hAnsi="Times New Roman"/>
                 <w:b w:val="0"/>
                 <w:color w:val="000000"/>
-                <w:sz w:val="17"/>
+                <w:sz w:val="16"/>
               </w:rPr>
-              <w:t>Sections 4.2–4.6; Page 7</w:t>
+              <w:t>Pages 18–20, 21 (Sections 4.1–4.4; Section 5 Conclusion)</w:t>
             </w:r>
           </w:p>
         </w:tc>
@@ -3367,10 +3367,10 @@
             <w:tcW w:type="dxa" w:w="2160"/>
             <w:vAlign w:val="center"/>
             <w:tcMar>
-              <w:top w:w="70" w:type="dxa"/>
-              <w:bottom w:w="70" w:type="dxa"/>
-              <w:left w:w="100" w:type="dxa"/>
-              <w:right w:w="100" w:type="dxa"/>
+              <w:top w:w="60" w:type="dxa"/>
+              <w:bottom w:w="60" w:type="dxa"/>
+              <w:left w:w="90" w:type="dxa"/>
+              <w:right w:w="90" w:type="dxa"/>
             </w:tcMar>
           </w:tcPr>
           <w:p>
@@ -3384,9 +3384,9 @@
                 <w:rFonts w:ascii="Times New Roman" w:hAnsi="Times New Roman"/>
                 <w:b w:val="0"/>
                 <w:color w:val="000000"/>
-                <w:sz w:val="17"/>
+                <w:sz w:val="16"/>
               </w:rPr>
-              <w:t>Funding &amp; Disclosures</w:t>
+              <w:t>Discussion - Limitations</w:t>
             </w:r>
           </w:p>
         </w:tc>
@@ -3395,10 +3395,10 @@
             <w:tcW w:type="dxa" w:w="864"/>
             <w:vAlign w:val="center"/>
             <w:tcMar>
-              <w:top w:w="70" w:type="dxa"/>
-              <w:bottom w:w="70" w:type="dxa"/>
-              <w:left w:w="100" w:type="dxa"/>
-              <w:right w:w="100" w:type="dxa"/>
+              <w:top w:w="60" w:type="dxa"/>
+              <w:bottom w:w="60" w:type="dxa"/>
+              <w:left w:w="90" w:type="dxa"/>
+              <w:right w:w="90" w:type="dxa"/>
             </w:tcMar>
           </w:tcPr>
           <w:p>
@@ -3412,9 +3412,9 @@
                 <w:rFonts w:ascii="Times New Roman" w:hAnsi="Times New Roman"/>
                 <w:b w:val="0"/>
                 <w:color w:val="000000"/>
-                <w:sz w:val="17"/>
+                <w:sz w:val="16"/>
               </w:rPr>
-              <w:t>22</w:t>
+              <w:t>19</w:t>
             </w:r>
           </w:p>
         </w:tc>
@@ -3423,10 +3423,10 @@
             <w:tcW w:type="dxa" w:w="3168"/>
             <w:vAlign w:val="center"/>
             <w:tcMar>
-              <w:top w:w="70" w:type="dxa"/>
-              <w:bottom w:w="70" w:type="dxa"/>
-              <w:left w:w="100" w:type="dxa"/>
-              <w:right w:w="100" w:type="dxa"/>
+              <w:top w:w="60" w:type="dxa"/>
+              <w:bottom w:w="60" w:type="dxa"/>
+              <w:left w:w="90" w:type="dxa"/>
+              <w:right w:w="90" w:type="dxa"/>
             </w:tcMar>
           </w:tcPr>
           <w:p>
@@ -3440,9 +3440,9 @@
                 <w:rFonts w:ascii="Times New Roman" w:hAnsi="Times New Roman"/>
                 <w:b w:val="0"/>
                 <w:color w:val="000000"/>
-                <w:sz w:val="17"/>
+                <w:sz w:val="16"/>
               </w:rPr>
-              <w:t>Give source of funding and role of funders</w:t>
+              <w:t>Discuss limitations of study (potential bias, imprecision)</w:t>
             </w:r>
           </w:p>
         </w:tc>
@@ -3451,10 +3451,10 @@
             <w:tcW w:type="dxa" w:w="5616"/>
             <w:vAlign w:val="center"/>
             <w:tcMar>
-              <w:top w:w="70" w:type="dxa"/>
-              <w:bottom w:w="70" w:type="dxa"/>
-              <w:left w:w="100" w:type="dxa"/>
-              <w:right w:w="100" w:type="dxa"/>
+              <w:top w:w="60" w:type="dxa"/>
+              <w:bottom w:w="60" w:type="dxa"/>
+              <w:left w:w="90" w:type="dxa"/>
+              <w:right w:w="90" w:type="dxa"/>
             </w:tcMar>
           </w:tcPr>
           <w:p>
@@ -3468,9 +3468,9 @@
                 <w:rFonts w:ascii="Times New Roman" w:hAnsi="Times New Roman"/>
                 <w:b w:val="0"/>
                 <w:color w:val="000000"/>
-                <w:sz w:val="17"/>
+                <w:sz w:val="16"/>
               </w:rPr>
-              <w:t>Declarations (Page 7): Supported by National Science &amp; Technology (NST) Fellowship (2025–2026), Ministry of Science and Technology, Government of the People's Republic of Bangladesh (Awardee: Omar Faroque, Group: Physical &amp; Mathematical Sciences). Funders had no role in study design, data collection, analysis, or manuscript preparation.</w:t>
+              <w:t>Section 4.5: Reliance on preclinical in vitro cell line (MDA-MB-231) requiring future expansion into patient-derived organoids (PDOs); targeted silencing of non-coding enhancers rather than direct genetic knockouts of upstream TF coding genes; absence of single-cell Hi-C/Micro-C 3D looping data; computational rather than in vivo clinical trial testing of combination regimens.</w:t>
             </w:r>
           </w:p>
         </w:tc>
@@ -3479,10 +3479,10 @@
             <w:tcW w:type="dxa" w:w="1728"/>
             <w:vAlign w:val="center"/>
             <w:tcMar>
-              <w:top w:w="70" w:type="dxa"/>
-              <w:bottom w:w="70" w:type="dxa"/>
-              <w:left w:w="100" w:type="dxa"/>
-              <w:right w:w="100" w:type="dxa"/>
+              <w:top w:w="60" w:type="dxa"/>
+              <w:bottom w:w="60" w:type="dxa"/>
+              <w:left w:w="90" w:type="dxa"/>
+              <w:right w:w="90" w:type="dxa"/>
             </w:tcMar>
           </w:tcPr>
           <w:p>
@@ -3496,9 +3496,435 @@
                 <w:rFonts w:ascii="Times New Roman" w:hAnsi="Times New Roman"/>
                 <w:b w:val="0"/>
                 <w:color w:val="000000"/>
-                <w:sz w:val="17"/>
+                <w:sz w:val="16"/>
               </w:rPr>
-              <w:t>Declarations; Page 7</w:t>
+              <w:t>Pages 20–21 (Section 4.5)</w:t>
+            </w:r>
+          </w:p>
+        </w:tc>
+      </w:tr>
+      <w:tr>
+        <w:tc>
+          <w:tcPr>
+            <w:tcW w:type="dxa" w:w="2160"/>
+            <w:vAlign w:val="center"/>
+            <w:tcMar>
+              <w:top w:w="60" w:type="dxa"/>
+              <w:bottom w:w="60" w:type="dxa"/>
+              <w:left w:w="90" w:type="dxa"/>
+              <w:right w:w="90" w:type="dxa"/>
+            </w:tcMar>
+          </w:tcPr>
+          <w:p>
+            <w:pPr>
+              <w:spacing w:before="20" w:after="20" w:line="252" w:lineRule="auto"/>
+              <w:jc w:val="left"/>
+            </w:pPr>
+            <w:r/>
+            <w:r>
+              <w:rPr>
+                <w:rFonts w:ascii="Times New Roman" w:hAnsi="Times New Roman"/>
+                <w:b w:val="0"/>
+                <w:color w:val="000000"/>
+                <w:sz w:val="16"/>
+              </w:rPr>
+              <w:t>Discussion - Interpretation</w:t>
+            </w:r>
+          </w:p>
+        </w:tc>
+        <w:tc>
+          <w:tcPr>
+            <w:tcW w:type="dxa" w:w="864"/>
+            <w:vAlign w:val="center"/>
+            <w:tcMar>
+              <w:top w:w="60" w:type="dxa"/>
+              <w:bottom w:w="60" w:type="dxa"/>
+              <w:left w:w="90" w:type="dxa"/>
+              <w:right w:w="90" w:type="dxa"/>
+            </w:tcMar>
+          </w:tcPr>
+          <w:p>
+            <w:pPr>
+              <w:spacing w:before="20" w:after="20" w:line="252" w:lineRule="auto"/>
+              <w:jc w:val="center"/>
+            </w:pPr>
+            <w:r/>
+            <w:r>
+              <w:rPr>
+                <w:rFonts w:ascii="Times New Roman" w:hAnsi="Times New Roman"/>
+                <w:b w:val="0"/>
+                <w:color w:val="000000"/>
+                <w:sz w:val="16"/>
+              </w:rPr>
+              <w:t>20</w:t>
+            </w:r>
+          </w:p>
+        </w:tc>
+        <w:tc>
+          <w:tcPr>
+            <w:tcW w:type="dxa" w:w="3168"/>
+            <w:vAlign w:val="center"/>
+            <w:tcMar>
+              <w:top w:w="60" w:type="dxa"/>
+              <w:bottom w:w="60" w:type="dxa"/>
+              <w:left w:w="90" w:type="dxa"/>
+              <w:right w:w="90" w:type="dxa"/>
+            </w:tcMar>
+          </w:tcPr>
+          <w:p>
+            <w:pPr>
+              <w:spacing w:before="20" w:after="20" w:line="252" w:lineRule="auto"/>
+              <w:jc w:val="both"/>
+            </w:pPr>
+            <w:r/>
+            <w:r>
+              <w:rPr>
+                <w:rFonts w:ascii="Times New Roman" w:hAnsi="Times New Roman"/>
+                <w:b w:val="0"/>
+                <w:color w:val="000000"/>
+                <w:sz w:val="16"/>
+              </w:rPr>
+              <w:t>Give a cautious overall interpretation of results</w:t>
+            </w:r>
+          </w:p>
+        </w:tc>
+        <w:tc>
+          <w:tcPr>
+            <w:tcW w:type="dxa" w:w="5616"/>
+            <w:vAlign w:val="center"/>
+            <w:tcMar>
+              <w:top w:w="60" w:type="dxa"/>
+              <w:bottom w:w="60" w:type="dxa"/>
+              <w:left w:w="90" w:type="dxa"/>
+              <w:right w:w="90" w:type="dxa"/>
+            </w:tcMar>
+          </w:tcPr>
+          <w:p>
+            <w:pPr>
+              <w:spacing w:before="20" w:after="20" w:line="252" w:lineRule="auto"/>
+              <w:jc w:val="both"/>
+            </w:pPr>
+            <w:r/>
+            <w:r>
+              <w:rPr>
+                <w:rFonts w:ascii="Times New Roman" w:hAnsi="Times New Roman"/>
+                <w:b w:val="0"/>
+                <w:color w:val="000000"/>
+                <w:sz w:val="16"/>
+              </w:rPr>
+              <w:t>Sections 4.2–4.4, Section 5 (Conclusion): Triangulating randomized Perturb-seq interventions with physical ChIP-seq priors provides a mathematically principled, biologically validated paradigm for discovering causal oncogenic drivers and designing rational epigenetic combination therapies.</w:t>
+            </w:r>
+          </w:p>
+        </w:tc>
+        <w:tc>
+          <w:tcPr>
+            <w:tcW w:type="dxa" w:w="1728"/>
+            <w:vAlign w:val="center"/>
+            <w:tcMar>
+              <w:top w:w="60" w:type="dxa"/>
+              <w:bottom w:w="60" w:type="dxa"/>
+              <w:left w:w="90" w:type="dxa"/>
+              <w:right w:w="90" w:type="dxa"/>
+            </w:tcMar>
+          </w:tcPr>
+          <w:p>
+            <w:pPr>
+              <w:spacing w:before="20" w:after="20" w:line="252" w:lineRule="auto"/>
+              <w:jc w:val="left"/>
+            </w:pPr>
+            <w:r/>
+            <w:r>
+              <w:rPr>
+                <w:rFonts w:ascii="Times New Roman" w:hAnsi="Times New Roman"/>
+                <w:b w:val="0"/>
+                <w:color w:val="000000"/>
+                <w:sz w:val="16"/>
+              </w:rPr>
+              <w:t>Pages 19–21 (Sections 4.2–4.4; Section 5 Conclusion)</w:t>
+            </w:r>
+          </w:p>
+        </w:tc>
+      </w:tr>
+      <w:tr>
+        <w:tc>
+          <w:tcPr>
+            <w:tcW w:type="dxa" w:w="2160"/>
+            <w:vAlign w:val="center"/>
+            <w:tcMar>
+              <w:top w:w="60" w:type="dxa"/>
+              <w:bottom w:w="60" w:type="dxa"/>
+              <w:left w:w="90" w:type="dxa"/>
+              <w:right w:w="90" w:type="dxa"/>
+            </w:tcMar>
+          </w:tcPr>
+          <w:p>
+            <w:pPr>
+              <w:spacing w:before="20" w:after="20" w:line="252" w:lineRule="auto"/>
+              <w:jc w:val="left"/>
+            </w:pPr>
+            <w:r/>
+            <w:r>
+              <w:rPr>
+                <w:rFonts w:ascii="Times New Roman" w:hAnsi="Times New Roman"/>
+                <w:b w:val="0"/>
+                <w:color w:val="000000"/>
+                <w:sz w:val="16"/>
+              </w:rPr>
+              <w:t>Discussion - Generalisability</w:t>
+            </w:r>
+          </w:p>
+        </w:tc>
+        <w:tc>
+          <w:tcPr>
+            <w:tcW w:type="dxa" w:w="864"/>
+            <w:vAlign w:val="center"/>
+            <w:tcMar>
+              <w:top w:w="60" w:type="dxa"/>
+              <w:bottom w:w="60" w:type="dxa"/>
+              <w:left w:w="90" w:type="dxa"/>
+              <w:right w:w="90" w:type="dxa"/>
+            </w:tcMar>
+          </w:tcPr>
+          <w:p>
+            <w:pPr>
+              <w:spacing w:before="20" w:after="20" w:line="252" w:lineRule="auto"/>
+              <w:jc w:val="center"/>
+            </w:pPr>
+            <w:r/>
+            <w:r>
+              <w:rPr>
+                <w:rFonts w:ascii="Times New Roman" w:hAnsi="Times New Roman"/>
+                <w:b w:val="0"/>
+                <w:color w:val="000000"/>
+                <w:sz w:val="16"/>
+              </w:rPr>
+              <w:t>21</w:t>
+            </w:r>
+          </w:p>
+        </w:tc>
+        <w:tc>
+          <w:tcPr>
+            <w:tcW w:type="dxa" w:w="3168"/>
+            <w:vAlign w:val="center"/>
+            <w:tcMar>
+              <w:top w:w="60" w:type="dxa"/>
+              <w:bottom w:w="60" w:type="dxa"/>
+              <w:left w:w="90" w:type="dxa"/>
+              <w:right w:w="90" w:type="dxa"/>
+            </w:tcMar>
+          </w:tcPr>
+          <w:p>
+            <w:pPr>
+              <w:spacing w:before="20" w:after="20" w:line="252" w:lineRule="auto"/>
+              <w:jc w:val="both"/>
+            </w:pPr>
+            <w:r/>
+            <w:r>
+              <w:rPr>
+                <w:rFonts w:ascii="Times New Roman" w:hAnsi="Times New Roman"/>
+                <w:b w:val="0"/>
+                <w:color w:val="000000"/>
+                <w:sz w:val="16"/>
+              </w:rPr>
+              <w:t>Discuss the generalisability (external validity) of study results</w:t>
+            </w:r>
+          </w:p>
+        </w:tc>
+        <w:tc>
+          <w:tcPr>
+            <w:tcW w:type="dxa" w:w="5616"/>
+            <w:vAlign w:val="center"/>
+            <w:tcMar>
+              <w:top w:w="60" w:type="dxa"/>
+              <w:bottom w:w="60" w:type="dxa"/>
+              <w:left w:w="90" w:type="dxa"/>
+              <w:right w:w="90" w:type="dxa"/>
+            </w:tcMar>
+          </w:tcPr>
+          <w:p>
+            <w:pPr>
+              <w:spacing w:before="20" w:after="20" w:line="252" w:lineRule="auto"/>
+              <w:jc w:val="both"/>
+            </w:pPr>
+            <w:r/>
+            <w:r>
+              <w:rPr>
+                <w:rFonts w:ascii="Times New Roman" w:hAnsi="Times New Roman"/>
+                <w:b w:val="0"/>
+                <w:color w:val="000000"/>
+                <w:sz w:val="16"/>
+              </w:rPr>
+              <w:t>Sections 4.4, 4.5: Demonstrates broad applicability of the causal triangulation framework across other treatment-refractory cancers characterized by super-enhancer addiction; clinical validation across independent patient cohorts (TCGA-BRCA, METABRIC) confirms prognostic generalisability beyond cell line models.</w:t>
+            </w:r>
+          </w:p>
+        </w:tc>
+        <w:tc>
+          <w:tcPr>
+            <w:tcW w:type="dxa" w:w="1728"/>
+            <w:vAlign w:val="center"/>
+            <w:tcMar>
+              <w:top w:w="60" w:type="dxa"/>
+              <w:bottom w:w="60" w:type="dxa"/>
+              <w:left w:w="90" w:type="dxa"/>
+              <w:right w:w="90" w:type="dxa"/>
+            </w:tcMar>
+          </w:tcPr>
+          <w:p>
+            <w:pPr>
+              <w:spacing w:before="20" w:after="20" w:line="252" w:lineRule="auto"/>
+              <w:jc w:val="left"/>
+            </w:pPr>
+            <w:r/>
+            <w:r>
+              <w:rPr>
+                <w:rFonts w:ascii="Times New Roman" w:hAnsi="Times New Roman"/>
+                <w:b w:val="0"/>
+                <w:color w:val="000000"/>
+                <w:sz w:val="16"/>
+              </w:rPr>
+              <w:t>Pages 20–21 (Sections 4.4, 4.5)</w:t>
+            </w:r>
+          </w:p>
+        </w:tc>
+      </w:tr>
+      <w:tr>
+        <w:tc>
+          <w:tcPr>
+            <w:tcW w:type="dxa" w:w="2160"/>
+            <w:vAlign w:val="center"/>
+            <w:tcMar>
+              <w:top w:w="60" w:type="dxa"/>
+              <w:bottom w:w="60" w:type="dxa"/>
+              <w:left w:w="90" w:type="dxa"/>
+              <w:right w:w="90" w:type="dxa"/>
+            </w:tcMar>
+          </w:tcPr>
+          <w:p>
+            <w:pPr>
+              <w:spacing w:before="20" w:after="20" w:line="252" w:lineRule="auto"/>
+              <w:jc w:val="left"/>
+            </w:pPr>
+            <w:r/>
+            <w:r>
+              <w:rPr>
+                <w:rFonts w:ascii="Times New Roman" w:hAnsi="Times New Roman"/>
+                <w:b w:val="0"/>
+                <w:color w:val="000000"/>
+                <w:sz w:val="16"/>
+              </w:rPr>
+              <w:t>Funding &amp; Data/Code Availability</w:t>
+            </w:r>
+          </w:p>
+        </w:tc>
+        <w:tc>
+          <w:tcPr>
+            <w:tcW w:type="dxa" w:w="864"/>
+            <w:vAlign w:val="center"/>
+            <w:tcMar>
+              <w:top w:w="60" w:type="dxa"/>
+              <w:bottom w:w="60" w:type="dxa"/>
+              <w:left w:w="90" w:type="dxa"/>
+              <w:right w:w="90" w:type="dxa"/>
+            </w:tcMar>
+          </w:tcPr>
+          <w:p>
+            <w:pPr>
+              <w:spacing w:before="20" w:after="20" w:line="252" w:lineRule="auto"/>
+              <w:jc w:val="center"/>
+            </w:pPr>
+            <w:r/>
+            <w:r>
+              <w:rPr>
+                <w:rFonts w:ascii="Times New Roman" w:hAnsi="Times New Roman"/>
+                <w:b w:val="0"/>
+                <w:color w:val="000000"/>
+                <w:sz w:val="16"/>
+              </w:rPr>
+              <w:t>22</w:t>
+            </w:r>
+          </w:p>
+        </w:tc>
+        <w:tc>
+          <w:tcPr>
+            <w:tcW w:type="dxa" w:w="3168"/>
+            <w:vAlign w:val="center"/>
+            <w:tcMar>
+              <w:top w:w="60" w:type="dxa"/>
+              <w:bottom w:w="60" w:type="dxa"/>
+              <w:left w:w="90" w:type="dxa"/>
+              <w:right w:w="90" w:type="dxa"/>
+            </w:tcMar>
+          </w:tcPr>
+          <w:p>
+            <w:pPr>
+              <w:spacing w:before="20" w:after="20" w:line="252" w:lineRule="auto"/>
+              <w:jc w:val="both"/>
+            </w:pPr>
+            <w:r/>
+            <w:r>
+              <w:rPr>
+                <w:rFonts w:ascii="Times New Roman" w:hAnsi="Times New Roman"/>
+                <w:b w:val="0"/>
+                <w:color w:val="000000"/>
+                <w:sz w:val="16"/>
+              </w:rPr>
+              <w:t>Give source of funding, role of funders, and accessibility of data/code</w:t>
+            </w:r>
+          </w:p>
+        </w:tc>
+        <w:tc>
+          <w:tcPr>
+            <w:tcW w:type="dxa" w:w="5616"/>
+            <w:vAlign w:val="center"/>
+            <w:tcMar>
+              <w:top w:w="60" w:type="dxa"/>
+              <w:bottom w:w="60" w:type="dxa"/>
+              <w:left w:w="90" w:type="dxa"/>
+              <w:right w:w="90" w:type="dxa"/>
+            </w:tcMar>
+          </w:tcPr>
+          <w:p>
+            <w:pPr>
+              <w:spacing w:before="20" w:after="20" w:line="252" w:lineRule="auto"/>
+              <w:jc w:val="both"/>
+            </w:pPr>
+            <w:r/>
+            <w:r>
+              <w:rPr>
+                <w:rFonts w:ascii="Times New Roman" w:hAnsi="Times New Roman"/>
+                <w:b w:val="0"/>
+                <w:color w:val="000000"/>
+                <w:sz w:val="16"/>
+              </w:rPr>
+              <w:t>Section 5 (Data and Code Availability) &amp; Declarations: Supported by National Science &amp; Technology (NST) Fellowship (2025–2026), Ministry of Science and Technology, Government of the People's Republic of Bangladesh (Awardee: Omar Faroque). All code, notebooks, and models are available under MIT License at https://github.com/Omarrfaroqueiu79/tnbc-causal-grn; Zenodo DOI: 10.5281/zenodo.10892345; GEO accessions GSE224986 and GSE223812.</w:t>
+            </w:r>
+          </w:p>
+        </w:tc>
+        <w:tc>
+          <w:tcPr>
+            <w:tcW w:type="dxa" w:w="1728"/>
+            <w:vAlign w:val="center"/>
+            <w:tcMar>
+              <w:top w:w="60" w:type="dxa"/>
+              <w:bottom w:w="60" w:type="dxa"/>
+              <w:left w:w="90" w:type="dxa"/>
+              <w:right w:w="90" w:type="dxa"/>
+            </w:tcMar>
+          </w:tcPr>
+          <w:p>
+            <w:pPr>
+              <w:spacing w:before="20" w:after="20" w:line="252" w:lineRule="auto"/>
+              <w:jc w:val="left"/>
+            </w:pPr>
+            <w:r/>
+            <w:r>
+              <w:rPr>
+                <w:rFonts w:ascii="Times New Roman" w:hAnsi="Times New Roman"/>
+                <w:b w:val="0"/>
+                <w:color w:val="000000"/>
+                <w:sz w:val="16"/>
+              </w:rPr>
+              <w:t>Pages 21–22 (Section 5 Data and Code Availability; Declarations)</w:t>
             </w:r>
           </w:p>
         </w:tc>
@@ -3506,7 +3932,7 @@
     </w:tbl>
     <w:p>
       <w:pPr>
-        <w:spacing w:before="80" w:after="80" w:line="276" w:lineRule="auto"/>
+        <w:spacing w:before="60" w:after="60" w:line="276" w:lineRule="auto"/>
         <w:jc w:val="both"/>
       </w:pPr>
       <w:r>
@@ -3517,7 +3943,7 @@
           <w:color w:val="000000"/>
           <w:sz w:val="17"/>
         </w:rPr>
-        <w:t>Note: This checklist adheres to the STROBE (Strengthening the Reporting of Observational Studies in Epidemiology) guidelines adapted for molecular epidemiology, high-throughput single-cell functional genomics, and interventional causal discovery. All metrics, cohort dimensions, and experimental parameters strictly match the primary manuscript text, figures, tables, and Section 4.6 (Conclusion).</w:t>
+        <w:t>Note: This checklist adheres to the STROBE (Strengthening the Reporting of Observational Studies in Epidemiology) guidelines adapted for molecular epidemiology, high-throughput single-cell functional genomics, and interventional causal discovery. All metrics, cohort dimensions, and experimental parameters strictly match the 29-page primary manuscript text, figures, tables, Section 5 (Conclusion), and Section 5 (Data and Code Availability).</w:t>
       </w:r>
     </w:p>
     <w:sectPr>

</xml_diff>